<commit_message>
Update file BaoCao.docx (Chuong 3)
</commit_message>
<xml_diff>
--- a/BaoCao/BaoCao.docx
+++ b/BaoCao/BaoCao.docx
@@ -3517,8 +3517,6 @@
               </w:rPr>
               <w:t>Binary Classification (tabular)</w:t>
             </w:r>
-            <w:bookmarkStart w:id="2" w:name="_GoBack"/>
-            <w:bookmarkEnd w:id="2"/>
           </w:p>
         </w:tc>
       </w:tr>
@@ -3788,11 +3786,11 @@
         <w:pStyle w:val="Heading1"/>
         <w:ind w:left="35"/>
       </w:pPr>
-      <w:bookmarkStart w:id="3" w:name="_Toc20827"/>
+      <w:bookmarkStart w:id="2" w:name="_Toc20827"/>
       <w:r>
         <w:t>Lời cam đoan</w:t>
       </w:r>
-      <w:bookmarkEnd w:id="3"/>
+      <w:bookmarkEnd w:id="2"/>
     </w:p>
     <w:p>
       <w:pPr>
@@ -3828,12 +3826,12 @@
         <w:pStyle w:val="Heading2"/>
         <w:ind w:left="35" w:right="0"/>
       </w:pPr>
-      <w:bookmarkStart w:id="4" w:name="_Toc20828"/>
+      <w:bookmarkStart w:id="3" w:name="_Toc20828"/>
       <w:r>
         <w:lastRenderedPageBreak/>
         <w:t>Liêm chính trong việc sử dụng công cụ AI</w:t>
       </w:r>
-      <w:bookmarkEnd w:id="4"/>
+      <w:bookmarkEnd w:id="3"/>
     </w:p>
     <w:p>
       <w:pPr>
@@ -4267,6 +4265,7 @@
               <w:bottom w:val="single" w:sz="8" w:space="0" w:color="000000"/>
               <w:right w:val="nil"/>
             </w:tcBorders>
+            <w:vAlign w:val="center"/>
           </w:tcPr>
           <w:p>
             <w:pPr>
@@ -4360,6 +4359,7 @@
               <w:bottom w:val="single" w:sz="8" w:space="0" w:color="000000"/>
               <w:right w:val="nil"/>
             </w:tcBorders>
+            <w:vAlign w:val="center"/>
           </w:tcPr>
           <w:p>
             <w:pPr>
@@ -4378,11 +4378,11 @@
         <w:pStyle w:val="Heading1"/>
         <w:ind w:left="35"/>
       </w:pPr>
-      <w:bookmarkStart w:id="5" w:name="_Toc20829"/>
+      <w:bookmarkStart w:id="4" w:name="_Toc20829"/>
       <w:r>
         <w:t xml:space="preserve">Bảng phân công công </w:t>
       </w:r>
-      <w:bookmarkEnd w:id="5"/>
+      <w:bookmarkEnd w:id="4"/>
       <w:r>
         <w:t>việc</w:t>
       </w:r>
@@ -4948,11 +4948,11 @@
         <w:spacing w:after="0"/>
         <w:ind w:left="35"/>
       </w:pPr>
-      <w:bookmarkStart w:id="6" w:name="_Toc20830"/>
+      <w:bookmarkStart w:id="5" w:name="_Toc20830"/>
       <w:r>
         <w:t>Danh mục từ viết tắt</w:t>
       </w:r>
-      <w:bookmarkEnd w:id="6"/>
+      <w:bookmarkEnd w:id="5"/>
     </w:p>
     <w:tbl>
       <w:tblPr>
@@ -5295,25 +5295,25 @@
         <w:spacing w:after="321"/>
         <w:ind w:left="35"/>
       </w:pPr>
-      <w:bookmarkStart w:id="7" w:name="_Toc20831"/>
+      <w:bookmarkStart w:id="6" w:name="_Toc20831"/>
       <w:r>
         <w:t>Chương 1 — Giới thiệu</w:t>
+      </w:r>
+      <w:bookmarkEnd w:id="6"/>
+    </w:p>
+    <w:p>
+      <w:pPr>
+        <w:pStyle w:val="Heading2"/>
+        <w:ind w:left="35" w:right="0"/>
+      </w:pPr>
+      <w:bookmarkStart w:id="7" w:name="_Toc20832"/>
+      <w:r>
+        <w:t>1.1 Bối cảnh và động cơ</w:t>
       </w:r>
       <w:bookmarkEnd w:id="7"/>
     </w:p>
     <w:p>
       <w:pPr>
-        <w:pStyle w:val="Heading2"/>
-        <w:ind w:left="35" w:right="0"/>
-      </w:pPr>
-      <w:bookmarkStart w:id="8" w:name="_Toc20832"/>
-      <w:r>
-        <w:t>1.1 Bối cảnh và động cơ</w:t>
-      </w:r>
-      <w:bookmarkEnd w:id="8"/>
-    </w:p>
-    <w:p>
-      <w:pPr>
         <w:spacing w:after="221"/>
         <w:ind w:left="628" w:right="1060" w:hanging="5"/>
         <w:jc w:val="both"/>
@@ -5345,11 +5345,11 @@
         <w:pStyle w:val="Heading2"/>
         <w:ind w:left="35" w:right="0"/>
       </w:pPr>
-      <w:bookmarkStart w:id="9" w:name="_Toc20833"/>
+      <w:bookmarkStart w:id="8" w:name="_Toc20833"/>
       <w:r>
         <w:t>1.2 Phát biểu bài toán</w:t>
       </w:r>
-      <w:bookmarkEnd w:id="9"/>
+      <w:bookmarkEnd w:id="8"/>
     </w:p>
     <w:p>
       <w:pPr>
@@ -5558,9 +5558,36 @@
         <w:pStyle w:val="Heading2"/>
         <w:ind w:left="35" w:right="0"/>
       </w:pPr>
-      <w:bookmarkStart w:id="10" w:name="_Toc20834"/>
+      <w:bookmarkStart w:id="9" w:name="_Toc20834"/>
       <w:r>
         <w:t>1.3 Mục tiêu và phạm vi</w:t>
+      </w:r>
+      <w:bookmarkEnd w:id="9"/>
+    </w:p>
+    <w:p>
+      <w:pPr>
+        <w:spacing w:after="475" w:line="336" w:lineRule="auto"/>
+        <w:ind w:left="628" w:right="1060" w:hanging="5"/>
+        <w:jc w:val="both"/>
+      </w:pPr>
+      <w:r>
+        <w:rPr>
+          <w:rFonts w:ascii="Times New Roman" w:eastAsia="Times New Roman" w:hAnsi="Times New Roman" w:cs="Times New Roman"/>
+          <w:i/>
+          <w:sz w:val="24"/>
+        </w:rPr>
+        <w:t>Gợi ý: 3–5 mục tiêu đo được; nêu rõ cái gì NẰM NGOÀI phạm vi.</w:t>
+      </w:r>
+    </w:p>
+    <w:p>
+      <w:pPr>
+        <w:pStyle w:val="Heading2"/>
+        <w:ind w:left="35" w:right="0"/>
+      </w:pPr>
+      <w:bookmarkStart w:id="10" w:name="_Toc20835"/>
+      <w:r>
+        <w:lastRenderedPageBreak/>
+        <w:t>1.4 Đóng góp chính</w:t>
       </w:r>
       <w:bookmarkEnd w:id="10"/>
     </w:p>
@@ -5576,7 +5603,7 @@
           <w:i/>
           <w:sz w:val="24"/>
         </w:rPr>
-        <w:t>Gợi ý: 3–5 mục tiêu đo được; nêu rõ cái gì NẰM NGOÀI phạm vi.</w:t>
+        <w:t>Gợi ý: liệt kê 3–4 đóng góp (vd: so sánh N mô hình; pipeline tái lập được; hệ thống triển khai chạy được…).</w:t>
       </w:r>
     </w:p>
     <w:p>
@@ -5584,16 +5611,15 @@
         <w:pStyle w:val="Heading2"/>
         <w:ind w:left="35" w:right="0"/>
       </w:pPr>
-      <w:bookmarkStart w:id="11" w:name="_Toc20835"/>
-      <w:r>
-        <w:lastRenderedPageBreak/>
-        <w:t>1.4 Đóng góp chính</w:t>
+      <w:bookmarkStart w:id="11" w:name="_Toc20836"/>
+      <w:r>
+        <w:t>1.5 Cấu trúc báo cáo</w:t>
       </w:r>
       <w:bookmarkEnd w:id="11"/>
     </w:p>
     <w:p>
       <w:pPr>
-        <w:spacing w:after="475" w:line="336" w:lineRule="auto"/>
+        <w:spacing w:after="568" w:line="336" w:lineRule="auto"/>
         <w:ind w:left="628" w:right="1060" w:hanging="5"/>
         <w:jc w:val="both"/>
       </w:pPr>
@@ -5603,60 +5629,34 @@
           <w:i/>
           <w:sz w:val="24"/>
         </w:rPr>
-        <w:t>Gợi ý: liệt kê 3–4 đóng góp (vd: so sánh N mô hình; pipeline tái lập được; hệ thống triển khai chạy được…).</w:t>
+        <w:t>Gợi ý: mỗi chương 1–2 câu.</w:t>
       </w:r>
     </w:p>
     <w:p>
       <w:pPr>
-        <w:pStyle w:val="Heading2"/>
-        <w:ind w:left="35" w:right="0"/>
-      </w:pPr>
-      <w:bookmarkStart w:id="12" w:name="_Toc20836"/>
-      <w:r>
-        <w:t>1.5 Cấu trúc báo cáo</w:t>
+        <w:pStyle w:val="Heading1"/>
+        <w:spacing w:after="321"/>
+        <w:ind w:left="35"/>
+      </w:pPr>
+      <w:bookmarkStart w:id="12" w:name="_Toc20837"/>
+      <w:r>
+        <w:t>Chương 2 — Cơ sở lý thuyết</w:t>
       </w:r>
       <w:bookmarkEnd w:id="12"/>
     </w:p>
     <w:p>
       <w:pPr>
-        <w:spacing w:after="568" w:line="336" w:lineRule="auto"/>
-        <w:ind w:left="628" w:right="1060" w:hanging="5"/>
-        <w:jc w:val="both"/>
-      </w:pPr>
-      <w:r>
-        <w:rPr>
-          <w:rFonts w:ascii="Times New Roman" w:eastAsia="Times New Roman" w:hAnsi="Times New Roman" w:cs="Times New Roman"/>
-          <w:i/>
-          <w:sz w:val="24"/>
-        </w:rPr>
-        <w:t>Gợi ý: mỗi chương 1–2 câu.</w:t>
-      </w:r>
-    </w:p>
-    <w:p>
-      <w:pPr>
-        <w:pStyle w:val="Heading1"/>
-        <w:spacing w:after="321"/>
-        <w:ind w:left="35"/>
-      </w:pPr>
-      <w:bookmarkStart w:id="13" w:name="_Toc20837"/>
-      <w:r>
-        <w:t>Chương 2 — Cơ sở lý thuyết</w:t>
+        <w:pStyle w:val="Heading2"/>
+        <w:ind w:left="35" w:right="0"/>
+      </w:pPr>
+      <w:bookmarkStart w:id="13" w:name="_Toc20838"/>
+      <w:r>
+        <w:t>2.1 Khái quát loại bài toán</w:t>
       </w:r>
       <w:bookmarkEnd w:id="13"/>
     </w:p>
     <w:p>
       <w:pPr>
-        <w:pStyle w:val="Heading2"/>
-        <w:ind w:left="35" w:right="0"/>
-      </w:pPr>
-      <w:bookmarkStart w:id="14" w:name="_Toc20838"/>
-      <w:r>
-        <w:t>2.1 Khái quát loại bài toán</w:t>
-      </w:r>
-      <w:bookmarkEnd w:id="14"/>
-    </w:p>
-    <w:p>
-      <w:pPr>
         <w:spacing w:after="475"/>
         <w:ind w:left="628" w:right="1060" w:hanging="5"/>
         <w:jc w:val="both"/>
@@ -5675,11 +5675,11 @@
         <w:pStyle w:val="Heading2"/>
         <w:ind w:left="35" w:right="0"/>
       </w:pPr>
-      <w:bookmarkStart w:id="15" w:name="_Toc20839"/>
+      <w:bookmarkStart w:id="14" w:name="_Toc20839"/>
       <w:r>
         <w:t>2.2 Các mô hình sử dụng</w:t>
       </w:r>
-      <w:bookmarkEnd w:id="15"/>
+      <w:bookmarkEnd w:id="14"/>
     </w:p>
     <w:p>
       <w:pPr>
@@ -6013,11 +6013,11 @@
         <w:pStyle w:val="Heading2"/>
         <w:ind w:left="35" w:right="0"/>
       </w:pPr>
-      <w:bookmarkStart w:id="16" w:name="_Toc20840"/>
+      <w:bookmarkStart w:id="15" w:name="_Toc20840"/>
       <w:r>
         <w:t>2.3 Độ đo đánh giá</w:t>
       </w:r>
-      <w:bookmarkEnd w:id="16"/>
+      <w:bookmarkEnd w:id="15"/>
     </w:p>
     <w:p>
       <w:pPr>
@@ -6154,7 +6154,7 @@
         <w:pStyle w:val="Heading2"/>
         <w:ind w:left="35" w:right="0"/>
       </w:pPr>
-      <w:bookmarkStart w:id="17" w:name="_Toc20841"/>
+      <w:bookmarkStart w:id="16" w:name="_Toc20841"/>
       <w:r>
         <w:t xml:space="preserve">2.4 Công trình liên quan </w:t>
       </w:r>
@@ -6163,68 +6163,126 @@
           <w:i/>
         </w:rPr>
         <w:t>(tuỳ chọn)</w:t>
+      </w:r>
+      <w:bookmarkEnd w:id="16"/>
+    </w:p>
+    <w:p>
+      <w:pPr>
+        <w:spacing w:after="562" w:line="336" w:lineRule="auto"/>
+        <w:ind w:left="628" w:right="1060" w:hanging="5"/>
+        <w:jc w:val="both"/>
+      </w:pPr>
+      <w:r>
+        <w:rPr>
+          <w:rFonts w:ascii="Times New Roman" w:eastAsia="Times New Roman" w:hAnsi="Times New Roman" w:cs="Times New Roman"/>
+          <w:i/>
+          <w:sz w:val="24"/>
+        </w:rPr>
+        <w:t>Gợi ý: 1–2 đoạn về cách người khác giải bài toán/dataset này, kèm trích dẫn.</w:t>
+      </w:r>
+    </w:p>
+    <w:p>
+      <w:pPr>
+        <w:pStyle w:val="Heading1"/>
+        <w:ind w:left="35"/>
+      </w:pPr>
+      <w:bookmarkStart w:id="17" w:name="_Toc20842"/>
+      <w:r>
+        <w:lastRenderedPageBreak/>
+        <w:t>Chương 3 — Dữ liệu và Phân tích khám phá (EDA)</w:t>
       </w:r>
       <w:bookmarkEnd w:id="17"/>
     </w:p>
     <w:p>
       <w:pPr>
-        <w:spacing w:after="562" w:line="336" w:lineRule="auto"/>
-        <w:ind w:left="628" w:right="1060" w:hanging="5"/>
-        <w:jc w:val="both"/>
-      </w:pPr>
-      <w:r>
-        <w:rPr>
-          <w:rFonts w:ascii="Times New Roman" w:eastAsia="Times New Roman" w:hAnsi="Times New Roman" w:cs="Times New Roman"/>
-          <w:i/>
-          <w:sz w:val="24"/>
-        </w:rPr>
-        <w:t>Gợi ý: 1–2 đoạn về cách người khác giải bài toán/dataset này, kèm trích dẫn.</w:t>
-      </w:r>
-    </w:p>
-    <w:p>
-      <w:pPr>
-        <w:pStyle w:val="Heading1"/>
-        <w:ind w:left="35"/>
-      </w:pPr>
-      <w:bookmarkStart w:id="18" w:name="_Toc20842"/>
-      <w:r>
-        <w:lastRenderedPageBreak/>
-        <w:t>Chương 3 — Dữ liệu và Phân tích khám phá (EDA)</w:t>
+        <w:pStyle w:val="Heading2"/>
+        <w:spacing w:after="0"/>
+        <w:ind w:left="35" w:right="0"/>
+      </w:pPr>
+      <w:bookmarkStart w:id="18" w:name="_Toc20843"/>
+      <w:r>
+        <w:t>3.1 Nguồn và mô tả dữ liệu</w:t>
       </w:r>
       <w:bookmarkEnd w:id="18"/>
     </w:p>
     <w:p>
       <w:pPr>
-        <w:spacing w:after="475" w:line="336" w:lineRule="auto"/>
-        <w:ind w:left="37" w:right="1060" w:hanging="5"/>
-        <w:jc w:val="both"/>
-      </w:pPr>
-      <w:r>
-        <w:rPr>
-          <w:rFonts w:ascii="Times New Roman" w:eastAsia="Times New Roman" w:hAnsi="Times New Roman" w:cs="Times New Roman"/>
-          <w:i/>
-          <w:sz w:val="24"/>
-        </w:rPr>
-        <w:t>(Bước 1–2 của pipeline)</w:t>
-      </w:r>
-    </w:p>
-    <w:p>
-      <w:pPr>
-        <w:pStyle w:val="Heading2"/>
-        <w:spacing w:after="0"/>
-        <w:ind w:left="35" w:right="0"/>
-      </w:pPr>
-      <w:bookmarkStart w:id="19" w:name="_Toc20843"/>
-      <w:r>
-        <w:t>3.1 Nguồn và mô tả dữ liệu</w:t>
-      </w:r>
-      <w:bookmarkEnd w:id="19"/>
+        <w:rPr>
+          <w:rFonts w:ascii="Times New Roman" w:hAnsi="Times New Roman" w:cs="Times New Roman"/>
+          <w:sz w:val="24"/>
+          <w:szCs w:val="24"/>
+        </w:rPr>
+      </w:pPr>
+      <w:r>
+        <w:rPr>
+          <w:rFonts w:ascii="Times New Roman" w:hAnsi="Times New Roman" w:cs="Times New Roman"/>
+          <w:sz w:val="24"/>
+          <w:szCs w:val="24"/>
+        </w:rPr>
+        <w:t xml:space="preserve">- Nhóm </w:t>
+      </w:r>
+      <w:r>
+        <w:rPr>
+          <w:rFonts w:ascii="Times New Roman" w:hAnsi="Times New Roman" w:cs="Times New Roman"/>
+          <w:sz w:val="24"/>
+          <w:szCs w:val="24"/>
+        </w:rPr>
+        <w:t>sử dụng dữ liệu của Hotel Booking Demand</w:t>
+      </w:r>
+      <w:r>
+        <w:rPr>
+          <w:rFonts w:ascii="Times New Roman" w:hAnsi="Times New Roman" w:cs="Times New Roman"/>
+          <w:sz w:val="24"/>
+          <w:szCs w:val="24"/>
+        </w:rPr>
+        <w:t>, b</w:t>
+      </w:r>
+      <w:r>
+        <w:rPr>
+          <w:rFonts w:ascii="Times New Roman" w:hAnsi="Times New Roman" w:cs="Times New Roman"/>
+          <w:sz w:val="24"/>
+          <w:szCs w:val="24"/>
+        </w:rPr>
+        <w:t>ộ dữ liệu này chứa thông tin đặt phòng của một khách sạn trong thành phố và một khách sạn nghỉ dưỡng</w:t>
+      </w:r>
+      <w:r>
+        <w:rPr>
+          <w:rFonts w:ascii="Times New Roman" w:hAnsi="Times New Roman" w:cs="Times New Roman"/>
+          <w:sz w:val="24"/>
+          <w:szCs w:val="24"/>
+        </w:rPr>
+        <w:t xml:space="preserve"> </w:t>
+      </w:r>
+      <w:r>
+        <w:rPr>
+          <w:rFonts w:ascii="Times New Roman" w:hAnsi="Times New Roman" w:cs="Times New Roman"/>
+          <w:sz w:val="24"/>
+          <w:szCs w:val="24"/>
+        </w:rPr>
+        <w:t>ở Bồ Đào Nha trong giai đoạn 2015–2017</w:t>
+      </w:r>
+      <w:r>
+        <w:rPr>
+          <w:rFonts w:ascii="Times New Roman" w:hAnsi="Times New Roman" w:cs="Times New Roman"/>
+          <w:sz w:val="24"/>
+          <w:szCs w:val="24"/>
+        </w:rPr>
+        <w:t xml:space="preserve"> bao gồm các thông tin như thời điểm đặt phòng, thời gian lưu trú, số lượng người lớn, trẻ em và/hoặc trẻ sơ sinh, và số lượng chỗ đậu xe có sẵn, cùng nhiều thông tin khác. </w:t>
+      </w:r>
+      <w:r>
+        <w:rPr>
+          <w:rFonts w:ascii="Times New Roman" w:hAnsi="Times New Roman" w:cs="Times New Roman"/>
+          <w:sz w:val="24"/>
+          <w:szCs w:val="24"/>
+        </w:rPr>
+        <w:t>Bộ dữ liệu được công bố lần đầu trong bài báo khoa học của Antonio, de Almeida và Nunes (2019) trên tạp chí Data in Brief, và được chia sẻ lại dưới dạng CSV công khai trên Kaggle cũng như trong kho dữ liệu TidyTuesday (GitHub) mà nhóm đã tải trực tiếp để đảm bảo tính tái lập.</w:t>
+      </w:r>
     </w:p>
     <w:tbl>
       <w:tblPr>
         <w:tblStyle w:val="TableGrid"/>
-        <w:tblW w:w="6560" w:type="dxa"/>
-        <w:tblInd w:w="1662" w:type="dxa"/>
+        <w:tblW w:w="6965" w:type="dxa"/>
+        <w:tblInd w:w="1326" w:type="dxa"/>
         <w:tblCellMar>
           <w:top w:w="67" w:type="dxa"/>
           <w:bottom w:w="67" w:type="dxa"/>
@@ -6233,7 +6291,7 @@
         <w:tblLook w:val="04A0" w:firstRow="1" w:lastRow="0" w:firstColumn="1" w:lastColumn="0" w:noHBand="0" w:noVBand="1"/>
       </w:tblPr>
       <w:tblGrid>
-        <w:gridCol w:w="2328"/>
+        <w:gridCol w:w="2733"/>
         <w:gridCol w:w="4232"/>
       </w:tblGrid>
       <w:tr>
@@ -6242,7 +6300,7 @@
         </w:trPr>
         <w:tc>
           <w:tcPr>
-            <w:tcW w:w="2328" w:type="dxa"/>
+            <w:tcW w:w="2733" w:type="dxa"/>
             <w:tcBorders>
               <w:top w:val="single" w:sz="8" w:space="0" w:color="000000"/>
               <w:left w:val="nil"/>
@@ -6289,13 +6347,14 @@
         </w:trPr>
         <w:tc>
           <w:tcPr>
-            <w:tcW w:w="2328" w:type="dxa"/>
+            <w:tcW w:w="2733" w:type="dxa"/>
             <w:tcBorders>
               <w:top w:val="single" w:sz="5" w:space="0" w:color="000000"/>
               <w:left w:val="nil"/>
               <w:bottom w:val="nil"/>
               <w:right w:val="nil"/>
             </w:tcBorders>
+            <w:vAlign w:val="center"/>
           </w:tcPr>
           <w:p>
             <w:pPr>
@@ -6332,7 +6391,7 @@
               <w:bottom w:val="nil"/>
               <w:right w:val="nil"/>
             </w:tcBorders>
-            <w:vAlign w:val="bottom"/>
+            <w:vAlign w:val="center"/>
           </w:tcPr>
           <w:p>
             <w:pPr>
@@ -6351,6 +6410,23 @@
               <w:t>Hotel Booking Demand</w:t>
             </w:r>
           </w:p>
+        </w:tc>
+      </w:tr>
+      <w:tr>
+        <w:trPr>
+          <w:trHeight w:val="20"/>
+        </w:trPr>
+        <w:tc>
+          <w:tcPr>
+            <w:tcW w:w="2733" w:type="dxa"/>
+            <w:tcBorders>
+              <w:top w:val="nil"/>
+              <w:left w:val="nil"/>
+              <w:bottom w:val="nil"/>
+              <w:right w:val="nil"/>
+            </w:tcBorders>
+            <w:vAlign w:val="center"/>
+          </w:tcPr>
           <w:p>
             <w:pPr>
               <w:rPr>
@@ -6359,6 +6435,43 @@
                 <w:szCs w:val="24"/>
               </w:rPr>
             </w:pPr>
+            <w:r>
+              <w:rPr>
+                <w:rFonts w:ascii="Times New Roman" w:eastAsia="Times New Roman" w:hAnsi="Times New Roman" w:cs="Times New Roman"/>
+                <w:sz w:val="24"/>
+                <w:szCs w:val="24"/>
+              </w:rPr>
+              <w:t>Nguồn (URL)</w:t>
+            </w:r>
+          </w:p>
+        </w:tc>
+        <w:tc>
+          <w:tcPr>
+            <w:tcW w:w="4232" w:type="dxa"/>
+            <w:tcBorders>
+              <w:top w:val="nil"/>
+              <w:left w:val="nil"/>
+              <w:bottom w:val="nil"/>
+              <w:right w:val="nil"/>
+            </w:tcBorders>
+            <w:vAlign w:val="center"/>
+          </w:tcPr>
+          <w:p>
+            <w:pPr>
+              <w:rPr>
+                <w:rFonts w:ascii="Times New Roman" w:hAnsi="Times New Roman" w:cs="Times New Roman"/>
+                <w:sz w:val="24"/>
+                <w:szCs w:val="24"/>
+              </w:rPr>
+            </w:pPr>
+            <w:r>
+              <w:rPr>
+                <w:rFonts w:ascii="Times New Roman" w:hAnsi="Times New Roman" w:cs="Times New Roman"/>
+                <w:sz w:val="24"/>
+                <w:szCs w:val="24"/>
+              </w:rPr>
+              <w:t>Kaggle [1]</w:t>
+            </w:r>
           </w:p>
         </w:tc>
       </w:tr>
@@ -6368,13 +6481,14 @@
         </w:trPr>
         <w:tc>
           <w:tcPr>
-            <w:tcW w:w="2328" w:type="dxa"/>
-            <w:tcBorders>
-              <w:top w:val="nil"/>
-              <w:left w:val="nil"/>
-              <w:bottom w:val="nil"/>
-              <w:right w:val="nil"/>
-            </w:tcBorders>
+            <w:tcW w:w="2733" w:type="dxa"/>
+            <w:tcBorders>
+              <w:top w:val="nil"/>
+              <w:left w:val="nil"/>
+              <w:bottom w:val="nil"/>
+              <w:right w:val="nil"/>
+            </w:tcBorders>
+            <w:vAlign w:val="center"/>
           </w:tcPr>
           <w:p>
             <w:pPr>
@@ -6390,7 +6504,7 @@
                 <w:sz w:val="24"/>
                 <w:szCs w:val="24"/>
               </w:rPr>
-              <w:t>Nguồn (URL)</w:t>
+              <w:t>Số mẫu / số đặc trưng</w:t>
             </w:r>
           </w:p>
         </w:tc>
@@ -6403,6 +6517,7 @@
               <w:bottom w:val="nil"/>
               <w:right w:val="nil"/>
             </w:tcBorders>
+            <w:vAlign w:val="center"/>
           </w:tcPr>
           <w:p>
             <w:pPr>
@@ -6418,7 +6533,23 @@
                 <w:sz w:val="24"/>
                 <w:szCs w:val="24"/>
               </w:rPr>
-              <w:t>Kaggle [1]</w:t>
+              <w:t>119.390 mẫu /</w:t>
+            </w:r>
+            <w:r>
+              <w:rPr>
+                <w:rFonts w:ascii="Times New Roman" w:hAnsi="Times New Roman" w:cs="Times New Roman"/>
+                <w:sz w:val="24"/>
+                <w:szCs w:val="24"/>
+              </w:rPr>
+              <w:t xml:space="preserve"> </w:t>
+            </w:r>
+            <w:r>
+              <w:rPr>
+                <w:rFonts w:ascii="Times New Roman" w:hAnsi="Times New Roman" w:cs="Times New Roman"/>
+                <w:sz w:val="24"/>
+                <w:szCs w:val="24"/>
+              </w:rPr>
+              <w:t>32 đặc trưng</w:t>
             </w:r>
           </w:p>
         </w:tc>
@@ -6429,13 +6560,14 @@
         </w:trPr>
         <w:tc>
           <w:tcPr>
-            <w:tcW w:w="2328" w:type="dxa"/>
-            <w:tcBorders>
-              <w:top w:val="nil"/>
-              <w:left w:val="nil"/>
-              <w:bottom w:val="nil"/>
-              <w:right w:val="nil"/>
-            </w:tcBorders>
+            <w:tcW w:w="2733" w:type="dxa"/>
+            <w:tcBorders>
+              <w:top w:val="nil"/>
+              <w:left w:val="nil"/>
+              <w:bottom w:val="nil"/>
+              <w:right w:val="nil"/>
+            </w:tcBorders>
+            <w:vAlign w:val="center"/>
           </w:tcPr>
           <w:p>
             <w:pPr>
@@ -6451,7 +6583,7 @@
                 <w:sz w:val="24"/>
                 <w:szCs w:val="24"/>
               </w:rPr>
-              <w:t>Số mẫu / số đặc trưng</w:t>
+              <w:t>Kiểu đặc trưng</w:t>
             </w:r>
           </w:p>
         </w:tc>
@@ -6464,6 +6596,7 @@
               <w:bottom w:val="nil"/>
               <w:right w:val="nil"/>
             </w:tcBorders>
+            <w:vAlign w:val="center"/>
           </w:tcPr>
           <w:p>
             <w:pPr>
@@ -6479,40 +6612,41 @@
                 <w:sz w:val="24"/>
                 <w:szCs w:val="24"/>
               </w:rPr>
-              <w:t>119.390 mẫu /</w:t>
-            </w:r>
-            <w:r>
-              <w:rPr>
-                <w:rFonts w:ascii="Times New Roman" w:hAnsi="Times New Roman" w:cs="Times New Roman"/>
-                <w:sz w:val="24"/>
-                <w:szCs w:val="24"/>
-              </w:rPr>
-              <w:t xml:space="preserve"> </w:t>
-            </w:r>
-            <w:r>
-              <w:rPr>
-                <w:rFonts w:ascii="Times New Roman" w:hAnsi="Times New Roman" w:cs="Times New Roman"/>
-                <w:sz w:val="24"/>
-                <w:szCs w:val="24"/>
-              </w:rPr>
-              <w:t>32 đặc trưng</w:t>
+              <w:t xml:space="preserve">Hỗn hợp: 16 cột số nguyên (int), 4 cột số thực (float), 12 cột </w:t>
+            </w:r>
+            <w:r>
+              <w:rPr>
+                <w:rFonts w:ascii="Times New Roman" w:hAnsi="Times New Roman" w:cs="Times New Roman"/>
+                <w:sz w:val="24"/>
+                <w:szCs w:val="24"/>
+              </w:rPr>
+              <w:t xml:space="preserve">chuỗi </w:t>
+            </w:r>
+            <w:r>
+              <w:rPr>
+                <w:rFonts w:ascii="Times New Roman" w:hAnsi="Times New Roman" w:cs="Times New Roman"/>
+                <w:sz w:val="24"/>
+                <w:szCs w:val="24"/>
+              </w:rPr>
+              <w:t>(string)</w:t>
             </w:r>
           </w:p>
         </w:tc>
       </w:tr>
       <w:tr>
         <w:trPr>
-          <w:trHeight w:val="376"/>
+          <w:trHeight w:val="20"/>
         </w:trPr>
         <w:tc>
           <w:tcPr>
-            <w:tcW w:w="2328" w:type="dxa"/>
-            <w:tcBorders>
-              <w:top w:val="nil"/>
-              <w:left w:val="nil"/>
-              <w:bottom w:val="nil"/>
-              <w:right w:val="nil"/>
-            </w:tcBorders>
+            <w:tcW w:w="2733" w:type="dxa"/>
+            <w:tcBorders>
+              <w:top w:val="nil"/>
+              <w:left w:val="nil"/>
+              <w:bottom w:val="nil"/>
+              <w:right w:val="nil"/>
+            </w:tcBorders>
+            <w:vAlign w:val="center"/>
           </w:tcPr>
           <w:p>
             <w:pPr>
@@ -6528,7 +6662,7 @@
                 <w:sz w:val="24"/>
                 <w:szCs w:val="24"/>
               </w:rPr>
-              <w:t>Kiểu đặc trưng</w:t>
+              <w:t>Biến mục tiêu</w:t>
             </w:r>
           </w:p>
         </w:tc>
@@ -6541,10 +6675,10 @@
               <w:bottom w:val="nil"/>
               <w:right w:val="nil"/>
             </w:tcBorders>
+            <w:vAlign w:val="center"/>
           </w:tcPr>
           <w:p>
             <w:pPr>
-              <w:jc w:val="both"/>
               <w:rPr>
                 <w:rFonts w:ascii="Times New Roman" w:hAnsi="Times New Roman" w:cs="Times New Roman"/>
                 <w:sz w:val="24"/>
@@ -6557,83 +6691,6 @@
                 <w:sz w:val="24"/>
                 <w:szCs w:val="24"/>
               </w:rPr>
-              <w:t xml:space="preserve">Hỗn hợp: 16 cột số nguyên (int), 4 cột số thực (float), 12 cột </w:t>
-            </w:r>
-            <w:r>
-              <w:rPr>
-                <w:rFonts w:ascii="Times New Roman" w:hAnsi="Times New Roman" w:cs="Times New Roman"/>
-                <w:sz w:val="24"/>
-                <w:szCs w:val="24"/>
-              </w:rPr>
-              <w:t xml:space="preserve">chuỗi </w:t>
-            </w:r>
-            <w:r>
-              <w:rPr>
-                <w:rFonts w:ascii="Times New Roman" w:hAnsi="Times New Roman" w:cs="Times New Roman"/>
-                <w:sz w:val="24"/>
-                <w:szCs w:val="24"/>
-              </w:rPr>
-              <w:t>(string)</w:t>
-            </w:r>
-          </w:p>
-        </w:tc>
-      </w:tr>
-      <w:tr>
-        <w:trPr>
-          <w:trHeight w:val="376"/>
-        </w:trPr>
-        <w:tc>
-          <w:tcPr>
-            <w:tcW w:w="2328" w:type="dxa"/>
-            <w:tcBorders>
-              <w:top w:val="nil"/>
-              <w:left w:val="nil"/>
-              <w:bottom w:val="nil"/>
-              <w:right w:val="nil"/>
-            </w:tcBorders>
-          </w:tcPr>
-          <w:p>
-            <w:pPr>
-              <w:rPr>
-                <w:rFonts w:ascii="Times New Roman" w:hAnsi="Times New Roman" w:cs="Times New Roman"/>
-                <w:sz w:val="24"/>
-                <w:szCs w:val="24"/>
-              </w:rPr>
-            </w:pPr>
-            <w:r>
-              <w:rPr>
-                <w:rFonts w:ascii="Times New Roman" w:eastAsia="Times New Roman" w:hAnsi="Times New Roman" w:cs="Times New Roman"/>
-                <w:sz w:val="24"/>
-                <w:szCs w:val="24"/>
-              </w:rPr>
-              <w:t>Biến mục tiêu</w:t>
-            </w:r>
-          </w:p>
-        </w:tc>
-        <w:tc>
-          <w:tcPr>
-            <w:tcW w:w="4232" w:type="dxa"/>
-            <w:tcBorders>
-              <w:top w:val="nil"/>
-              <w:left w:val="nil"/>
-              <w:bottom w:val="nil"/>
-              <w:right w:val="nil"/>
-            </w:tcBorders>
-          </w:tcPr>
-          <w:p>
-            <w:pPr>
-              <w:rPr>
-                <w:rFonts w:ascii="Times New Roman" w:hAnsi="Times New Roman" w:cs="Times New Roman"/>
-                <w:sz w:val="24"/>
-                <w:szCs w:val="24"/>
-              </w:rPr>
-            </w:pPr>
-            <w:r>
-              <w:rPr>
-                <w:rFonts w:ascii="Times New Roman" w:hAnsi="Times New Roman" w:cs="Times New Roman"/>
-                <w:sz w:val="24"/>
-                <w:szCs w:val="24"/>
-              </w:rPr>
               <w:t xml:space="preserve">is_canceled </w:t>
             </w:r>
             <w:r>
@@ -6650,7 +6707,23 @@
                 <w:sz w:val="24"/>
                 <w:szCs w:val="24"/>
               </w:rPr>
-              <w:t xml:space="preserve"> Nhị phân (0: Không hủy, 1: Hủy)</w:t>
+              <w:t xml:space="preserve"> </w:t>
+            </w:r>
+            <w:r>
+              <w:rPr>
+                <w:rFonts w:ascii="Times New Roman" w:hAnsi="Times New Roman" w:cs="Times New Roman"/>
+                <w:sz w:val="24"/>
+                <w:szCs w:val="24"/>
+              </w:rPr>
+              <w:t>Số nguyên</w:t>
+            </w:r>
+            <w:r>
+              <w:rPr>
+                <w:rFonts w:ascii="Times New Roman" w:hAnsi="Times New Roman" w:cs="Times New Roman"/>
+                <w:sz w:val="24"/>
+                <w:szCs w:val="24"/>
+              </w:rPr>
+              <w:t xml:space="preserve"> (0: Không hủy, 1: Hủy)</w:t>
             </w:r>
             <w:r>
               <w:rPr>
@@ -6709,13 +6782,14 @@
         </w:trPr>
         <w:tc>
           <w:tcPr>
-            <w:tcW w:w="2328" w:type="dxa"/>
+            <w:tcW w:w="2733" w:type="dxa"/>
             <w:tcBorders>
               <w:top w:val="nil"/>
               <w:left w:val="nil"/>
               <w:bottom w:val="single" w:sz="8" w:space="0" w:color="000000"/>
               <w:right w:val="nil"/>
             </w:tcBorders>
+            <w:vAlign w:val="center"/>
           </w:tcPr>
           <w:p>
             <w:pPr>
@@ -6744,6 +6818,7 @@
               <w:bottom w:val="single" w:sz="8" w:space="0" w:color="000000"/>
               <w:right w:val="nil"/>
             </w:tcBorders>
+            <w:vAlign w:val="center"/>
           </w:tcPr>
           <w:p>
             <w:pPr>
@@ -6769,41 +6844,3519 @@
       <w:pPr>
         <w:spacing w:after="475" w:line="336" w:lineRule="auto"/>
         <w:ind w:left="628" w:right="1060" w:hanging="5"/>
-        <w:jc w:val="both"/>
-      </w:pPr>
-      <w:r>
+        <w:jc w:val="center"/>
         <w:rPr>
           <w:rFonts w:ascii="Times New Roman" w:eastAsia="Times New Roman" w:hAnsi="Times New Roman" w:cs="Times New Roman"/>
           <w:i/>
           <w:sz w:val="24"/>
         </w:rPr>
-        <w:t>Gợi ý: kèm bảng ý nghĩa từng trường (data dictionary) ở Phụ lục nếu dài.</w:t>
+      </w:pPr>
+      <w:r>
+        <w:rPr>
+          <w:rFonts w:ascii="Times New Roman" w:eastAsia="Times New Roman" w:hAnsi="Times New Roman" w:cs="Times New Roman"/>
+          <w:i/>
+          <w:sz w:val="24"/>
+        </w:rPr>
+        <w:t>Bảng 3.1. Mô tả tổng quan bộ dữ liệu Hotel Booking Demand</w:t>
+      </w:r>
+      <w:r>
+        <w:rPr>
+          <w:rFonts w:ascii="Times New Roman" w:eastAsia="Times New Roman" w:hAnsi="Times New Roman" w:cs="Times New Roman"/>
+          <w:i/>
+          <w:sz w:val="24"/>
+        </w:rPr>
+        <w:t>.</w:t>
       </w:r>
     </w:p>
     <w:p>
       <w:pPr>
+        <w:rPr>
+          <w:rFonts w:ascii="Times New Roman" w:hAnsi="Times New Roman" w:cs="Times New Roman"/>
+          <w:sz w:val="24"/>
+          <w:szCs w:val="24"/>
+        </w:rPr>
+      </w:pPr>
+      <w:r>
+        <w:rPr>
+          <w:rFonts w:ascii="Times New Roman" w:hAnsi="Times New Roman" w:cs="Times New Roman"/>
+          <w:sz w:val="24"/>
+          <w:szCs w:val="24"/>
+        </w:rPr>
+        <w:t xml:space="preserve">- </w:t>
+      </w:r>
+      <w:r>
+        <w:rPr>
+          <w:rFonts w:ascii="Times New Roman" w:hAnsi="Times New Roman" w:cs="Times New Roman"/>
+          <w:sz w:val="24"/>
+          <w:szCs w:val="24"/>
+        </w:rPr>
+        <w:t>Dữ liệu gồm các trường chính như sau:</w:t>
+      </w:r>
+    </w:p>
+    <w:tbl>
+      <w:tblPr>
+        <w:tblStyle w:val="TableGrid"/>
+        <w:tblW w:w="4630" w:type="pct"/>
+        <w:tblInd w:w="284" w:type="dxa"/>
+        <w:tblCellMar>
+          <w:top w:w="67" w:type="dxa"/>
+          <w:bottom w:w="67" w:type="dxa"/>
+          <w:right w:w="1" w:type="dxa"/>
+        </w:tblCellMar>
+        <w:tblLook w:val="04A0" w:firstRow="1" w:lastRow="0" w:firstColumn="1" w:lastColumn="0" w:noHBand="0" w:noVBand="1"/>
+      </w:tblPr>
+      <w:tblGrid>
+        <w:gridCol w:w="3544"/>
+        <w:gridCol w:w="4677"/>
+        <w:gridCol w:w="1277"/>
+      </w:tblGrid>
+      <w:tr>
+        <w:trPr>
+          <w:trHeight w:val="503"/>
+        </w:trPr>
+        <w:tc>
+          <w:tcPr>
+            <w:tcW w:w="1866" w:type="pct"/>
+            <w:tcBorders>
+              <w:top w:val="single" w:sz="8" w:space="0" w:color="000000"/>
+              <w:left w:val="nil"/>
+              <w:bottom w:val="single" w:sz="5" w:space="0" w:color="000000"/>
+              <w:right w:val="nil"/>
+            </w:tcBorders>
+            <w:vAlign w:val="center"/>
+          </w:tcPr>
+          <w:p>
+            <w:pPr>
+              <w:rPr>
+                <w:rFonts w:ascii="Times New Roman" w:hAnsi="Times New Roman" w:cs="Times New Roman"/>
+                <w:sz w:val="24"/>
+                <w:szCs w:val="24"/>
+              </w:rPr>
+            </w:pPr>
+            <w:r>
+              <w:rPr>
+                <w:rFonts w:ascii="Times New Roman" w:eastAsia="Times New Roman" w:hAnsi="Times New Roman" w:cs="Times New Roman"/>
+                <w:sz w:val="24"/>
+                <w:szCs w:val="24"/>
+              </w:rPr>
+              <w:t>Trường</w:t>
+            </w:r>
+          </w:p>
+        </w:tc>
+        <w:tc>
+          <w:tcPr>
+            <w:tcW w:w="2462" w:type="pct"/>
+            <w:tcBorders>
+              <w:top w:val="single" w:sz="8" w:space="0" w:color="000000"/>
+              <w:left w:val="nil"/>
+              <w:bottom w:val="single" w:sz="5" w:space="0" w:color="000000"/>
+              <w:right w:val="nil"/>
+            </w:tcBorders>
+            <w:vAlign w:val="center"/>
+          </w:tcPr>
+          <w:p>
+            <w:pPr>
+              <w:rPr>
+                <w:rFonts w:ascii="Times New Roman" w:eastAsia="Times New Roman" w:hAnsi="Times New Roman" w:cs="Times New Roman"/>
+                <w:sz w:val="24"/>
+                <w:szCs w:val="24"/>
+              </w:rPr>
+            </w:pPr>
+            <w:r>
+              <w:rPr>
+                <w:rFonts w:ascii="Times New Roman" w:eastAsia="Times New Roman" w:hAnsi="Times New Roman" w:cs="Times New Roman"/>
+                <w:sz w:val="24"/>
+                <w:szCs w:val="24"/>
+              </w:rPr>
+              <w:t>Ý ngh</w:t>
+            </w:r>
+            <w:r>
+              <w:rPr>
+                <w:rFonts w:ascii="Times New Roman" w:eastAsia="Times New Roman" w:hAnsi="Times New Roman" w:cs="Times New Roman"/>
+                <w:sz w:val="24"/>
+                <w:szCs w:val="24"/>
+              </w:rPr>
+              <w:t>ĩa</w:t>
+            </w:r>
+          </w:p>
+        </w:tc>
+        <w:tc>
+          <w:tcPr>
+            <w:tcW w:w="672" w:type="pct"/>
+            <w:tcBorders>
+              <w:top w:val="single" w:sz="8" w:space="0" w:color="000000"/>
+              <w:left w:val="nil"/>
+              <w:bottom w:val="single" w:sz="5" w:space="0" w:color="000000"/>
+              <w:right w:val="nil"/>
+            </w:tcBorders>
+            <w:vAlign w:val="center"/>
+          </w:tcPr>
+          <w:p>
+            <w:pPr>
+              <w:rPr>
+                <w:rFonts w:ascii="Times New Roman" w:hAnsi="Times New Roman" w:cs="Times New Roman"/>
+                <w:sz w:val="24"/>
+                <w:szCs w:val="24"/>
+              </w:rPr>
+            </w:pPr>
+            <w:r>
+              <w:rPr>
+                <w:rFonts w:ascii="Times New Roman" w:eastAsia="Times New Roman" w:hAnsi="Times New Roman" w:cs="Times New Roman"/>
+                <w:sz w:val="24"/>
+                <w:szCs w:val="24"/>
+              </w:rPr>
+              <w:t>Kiểu dữ liệu</w:t>
+            </w:r>
+          </w:p>
+        </w:tc>
+      </w:tr>
+      <w:tr>
+        <w:trPr>
+          <w:trHeight w:val="398"/>
+        </w:trPr>
+        <w:tc>
+          <w:tcPr>
+            <w:tcW w:w="1866" w:type="pct"/>
+            <w:tcBorders>
+              <w:top w:val="nil"/>
+              <w:left w:val="nil"/>
+              <w:bottom w:val="nil"/>
+              <w:right w:val="nil"/>
+            </w:tcBorders>
+          </w:tcPr>
+          <w:p>
+            <w:pPr>
+              <w:rPr>
+                <w:rFonts w:ascii="Times New Roman" w:hAnsi="Times New Roman" w:cs="Times New Roman"/>
+                <w:sz w:val="24"/>
+                <w:szCs w:val="24"/>
+              </w:rPr>
+            </w:pPr>
+            <w:r>
+              <w:rPr>
+                <w:rFonts w:ascii="Times New Roman" w:hAnsi="Times New Roman" w:cs="Times New Roman"/>
+                <w:sz w:val="24"/>
+                <w:szCs w:val="24"/>
+              </w:rPr>
+              <w:t>hotel</w:t>
+            </w:r>
+          </w:p>
+        </w:tc>
+        <w:tc>
+          <w:tcPr>
+            <w:tcW w:w="2462" w:type="pct"/>
+            <w:tcBorders>
+              <w:top w:val="nil"/>
+              <w:left w:val="nil"/>
+              <w:bottom w:val="nil"/>
+              <w:right w:val="nil"/>
+            </w:tcBorders>
+          </w:tcPr>
+          <w:p>
+            <w:pPr>
+              <w:rPr>
+                <w:rFonts w:ascii="Times New Roman" w:hAnsi="Times New Roman" w:cs="Times New Roman"/>
+                <w:sz w:val="24"/>
+                <w:szCs w:val="24"/>
+              </w:rPr>
+            </w:pPr>
+            <w:r>
+              <w:rPr>
+                <w:rFonts w:ascii="Times New Roman" w:hAnsi="Times New Roman" w:cs="Times New Roman"/>
+                <w:sz w:val="24"/>
+                <w:szCs w:val="24"/>
+              </w:rPr>
+              <w:t>Loại khách sạn: City Hotel / Resort Hotel</w:t>
+            </w:r>
+          </w:p>
+        </w:tc>
+        <w:tc>
+          <w:tcPr>
+            <w:tcW w:w="672" w:type="pct"/>
+            <w:tcBorders>
+              <w:top w:val="nil"/>
+              <w:left w:val="nil"/>
+              <w:bottom w:val="nil"/>
+              <w:right w:val="nil"/>
+            </w:tcBorders>
+          </w:tcPr>
+          <w:p>
+            <w:pPr>
+              <w:rPr>
+                <w:rFonts w:ascii="Times New Roman" w:hAnsi="Times New Roman" w:cs="Times New Roman"/>
+                <w:sz w:val="24"/>
+                <w:szCs w:val="24"/>
+              </w:rPr>
+            </w:pPr>
+            <w:r>
+              <w:rPr>
+                <w:rFonts w:ascii="Times New Roman" w:hAnsi="Times New Roman" w:cs="Times New Roman"/>
+                <w:sz w:val="24"/>
+                <w:szCs w:val="24"/>
+              </w:rPr>
+              <w:t>s</w:t>
+            </w:r>
+            <w:r>
+              <w:rPr>
+                <w:rFonts w:ascii="Times New Roman" w:hAnsi="Times New Roman" w:cs="Times New Roman"/>
+                <w:sz w:val="24"/>
+                <w:szCs w:val="24"/>
+              </w:rPr>
+              <w:t>tring</w:t>
+            </w:r>
+          </w:p>
+        </w:tc>
+      </w:tr>
+      <w:tr>
+        <w:trPr>
+          <w:trHeight w:val="398"/>
+        </w:trPr>
+        <w:tc>
+          <w:tcPr>
+            <w:tcW w:w="1866" w:type="pct"/>
+            <w:tcBorders>
+              <w:top w:val="nil"/>
+              <w:left w:val="nil"/>
+              <w:bottom w:val="nil"/>
+              <w:right w:val="nil"/>
+            </w:tcBorders>
+          </w:tcPr>
+          <w:p>
+            <w:pPr>
+              <w:rPr>
+                <w:rFonts w:ascii="Times New Roman" w:hAnsi="Times New Roman" w:cs="Times New Roman"/>
+                <w:sz w:val="24"/>
+                <w:szCs w:val="24"/>
+              </w:rPr>
+            </w:pPr>
+            <w:r>
+              <w:rPr>
+                <w:rFonts w:ascii="Times New Roman" w:hAnsi="Times New Roman" w:cs="Times New Roman"/>
+                <w:sz w:val="24"/>
+                <w:szCs w:val="24"/>
+              </w:rPr>
+              <w:t>is_canceled</w:t>
+            </w:r>
+          </w:p>
+        </w:tc>
+        <w:tc>
+          <w:tcPr>
+            <w:tcW w:w="2462" w:type="pct"/>
+            <w:tcBorders>
+              <w:top w:val="nil"/>
+              <w:left w:val="nil"/>
+              <w:bottom w:val="nil"/>
+              <w:right w:val="nil"/>
+            </w:tcBorders>
+          </w:tcPr>
+          <w:p>
+            <w:pPr>
+              <w:rPr>
+                <w:rFonts w:ascii="Times New Roman" w:hAnsi="Times New Roman" w:cs="Times New Roman"/>
+                <w:sz w:val="24"/>
+                <w:szCs w:val="24"/>
+              </w:rPr>
+            </w:pPr>
+            <w:r>
+              <w:rPr>
+                <w:rFonts w:ascii="Times New Roman" w:hAnsi="Times New Roman" w:cs="Times New Roman"/>
+                <w:sz w:val="24"/>
+                <w:szCs w:val="24"/>
+              </w:rPr>
+              <w:t>Đ</w:t>
+            </w:r>
+            <w:r>
+              <w:rPr>
+                <w:rFonts w:ascii="Times New Roman" w:hAnsi="Times New Roman" w:cs="Times New Roman"/>
+                <w:sz w:val="24"/>
+                <w:szCs w:val="24"/>
+              </w:rPr>
+              <w:t>ơn có bị hủy hay không (0/1)</w:t>
+            </w:r>
+          </w:p>
+        </w:tc>
+        <w:tc>
+          <w:tcPr>
+            <w:tcW w:w="672" w:type="pct"/>
+            <w:tcBorders>
+              <w:top w:val="nil"/>
+              <w:left w:val="nil"/>
+              <w:bottom w:val="nil"/>
+              <w:right w:val="nil"/>
+            </w:tcBorders>
+          </w:tcPr>
+          <w:p>
+            <w:pPr>
+              <w:rPr>
+                <w:rFonts w:ascii="Times New Roman" w:hAnsi="Times New Roman" w:cs="Times New Roman"/>
+                <w:sz w:val="24"/>
+                <w:szCs w:val="24"/>
+              </w:rPr>
+            </w:pPr>
+            <w:r>
+              <w:rPr>
+                <w:rFonts w:ascii="Times New Roman" w:hAnsi="Times New Roman" w:cs="Times New Roman"/>
+                <w:sz w:val="24"/>
+                <w:szCs w:val="24"/>
+              </w:rPr>
+              <w:t>int</w:t>
+            </w:r>
+          </w:p>
+        </w:tc>
+      </w:tr>
+      <w:tr>
+        <w:trPr>
+          <w:trHeight w:val="398"/>
+        </w:trPr>
+        <w:tc>
+          <w:tcPr>
+            <w:tcW w:w="1866" w:type="pct"/>
+            <w:tcBorders>
+              <w:top w:val="nil"/>
+              <w:left w:val="nil"/>
+              <w:bottom w:val="nil"/>
+              <w:right w:val="nil"/>
+            </w:tcBorders>
+          </w:tcPr>
+          <w:p>
+            <w:pPr>
+              <w:rPr>
+                <w:rFonts w:ascii="Times New Roman" w:hAnsi="Times New Roman" w:cs="Times New Roman"/>
+                <w:sz w:val="24"/>
+                <w:szCs w:val="24"/>
+              </w:rPr>
+            </w:pPr>
+            <w:r>
+              <w:rPr>
+                <w:rFonts w:ascii="Times New Roman" w:hAnsi="Times New Roman" w:cs="Times New Roman"/>
+                <w:sz w:val="24"/>
+                <w:szCs w:val="24"/>
+              </w:rPr>
+              <w:t>lead_time</w:t>
+            </w:r>
+          </w:p>
+        </w:tc>
+        <w:tc>
+          <w:tcPr>
+            <w:tcW w:w="2462" w:type="pct"/>
+            <w:tcBorders>
+              <w:top w:val="nil"/>
+              <w:left w:val="nil"/>
+              <w:bottom w:val="nil"/>
+              <w:right w:val="nil"/>
+            </w:tcBorders>
+          </w:tcPr>
+          <w:p>
+            <w:pPr>
+              <w:rPr>
+                <w:rFonts w:ascii="Times New Roman" w:hAnsi="Times New Roman" w:cs="Times New Roman"/>
+                <w:sz w:val="24"/>
+                <w:szCs w:val="24"/>
+              </w:rPr>
+            </w:pPr>
+            <w:r>
+              <w:rPr>
+                <w:rFonts w:ascii="Times New Roman" w:hAnsi="Times New Roman" w:cs="Times New Roman"/>
+                <w:sz w:val="24"/>
+                <w:szCs w:val="24"/>
+              </w:rPr>
+              <w:t>Số ngày từ lúc đặt phòng đến ngày nhận phòng</w:t>
+            </w:r>
+          </w:p>
+        </w:tc>
+        <w:tc>
+          <w:tcPr>
+            <w:tcW w:w="672" w:type="pct"/>
+            <w:tcBorders>
+              <w:top w:val="nil"/>
+              <w:left w:val="nil"/>
+              <w:bottom w:val="nil"/>
+              <w:right w:val="nil"/>
+            </w:tcBorders>
+          </w:tcPr>
+          <w:p>
+            <w:pPr>
+              <w:rPr>
+                <w:rFonts w:ascii="Times New Roman" w:hAnsi="Times New Roman" w:cs="Times New Roman"/>
+                <w:sz w:val="24"/>
+                <w:szCs w:val="24"/>
+              </w:rPr>
+            </w:pPr>
+            <w:r>
+              <w:rPr>
+                <w:rFonts w:ascii="Times New Roman" w:hAnsi="Times New Roman" w:cs="Times New Roman"/>
+                <w:sz w:val="24"/>
+                <w:szCs w:val="24"/>
+              </w:rPr>
+              <w:t>int</w:t>
+            </w:r>
+          </w:p>
+        </w:tc>
+      </w:tr>
+      <w:tr>
+        <w:trPr>
+          <w:trHeight w:val="398"/>
+        </w:trPr>
+        <w:tc>
+          <w:tcPr>
+            <w:tcW w:w="1866" w:type="pct"/>
+            <w:tcBorders>
+              <w:top w:val="nil"/>
+              <w:left w:val="nil"/>
+              <w:bottom w:val="nil"/>
+              <w:right w:val="nil"/>
+            </w:tcBorders>
+          </w:tcPr>
+          <w:p>
+            <w:pPr>
+              <w:rPr>
+                <w:rFonts w:ascii="Times New Roman" w:eastAsia="Times New Roman" w:hAnsi="Times New Roman" w:cs="Times New Roman"/>
+                <w:sz w:val="24"/>
+                <w:szCs w:val="24"/>
+              </w:rPr>
+            </w:pPr>
+            <w:r>
+              <w:rPr>
+                <w:rFonts w:ascii="Times New Roman" w:hAnsi="Times New Roman" w:cs="Times New Roman"/>
+                <w:sz w:val="24"/>
+                <w:szCs w:val="24"/>
+              </w:rPr>
+              <w:t>arrival_date_year</w:t>
+            </w:r>
+          </w:p>
+          <w:p>
+            <w:pPr>
+              <w:rPr>
+                <w:rFonts w:ascii="Times New Roman" w:hAnsi="Times New Roman" w:cs="Times New Roman"/>
+                <w:sz w:val="24"/>
+                <w:szCs w:val="24"/>
+              </w:rPr>
+            </w:pPr>
+          </w:p>
+        </w:tc>
+        <w:tc>
+          <w:tcPr>
+            <w:tcW w:w="2462" w:type="pct"/>
+            <w:tcBorders>
+              <w:top w:val="nil"/>
+              <w:left w:val="nil"/>
+              <w:bottom w:val="nil"/>
+              <w:right w:val="nil"/>
+            </w:tcBorders>
+          </w:tcPr>
+          <w:p>
+            <w:pPr>
+              <w:rPr>
+                <w:rFonts w:ascii="Times New Roman" w:hAnsi="Times New Roman" w:cs="Times New Roman"/>
+                <w:sz w:val="24"/>
+                <w:szCs w:val="24"/>
+              </w:rPr>
+            </w:pPr>
+            <w:r>
+              <w:rPr>
+                <w:rFonts w:ascii="Times New Roman" w:hAnsi="Times New Roman" w:cs="Times New Roman"/>
+                <w:sz w:val="24"/>
+                <w:szCs w:val="24"/>
+              </w:rPr>
+              <w:t>Năm</w:t>
+            </w:r>
+            <w:r>
+              <w:rPr>
+                <w:rFonts w:ascii="Times New Roman" w:hAnsi="Times New Roman" w:cs="Times New Roman"/>
+                <w:sz w:val="24"/>
+                <w:szCs w:val="24"/>
+              </w:rPr>
+              <w:t xml:space="preserve"> nhận phòng</w:t>
+            </w:r>
+          </w:p>
+        </w:tc>
+        <w:tc>
+          <w:tcPr>
+            <w:tcW w:w="672" w:type="pct"/>
+            <w:tcBorders>
+              <w:top w:val="nil"/>
+              <w:left w:val="nil"/>
+              <w:bottom w:val="nil"/>
+              <w:right w:val="nil"/>
+            </w:tcBorders>
+          </w:tcPr>
+          <w:p>
+            <w:pPr>
+              <w:rPr>
+                <w:rFonts w:ascii="Times New Roman" w:hAnsi="Times New Roman" w:cs="Times New Roman"/>
+                <w:sz w:val="24"/>
+                <w:szCs w:val="24"/>
+              </w:rPr>
+            </w:pPr>
+            <w:r>
+              <w:rPr>
+                <w:rFonts w:ascii="Times New Roman" w:hAnsi="Times New Roman" w:cs="Times New Roman"/>
+                <w:sz w:val="24"/>
+                <w:szCs w:val="24"/>
+              </w:rPr>
+              <w:t>int</w:t>
+            </w:r>
+          </w:p>
+        </w:tc>
+      </w:tr>
+      <w:tr>
+        <w:trPr>
+          <w:trHeight w:val="398"/>
+        </w:trPr>
+        <w:tc>
+          <w:tcPr>
+            <w:tcW w:w="1866" w:type="pct"/>
+            <w:tcBorders>
+              <w:top w:val="nil"/>
+              <w:left w:val="nil"/>
+              <w:bottom w:val="nil"/>
+              <w:right w:val="nil"/>
+            </w:tcBorders>
+          </w:tcPr>
+          <w:p>
+            <w:pPr>
+              <w:rPr>
+                <w:rFonts w:ascii="Times New Roman" w:eastAsia="Times New Roman" w:hAnsi="Times New Roman" w:cs="Times New Roman"/>
+                <w:sz w:val="24"/>
+                <w:szCs w:val="24"/>
+              </w:rPr>
+            </w:pPr>
+            <w:r>
+              <w:rPr>
+                <w:rFonts w:ascii="Times New Roman" w:hAnsi="Times New Roman" w:cs="Times New Roman"/>
+                <w:sz w:val="24"/>
+                <w:szCs w:val="24"/>
+              </w:rPr>
+              <w:t>arrival_date_month</w:t>
+            </w:r>
+          </w:p>
+          <w:p>
+            <w:pPr>
+              <w:rPr>
+                <w:rFonts w:ascii="Times New Roman" w:hAnsi="Times New Roman" w:cs="Times New Roman"/>
+                <w:sz w:val="24"/>
+                <w:szCs w:val="24"/>
+              </w:rPr>
+            </w:pPr>
+          </w:p>
+        </w:tc>
+        <w:tc>
+          <w:tcPr>
+            <w:tcW w:w="2462" w:type="pct"/>
+            <w:tcBorders>
+              <w:top w:val="nil"/>
+              <w:left w:val="nil"/>
+              <w:bottom w:val="nil"/>
+              <w:right w:val="nil"/>
+            </w:tcBorders>
+          </w:tcPr>
+          <w:p>
+            <w:pPr>
+              <w:rPr>
+                <w:rFonts w:ascii="Times New Roman" w:hAnsi="Times New Roman" w:cs="Times New Roman"/>
+                <w:sz w:val="24"/>
+                <w:szCs w:val="24"/>
+              </w:rPr>
+            </w:pPr>
+            <w:r>
+              <w:rPr>
+                <w:rFonts w:ascii="Times New Roman" w:hAnsi="Times New Roman" w:cs="Times New Roman"/>
+                <w:sz w:val="24"/>
+                <w:szCs w:val="24"/>
+              </w:rPr>
+              <w:t>Tháng nhận phòng</w:t>
+            </w:r>
+          </w:p>
+        </w:tc>
+        <w:tc>
+          <w:tcPr>
+            <w:tcW w:w="672" w:type="pct"/>
+            <w:tcBorders>
+              <w:top w:val="nil"/>
+              <w:left w:val="nil"/>
+              <w:bottom w:val="nil"/>
+              <w:right w:val="nil"/>
+            </w:tcBorders>
+          </w:tcPr>
+          <w:p>
+            <w:pPr>
+              <w:rPr>
+                <w:rFonts w:ascii="Times New Roman" w:hAnsi="Times New Roman" w:cs="Times New Roman"/>
+                <w:sz w:val="24"/>
+                <w:szCs w:val="24"/>
+              </w:rPr>
+            </w:pPr>
+            <w:r>
+              <w:rPr>
+                <w:rFonts w:ascii="Times New Roman" w:hAnsi="Times New Roman" w:cs="Times New Roman"/>
+                <w:sz w:val="24"/>
+                <w:szCs w:val="24"/>
+              </w:rPr>
+              <w:t>s</w:t>
+            </w:r>
+            <w:r>
+              <w:rPr>
+                <w:rFonts w:ascii="Times New Roman" w:hAnsi="Times New Roman" w:cs="Times New Roman"/>
+                <w:sz w:val="24"/>
+                <w:szCs w:val="24"/>
+              </w:rPr>
+              <w:t>tring</w:t>
+            </w:r>
+          </w:p>
+        </w:tc>
+      </w:tr>
+      <w:tr>
+        <w:trPr>
+          <w:trHeight w:val="398"/>
+        </w:trPr>
+        <w:tc>
+          <w:tcPr>
+            <w:tcW w:w="1866" w:type="pct"/>
+            <w:tcBorders>
+              <w:top w:val="nil"/>
+              <w:left w:val="nil"/>
+              <w:bottom w:val="nil"/>
+              <w:right w:val="nil"/>
+            </w:tcBorders>
+          </w:tcPr>
+          <w:p>
+            <w:pPr>
+              <w:rPr>
+                <w:rFonts w:ascii="Times New Roman" w:eastAsia="Times New Roman" w:hAnsi="Times New Roman" w:cs="Times New Roman"/>
+                <w:sz w:val="24"/>
+                <w:szCs w:val="24"/>
+              </w:rPr>
+            </w:pPr>
+            <w:r>
+              <w:rPr>
+                <w:rFonts w:ascii="Times New Roman" w:hAnsi="Times New Roman" w:cs="Times New Roman"/>
+                <w:sz w:val="24"/>
+                <w:szCs w:val="24"/>
+              </w:rPr>
+              <w:t>arrival_date_week_number</w:t>
+            </w:r>
+          </w:p>
+          <w:p>
+            <w:pPr>
+              <w:rPr>
+                <w:rFonts w:ascii="Times New Roman" w:hAnsi="Times New Roman" w:cs="Times New Roman"/>
+                <w:sz w:val="24"/>
+                <w:szCs w:val="24"/>
+              </w:rPr>
+            </w:pPr>
+          </w:p>
+        </w:tc>
+        <w:tc>
+          <w:tcPr>
+            <w:tcW w:w="2462" w:type="pct"/>
+            <w:tcBorders>
+              <w:top w:val="nil"/>
+              <w:left w:val="nil"/>
+              <w:bottom w:val="nil"/>
+              <w:right w:val="nil"/>
+            </w:tcBorders>
+          </w:tcPr>
+          <w:p>
+            <w:pPr>
+              <w:rPr>
+                <w:rFonts w:ascii="Times New Roman" w:hAnsi="Times New Roman" w:cs="Times New Roman"/>
+                <w:sz w:val="24"/>
+                <w:szCs w:val="24"/>
+              </w:rPr>
+            </w:pPr>
+            <w:r>
+              <w:rPr>
+                <w:rFonts w:ascii="Times New Roman" w:hAnsi="Times New Roman" w:cs="Times New Roman"/>
+                <w:sz w:val="24"/>
+                <w:szCs w:val="24"/>
+              </w:rPr>
+              <w:t>Tuần đến trong năm</w:t>
+            </w:r>
+          </w:p>
+        </w:tc>
+        <w:tc>
+          <w:tcPr>
+            <w:tcW w:w="672" w:type="pct"/>
+            <w:tcBorders>
+              <w:top w:val="nil"/>
+              <w:left w:val="nil"/>
+              <w:bottom w:val="nil"/>
+              <w:right w:val="nil"/>
+            </w:tcBorders>
+          </w:tcPr>
+          <w:p>
+            <w:pPr>
+              <w:rPr>
+                <w:rFonts w:ascii="Times New Roman" w:hAnsi="Times New Roman" w:cs="Times New Roman"/>
+                <w:sz w:val="24"/>
+                <w:szCs w:val="24"/>
+              </w:rPr>
+            </w:pPr>
+            <w:r>
+              <w:rPr>
+                <w:rFonts w:ascii="Times New Roman" w:hAnsi="Times New Roman" w:cs="Times New Roman"/>
+                <w:sz w:val="24"/>
+                <w:szCs w:val="24"/>
+              </w:rPr>
+              <w:t>int</w:t>
+            </w:r>
+          </w:p>
+        </w:tc>
+      </w:tr>
+      <w:tr>
+        <w:trPr>
+          <w:trHeight w:val="398"/>
+        </w:trPr>
+        <w:tc>
+          <w:tcPr>
+            <w:tcW w:w="1866" w:type="pct"/>
+            <w:tcBorders>
+              <w:top w:val="nil"/>
+              <w:left w:val="nil"/>
+              <w:bottom w:val="nil"/>
+              <w:right w:val="nil"/>
+            </w:tcBorders>
+          </w:tcPr>
+          <w:p>
+            <w:pPr>
+              <w:rPr>
+                <w:rFonts w:ascii="Times New Roman" w:eastAsia="Times New Roman" w:hAnsi="Times New Roman" w:cs="Times New Roman"/>
+                <w:sz w:val="24"/>
+                <w:szCs w:val="24"/>
+              </w:rPr>
+            </w:pPr>
+            <w:r>
+              <w:rPr>
+                <w:rFonts w:ascii="Times New Roman" w:hAnsi="Times New Roman" w:cs="Times New Roman"/>
+                <w:sz w:val="24"/>
+                <w:szCs w:val="24"/>
+              </w:rPr>
+              <w:lastRenderedPageBreak/>
+              <w:t>arrival_date_day_of_month</w:t>
+            </w:r>
+          </w:p>
+          <w:p>
+            <w:pPr>
+              <w:rPr>
+                <w:rFonts w:ascii="Times New Roman" w:hAnsi="Times New Roman" w:cs="Times New Roman"/>
+                <w:sz w:val="24"/>
+                <w:szCs w:val="24"/>
+              </w:rPr>
+            </w:pPr>
+          </w:p>
+        </w:tc>
+        <w:tc>
+          <w:tcPr>
+            <w:tcW w:w="2462" w:type="pct"/>
+            <w:tcBorders>
+              <w:top w:val="nil"/>
+              <w:left w:val="nil"/>
+              <w:bottom w:val="nil"/>
+              <w:right w:val="nil"/>
+            </w:tcBorders>
+          </w:tcPr>
+          <w:p>
+            <w:pPr>
+              <w:rPr>
+                <w:rFonts w:ascii="Times New Roman" w:hAnsi="Times New Roman" w:cs="Times New Roman"/>
+                <w:sz w:val="24"/>
+                <w:szCs w:val="24"/>
+              </w:rPr>
+            </w:pPr>
+            <w:r>
+              <w:rPr>
+                <w:rFonts w:ascii="Times New Roman" w:hAnsi="Times New Roman" w:cs="Times New Roman"/>
+                <w:sz w:val="24"/>
+                <w:szCs w:val="24"/>
+              </w:rPr>
+              <w:t>Ngày đến trong tháng</w:t>
+            </w:r>
+          </w:p>
+        </w:tc>
+        <w:tc>
+          <w:tcPr>
+            <w:tcW w:w="672" w:type="pct"/>
+            <w:tcBorders>
+              <w:top w:val="nil"/>
+              <w:left w:val="nil"/>
+              <w:bottom w:val="nil"/>
+              <w:right w:val="nil"/>
+            </w:tcBorders>
+          </w:tcPr>
+          <w:p>
+            <w:pPr>
+              <w:rPr>
+                <w:rFonts w:ascii="Times New Roman" w:hAnsi="Times New Roman" w:cs="Times New Roman"/>
+                <w:sz w:val="24"/>
+                <w:szCs w:val="24"/>
+              </w:rPr>
+            </w:pPr>
+            <w:r>
+              <w:rPr>
+                <w:rFonts w:ascii="Times New Roman" w:hAnsi="Times New Roman" w:cs="Times New Roman"/>
+                <w:sz w:val="24"/>
+                <w:szCs w:val="24"/>
+              </w:rPr>
+              <w:t>int</w:t>
+            </w:r>
+          </w:p>
+        </w:tc>
+      </w:tr>
+      <w:tr>
+        <w:trPr>
+          <w:trHeight w:val="398"/>
+        </w:trPr>
+        <w:tc>
+          <w:tcPr>
+            <w:tcW w:w="1866" w:type="pct"/>
+            <w:tcBorders>
+              <w:top w:val="nil"/>
+              <w:left w:val="nil"/>
+              <w:bottom w:val="nil"/>
+              <w:right w:val="nil"/>
+            </w:tcBorders>
+          </w:tcPr>
+          <w:p>
+            <w:pPr>
+              <w:rPr>
+                <w:rFonts w:ascii="Times New Roman" w:eastAsia="Times New Roman" w:hAnsi="Times New Roman" w:cs="Times New Roman"/>
+                <w:sz w:val="24"/>
+                <w:szCs w:val="24"/>
+              </w:rPr>
+            </w:pPr>
+            <w:r>
+              <w:rPr>
+                <w:rFonts w:ascii="Times New Roman" w:hAnsi="Times New Roman" w:cs="Times New Roman"/>
+                <w:sz w:val="24"/>
+                <w:szCs w:val="24"/>
+              </w:rPr>
+              <w:t>stays_in_weekend_nights</w:t>
+            </w:r>
+          </w:p>
+          <w:p>
+            <w:pPr>
+              <w:rPr>
+                <w:rFonts w:ascii="Times New Roman" w:hAnsi="Times New Roman" w:cs="Times New Roman"/>
+                <w:sz w:val="24"/>
+                <w:szCs w:val="24"/>
+              </w:rPr>
+            </w:pPr>
+          </w:p>
+        </w:tc>
+        <w:tc>
+          <w:tcPr>
+            <w:tcW w:w="2462" w:type="pct"/>
+            <w:tcBorders>
+              <w:top w:val="nil"/>
+              <w:left w:val="nil"/>
+              <w:bottom w:val="nil"/>
+              <w:right w:val="nil"/>
+            </w:tcBorders>
+          </w:tcPr>
+          <w:p>
+            <w:pPr>
+              <w:rPr>
+                <w:rFonts w:ascii="Times New Roman" w:hAnsi="Times New Roman" w:cs="Times New Roman"/>
+                <w:sz w:val="24"/>
+                <w:szCs w:val="24"/>
+              </w:rPr>
+            </w:pPr>
+            <w:r>
+              <w:rPr>
+                <w:rFonts w:ascii="Times New Roman" w:hAnsi="Times New Roman" w:cs="Times New Roman"/>
+                <w:sz w:val="24"/>
+                <w:szCs w:val="24"/>
+              </w:rPr>
+              <w:t>Lưu trú vào các đêm cuối tuần</w:t>
+            </w:r>
+          </w:p>
+        </w:tc>
+        <w:tc>
+          <w:tcPr>
+            <w:tcW w:w="672" w:type="pct"/>
+            <w:tcBorders>
+              <w:top w:val="nil"/>
+              <w:left w:val="nil"/>
+              <w:bottom w:val="nil"/>
+              <w:right w:val="nil"/>
+            </w:tcBorders>
+          </w:tcPr>
+          <w:p>
+            <w:pPr>
+              <w:rPr>
+                <w:rFonts w:ascii="Times New Roman" w:hAnsi="Times New Roman" w:cs="Times New Roman"/>
+                <w:sz w:val="24"/>
+                <w:szCs w:val="24"/>
+              </w:rPr>
+            </w:pPr>
+            <w:r>
+              <w:rPr>
+                <w:rFonts w:ascii="Times New Roman" w:hAnsi="Times New Roman" w:cs="Times New Roman"/>
+                <w:sz w:val="24"/>
+                <w:szCs w:val="24"/>
+              </w:rPr>
+              <w:t>int</w:t>
+            </w:r>
+          </w:p>
+        </w:tc>
+      </w:tr>
+      <w:tr>
+        <w:trPr>
+          <w:trHeight w:val="398"/>
+        </w:trPr>
+        <w:tc>
+          <w:tcPr>
+            <w:tcW w:w="1866" w:type="pct"/>
+            <w:tcBorders>
+              <w:top w:val="nil"/>
+              <w:left w:val="nil"/>
+              <w:bottom w:val="nil"/>
+              <w:right w:val="nil"/>
+            </w:tcBorders>
+          </w:tcPr>
+          <w:p>
+            <w:pPr>
+              <w:rPr>
+                <w:rFonts w:ascii="Times New Roman" w:eastAsia="Times New Roman" w:hAnsi="Times New Roman" w:cs="Times New Roman"/>
+                <w:sz w:val="24"/>
+                <w:szCs w:val="24"/>
+              </w:rPr>
+            </w:pPr>
+            <w:r>
+              <w:rPr>
+                <w:rFonts w:ascii="Times New Roman" w:hAnsi="Times New Roman" w:cs="Times New Roman"/>
+                <w:sz w:val="24"/>
+                <w:szCs w:val="24"/>
+              </w:rPr>
+              <w:t>stays_in_week_nights</w:t>
+            </w:r>
+          </w:p>
+        </w:tc>
+        <w:tc>
+          <w:tcPr>
+            <w:tcW w:w="2462" w:type="pct"/>
+            <w:tcBorders>
+              <w:top w:val="nil"/>
+              <w:left w:val="nil"/>
+              <w:bottom w:val="nil"/>
+              <w:right w:val="nil"/>
+            </w:tcBorders>
+          </w:tcPr>
+          <w:p>
+            <w:pPr>
+              <w:rPr>
+                <w:rFonts w:ascii="Times New Roman" w:hAnsi="Times New Roman" w:cs="Times New Roman"/>
+                <w:sz w:val="24"/>
+                <w:szCs w:val="24"/>
+              </w:rPr>
+            </w:pPr>
+            <w:r>
+              <w:rPr>
+                <w:rFonts w:ascii="Times New Roman" w:hAnsi="Times New Roman" w:cs="Times New Roman"/>
+                <w:sz w:val="24"/>
+                <w:szCs w:val="24"/>
+              </w:rPr>
+              <w:t>Lưu trú vào các đêm trong tuần</w:t>
+            </w:r>
+          </w:p>
+        </w:tc>
+        <w:tc>
+          <w:tcPr>
+            <w:tcW w:w="672" w:type="pct"/>
+            <w:tcBorders>
+              <w:top w:val="nil"/>
+              <w:left w:val="nil"/>
+              <w:bottom w:val="nil"/>
+              <w:right w:val="nil"/>
+            </w:tcBorders>
+          </w:tcPr>
+          <w:p>
+            <w:pPr>
+              <w:rPr>
+                <w:rFonts w:ascii="Times New Roman" w:hAnsi="Times New Roman" w:cs="Times New Roman"/>
+                <w:sz w:val="24"/>
+                <w:szCs w:val="24"/>
+              </w:rPr>
+            </w:pPr>
+            <w:r>
+              <w:rPr>
+                <w:rFonts w:ascii="Times New Roman" w:hAnsi="Times New Roman" w:cs="Times New Roman"/>
+                <w:sz w:val="24"/>
+                <w:szCs w:val="24"/>
+              </w:rPr>
+              <w:t>int</w:t>
+            </w:r>
+          </w:p>
+        </w:tc>
+      </w:tr>
+      <w:tr>
+        <w:trPr>
+          <w:trHeight w:val="398"/>
+        </w:trPr>
+        <w:tc>
+          <w:tcPr>
+            <w:tcW w:w="1866" w:type="pct"/>
+            <w:tcBorders>
+              <w:top w:val="nil"/>
+              <w:left w:val="nil"/>
+              <w:bottom w:val="nil"/>
+              <w:right w:val="nil"/>
+            </w:tcBorders>
+          </w:tcPr>
+          <w:p>
+            <w:pPr>
+              <w:rPr>
+                <w:rFonts w:ascii="Times New Roman" w:hAnsi="Times New Roman" w:cs="Times New Roman"/>
+                <w:sz w:val="24"/>
+                <w:szCs w:val="24"/>
+              </w:rPr>
+            </w:pPr>
+            <w:r>
+              <w:rPr>
+                <w:rFonts w:ascii="Times New Roman" w:hAnsi="Times New Roman" w:cs="Times New Roman"/>
+                <w:sz w:val="24"/>
+                <w:szCs w:val="24"/>
+              </w:rPr>
+              <w:t>adults</w:t>
+            </w:r>
+          </w:p>
+        </w:tc>
+        <w:tc>
+          <w:tcPr>
+            <w:tcW w:w="2462" w:type="pct"/>
+            <w:tcBorders>
+              <w:top w:val="nil"/>
+              <w:left w:val="nil"/>
+              <w:bottom w:val="nil"/>
+              <w:right w:val="nil"/>
+            </w:tcBorders>
+          </w:tcPr>
+          <w:p>
+            <w:pPr>
+              <w:rPr>
+                <w:rFonts w:ascii="Times New Roman" w:hAnsi="Times New Roman" w:cs="Times New Roman"/>
+                <w:sz w:val="24"/>
+                <w:szCs w:val="24"/>
+              </w:rPr>
+            </w:pPr>
+            <w:r>
+              <w:rPr>
+                <w:rFonts w:ascii="Times New Roman" w:hAnsi="Times New Roman" w:cs="Times New Roman"/>
+                <w:sz w:val="24"/>
+                <w:szCs w:val="24"/>
+              </w:rPr>
+              <w:t>Số lượng khách người lớn</w:t>
+            </w:r>
+          </w:p>
+        </w:tc>
+        <w:tc>
+          <w:tcPr>
+            <w:tcW w:w="672" w:type="pct"/>
+            <w:tcBorders>
+              <w:top w:val="nil"/>
+              <w:left w:val="nil"/>
+              <w:bottom w:val="nil"/>
+              <w:right w:val="nil"/>
+            </w:tcBorders>
+          </w:tcPr>
+          <w:p>
+            <w:pPr>
+              <w:rPr>
+                <w:rFonts w:ascii="Times New Roman" w:hAnsi="Times New Roman" w:cs="Times New Roman"/>
+                <w:sz w:val="24"/>
+                <w:szCs w:val="24"/>
+              </w:rPr>
+            </w:pPr>
+            <w:r>
+              <w:rPr>
+                <w:rFonts w:ascii="Times New Roman" w:hAnsi="Times New Roman" w:cs="Times New Roman"/>
+                <w:sz w:val="24"/>
+                <w:szCs w:val="24"/>
+              </w:rPr>
+              <w:t>int</w:t>
+            </w:r>
+          </w:p>
+        </w:tc>
+      </w:tr>
+      <w:tr>
+        <w:trPr>
+          <w:trHeight w:val="398"/>
+        </w:trPr>
+        <w:tc>
+          <w:tcPr>
+            <w:tcW w:w="1866" w:type="pct"/>
+            <w:tcBorders>
+              <w:top w:val="nil"/>
+              <w:left w:val="nil"/>
+              <w:bottom w:val="nil"/>
+              <w:right w:val="nil"/>
+            </w:tcBorders>
+          </w:tcPr>
+          <w:p>
+            <w:pPr>
+              <w:rPr>
+                <w:rFonts w:ascii="Times New Roman" w:hAnsi="Times New Roman" w:cs="Times New Roman"/>
+                <w:sz w:val="24"/>
+                <w:szCs w:val="24"/>
+              </w:rPr>
+            </w:pPr>
+            <w:r>
+              <w:rPr>
+                <w:rFonts w:ascii="Times New Roman" w:hAnsi="Times New Roman" w:cs="Times New Roman"/>
+                <w:sz w:val="24"/>
+                <w:szCs w:val="24"/>
+              </w:rPr>
+              <w:t>children</w:t>
+            </w:r>
+          </w:p>
+        </w:tc>
+        <w:tc>
+          <w:tcPr>
+            <w:tcW w:w="2462" w:type="pct"/>
+            <w:tcBorders>
+              <w:top w:val="nil"/>
+              <w:left w:val="nil"/>
+              <w:bottom w:val="nil"/>
+              <w:right w:val="nil"/>
+            </w:tcBorders>
+          </w:tcPr>
+          <w:p>
+            <w:pPr>
+              <w:rPr>
+                <w:rFonts w:ascii="Times New Roman" w:hAnsi="Times New Roman" w:cs="Times New Roman"/>
+                <w:sz w:val="24"/>
+                <w:szCs w:val="24"/>
+              </w:rPr>
+            </w:pPr>
+            <w:r>
+              <w:rPr>
+                <w:rFonts w:ascii="Times New Roman" w:hAnsi="Times New Roman" w:cs="Times New Roman"/>
+                <w:sz w:val="24"/>
+                <w:szCs w:val="24"/>
+              </w:rPr>
+              <w:t xml:space="preserve">Số lượng khách </w:t>
+            </w:r>
+            <w:r>
+              <w:rPr>
+                <w:rFonts w:ascii="Times New Roman" w:hAnsi="Times New Roman" w:cs="Times New Roman"/>
+                <w:sz w:val="24"/>
+                <w:szCs w:val="24"/>
+              </w:rPr>
+              <w:t>trẻ em</w:t>
+            </w:r>
+          </w:p>
+        </w:tc>
+        <w:tc>
+          <w:tcPr>
+            <w:tcW w:w="672" w:type="pct"/>
+            <w:tcBorders>
+              <w:top w:val="nil"/>
+              <w:left w:val="nil"/>
+              <w:bottom w:val="nil"/>
+              <w:right w:val="nil"/>
+            </w:tcBorders>
+          </w:tcPr>
+          <w:p>
+            <w:pPr>
+              <w:rPr>
+                <w:rFonts w:ascii="Times New Roman" w:hAnsi="Times New Roman" w:cs="Times New Roman"/>
+                <w:sz w:val="24"/>
+                <w:szCs w:val="24"/>
+              </w:rPr>
+            </w:pPr>
+            <w:r>
+              <w:rPr>
+                <w:rFonts w:ascii="Times New Roman" w:hAnsi="Times New Roman" w:cs="Times New Roman"/>
+                <w:sz w:val="24"/>
+                <w:szCs w:val="24"/>
+              </w:rPr>
+              <w:t>float</w:t>
+            </w:r>
+          </w:p>
+        </w:tc>
+      </w:tr>
+      <w:tr>
+        <w:trPr>
+          <w:trHeight w:val="398"/>
+        </w:trPr>
+        <w:tc>
+          <w:tcPr>
+            <w:tcW w:w="1866" w:type="pct"/>
+            <w:tcBorders>
+              <w:top w:val="nil"/>
+              <w:left w:val="nil"/>
+              <w:bottom w:val="nil"/>
+              <w:right w:val="nil"/>
+            </w:tcBorders>
+          </w:tcPr>
+          <w:p>
+            <w:pPr>
+              <w:rPr>
+                <w:rFonts w:ascii="Times New Roman" w:hAnsi="Times New Roman" w:cs="Times New Roman"/>
+                <w:sz w:val="24"/>
+                <w:szCs w:val="24"/>
+              </w:rPr>
+            </w:pPr>
+            <w:r>
+              <w:rPr>
+                <w:rFonts w:ascii="Times New Roman" w:hAnsi="Times New Roman" w:cs="Times New Roman"/>
+                <w:sz w:val="24"/>
+                <w:szCs w:val="24"/>
+              </w:rPr>
+              <w:t>babies</w:t>
+            </w:r>
+          </w:p>
+        </w:tc>
+        <w:tc>
+          <w:tcPr>
+            <w:tcW w:w="2462" w:type="pct"/>
+            <w:tcBorders>
+              <w:top w:val="nil"/>
+              <w:left w:val="nil"/>
+              <w:bottom w:val="nil"/>
+              <w:right w:val="nil"/>
+            </w:tcBorders>
+          </w:tcPr>
+          <w:p>
+            <w:pPr>
+              <w:rPr>
+                <w:rFonts w:ascii="Times New Roman" w:hAnsi="Times New Roman" w:cs="Times New Roman"/>
+                <w:sz w:val="24"/>
+                <w:szCs w:val="24"/>
+              </w:rPr>
+            </w:pPr>
+            <w:r>
+              <w:rPr>
+                <w:rFonts w:ascii="Times New Roman" w:hAnsi="Times New Roman" w:cs="Times New Roman"/>
+                <w:sz w:val="24"/>
+                <w:szCs w:val="24"/>
+              </w:rPr>
+              <w:t xml:space="preserve">Số lượng khách trẻ </w:t>
+            </w:r>
+            <w:r>
+              <w:rPr>
+                <w:rFonts w:ascii="Times New Roman" w:hAnsi="Times New Roman" w:cs="Times New Roman"/>
+                <w:sz w:val="24"/>
+                <w:szCs w:val="24"/>
+              </w:rPr>
+              <w:t>sơ sinh</w:t>
+            </w:r>
+          </w:p>
+        </w:tc>
+        <w:tc>
+          <w:tcPr>
+            <w:tcW w:w="672" w:type="pct"/>
+            <w:tcBorders>
+              <w:top w:val="nil"/>
+              <w:left w:val="nil"/>
+              <w:bottom w:val="nil"/>
+              <w:right w:val="nil"/>
+            </w:tcBorders>
+          </w:tcPr>
+          <w:p>
+            <w:pPr>
+              <w:rPr>
+                <w:rFonts w:ascii="Times New Roman" w:hAnsi="Times New Roman" w:cs="Times New Roman"/>
+                <w:sz w:val="24"/>
+                <w:szCs w:val="24"/>
+              </w:rPr>
+            </w:pPr>
+            <w:r>
+              <w:rPr>
+                <w:rFonts w:ascii="Times New Roman" w:hAnsi="Times New Roman" w:cs="Times New Roman"/>
+                <w:sz w:val="24"/>
+                <w:szCs w:val="24"/>
+              </w:rPr>
+              <w:t>int</w:t>
+            </w:r>
+          </w:p>
+        </w:tc>
+      </w:tr>
+      <w:tr>
+        <w:trPr>
+          <w:trHeight w:val="398"/>
+        </w:trPr>
+        <w:tc>
+          <w:tcPr>
+            <w:tcW w:w="1866" w:type="pct"/>
+            <w:tcBorders>
+              <w:top w:val="nil"/>
+              <w:left w:val="nil"/>
+              <w:bottom w:val="nil"/>
+              <w:right w:val="nil"/>
+            </w:tcBorders>
+          </w:tcPr>
+          <w:p>
+            <w:pPr>
+              <w:rPr>
+                <w:rFonts w:ascii="Times New Roman" w:hAnsi="Times New Roman" w:cs="Times New Roman"/>
+                <w:sz w:val="24"/>
+                <w:szCs w:val="24"/>
+              </w:rPr>
+            </w:pPr>
+            <w:r>
+              <w:rPr>
+                <w:rFonts w:ascii="Times New Roman" w:hAnsi="Times New Roman" w:cs="Times New Roman"/>
+                <w:sz w:val="24"/>
+                <w:szCs w:val="24"/>
+              </w:rPr>
+              <w:t>m</w:t>
+            </w:r>
+            <w:r>
+              <w:rPr>
+                <w:rFonts w:ascii="Times New Roman" w:hAnsi="Times New Roman" w:cs="Times New Roman"/>
+                <w:sz w:val="24"/>
+                <w:szCs w:val="24"/>
+              </w:rPr>
+              <w:t>eal</w:t>
+            </w:r>
+            <w:r>
+              <w:rPr>
+                <w:rFonts w:ascii="Times New Roman" w:hAnsi="Times New Roman" w:cs="Times New Roman"/>
+                <w:sz w:val="24"/>
+                <w:szCs w:val="24"/>
+              </w:rPr>
+              <w:t xml:space="preserve"> </w:t>
+            </w:r>
+          </w:p>
+        </w:tc>
+        <w:tc>
+          <w:tcPr>
+            <w:tcW w:w="2462" w:type="pct"/>
+            <w:tcBorders>
+              <w:top w:val="nil"/>
+              <w:left w:val="nil"/>
+              <w:bottom w:val="nil"/>
+              <w:right w:val="nil"/>
+            </w:tcBorders>
+          </w:tcPr>
+          <w:p>
+            <w:pPr>
+              <w:rPr>
+                <w:rFonts w:ascii="Times New Roman" w:hAnsi="Times New Roman" w:cs="Times New Roman"/>
+                <w:sz w:val="24"/>
+                <w:szCs w:val="24"/>
+              </w:rPr>
+            </w:pPr>
+            <w:r>
+              <w:rPr>
+                <w:rFonts w:ascii="Times New Roman" w:hAnsi="Times New Roman" w:cs="Times New Roman"/>
+                <w:sz w:val="24"/>
+                <w:szCs w:val="24"/>
+              </w:rPr>
+              <w:t>Gói dịch vụ ăn uống đã đặt</w:t>
+            </w:r>
+          </w:p>
+        </w:tc>
+        <w:tc>
+          <w:tcPr>
+            <w:tcW w:w="672" w:type="pct"/>
+            <w:tcBorders>
+              <w:top w:val="nil"/>
+              <w:left w:val="nil"/>
+              <w:bottom w:val="nil"/>
+              <w:right w:val="nil"/>
+            </w:tcBorders>
+          </w:tcPr>
+          <w:p>
+            <w:pPr>
+              <w:rPr>
+                <w:rFonts w:ascii="Times New Roman" w:hAnsi="Times New Roman" w:cs="Times New Roman"/>
+                <w:sz w:val="24"/>
+                <w:szCs w:val="24"/>
+              </w:rPr>
+            </w:pPr>
+            <w:r>
+              <w:rPr>
+                <w:rFonts w:ascii="Times New Roman" w:hAnsi="Times New Roman" w:cs="Times New Roman"/>
+                <w:sz w:val="24"/>
+                <w:szCs w:val="24"/>
+              </w:rPr>
+              <w:t>string</w:t>
+            </w:r>
+          </w:p>
+        </w:tc>
+      </w:tr>
+      <w:tr>
+        <w:trPr>
+          <w:trHeight w:val="398"/>
+        </w:trPr>
+        <w:tc>
+          <w:tcPr>
+            <w:tcW w:w="1866" w:type="pct"/>
+            <w:tcBorders>
+              <w:top w:val="nil"/>
+              <w:left w:val="nil"/>
+              <w:bottom w:val="nil"/>
+              <w:right w:val="nil"/>
+            </w:tcBorders>
+          </w:tcPr>
+          <w:p>
+            <w:pPr>
+              <w:rPr>
+                <w:rFonts w:ascii="Times New Roman" w:hAnsi="Times New Roman" w:cs="Times New Roman"/>
+                <w:sz w:val="24"/>
+                <w:szCs w:val="24"/>
+              </w:rPr>
+            </w:pPr>
+            <w:r>
+              <w:rPr>
+                <w:rFonts w:ascii="Times New Roman" w:hAnsi="Times New Roman" w:cs="Times New Roman"/>
+                <w:sz w:val="24"/>
+                <w:szCs w:val="24"/>
+              </w:rPr>
+              <w:t>country</w:t>
+            </w:r>
+          </w:p>
+        </w:tc>
+        <w:tc>
+          <w:tcPr>
+            <w:tcW w:w="2462" w:type="pct"/>
+            <w:tcBorders>
+              <w:top w:val="nil"/>
+              <w:left w:val="nil"/>
+              <w:bottom w:val="nil"/>
+              <w:right w:val="nil"/>
+            </w:tcBorders>
+          </w:tcPr>
+          <w:p>
+            <w:pPr>
+              <w:rPr>
+                <w:rFonts w:ascii="Times New Roman" w:hAnsi="Times New Roman" w:cs="Times New Roman"/>
+                <w:sz w:val="24"/>
+                <w:szCs w:val="24"/>
+              </w:rPr>
+            </w:pPr>
+            <w:r>
+              <w:rPr>
+                <w:rFonts w:ascii="Times New Roman" w:hAnsi="Times New Roman" w:cs="Times New Roman"/>
+                <w:sz w:val="24"/>
+                <w:szCs w:val="24"/>
+              </w:rPr>
+              <w:t>Mã q</w:t>
+            </w:r>
+            <w:r>
+              <w:rPr>
+                <w:rFonts w:ascii="Times New Roman" w:hAnsi="Times New Roman" w:cs="Times New Roman"/>
+                <w:sz w:val="24"/>
+                <w:szCs w:val="24"/>
+              </w:rPr>
+              <w:t>uốc gia của khách (mã ISO)</w:t>
+            </w:r>
+          </w:p>
+        </w:tc>
+        <w:tc>
+          <w:tcPr>
+            <w:tcW w:w="672" w:type="pct"/>
+            <w:tcBorders>
+              <w:top w:val="nil"/>
+              <w:left w:val="nil"/>
+              <w:bottom w:val="nil"/>
+              <w:right w:val="nil"/>
+            </w:tcBorders>
+          </w:tcPr>
+          <w:p>
+            <w:pPr>
+              <w:rPr>
+                <w:rFonts w:ascii="Times New Roman" w:hAnsi="Times New Roman" w:cs="Times New Roman"/>
+                <w:sz w:val="24"/>
+                <w:szCs w:val="24"/>
+              </w:rPr>
+            </w:pPr>
+            <w:r>
+              <w:rPr>
+                <w:rFonts w:ascii="Times New Roman" w:hAnsi="Times New Roman" w:cs="Times New Roman"/>
+                <w:sz w:val="24"/>
+                <w:szCs w:val="24"/>
+              </w:rPr>
+              <w:t>string</w:t>
+            </w:r>
+          </w:p>
+        </w:tc>
+      </w:tr>
+      <w:tr>
+        <w:trPr>
+          <w:trHeight w:val="398"/>
+        </w:trPr>
+        <w:tc>
+          <w:tcPr>
+            <w:tcW w:w="1866" w:type="pct"/>
+            <w:tcBorders>
+              <w:top w:val="nil"/>
+              <w:left w:val="nil"/>
+              <w:bottom w:val="nil"/>
+              <w:right w:val="nil"/>
+            </w:tcBorders>
+          </w:tcPr>
+          <w:p>
+            <w:pPr>
+              <w:rPr>
+                <w:rFonts w:ascii="Times New Roman" w:hAnsi="Times New Roman" w:cs="Times New Roman"/>
+                <w:sz w:val="24"/>
+                <w:szCs w:val="24"/>
+              </w:rPr>
+            </w:pPr>
+            <w:r>
+              <w:rPr>
+                <w:rFonts w:ascii="Times New Roman" w:hAnsi="Times New Roman" w:cs="Times New Roman"/>
+                <w:sz w:val="24"/>
+                <w:szCs w:val="24"/>
+              </w:rPr>
+              <w:t>market_segment</w:t>
+            </w:r>
+          </w:p>
+        </w:tc>
+        <w:tc>
+          <w:tcPr>
+            <w:tcW w:w="2462" w:type="pct"/>
+            <w:tcBorders>
+              <w:top w:val="nil"/>
+              <w:left w:val="nil"/>
+              <w:bottom w:val="nil"/>
+              <w:right w:val="nil"/>
+            </w:tcBorders>
+          </w:tcPr>
+          <w:p>
+            <w:pPr>
+              <w:rPr>
+                <w:rFonts w:ascii="Times New Roman" w:hAnsi="Times New Roman" w:cs="Times New Roman"/>
+                <w:sz w:val="24"/>
+                <w:szCs w:val="24"/>
+              </w:rPr>
+            </w:pPr>
+            <w:r>
+              <w:rPr>
+                <w:rFonts w:ascii="Times New Roman" w:hAnsi="Times New Roman" w:cs="Times New Roman"/>
+                <w:sz w:val="24"/>
+                <w:szCs w:val="24"/>
+              </w:rPr>
+              <w:t>Phân khúc thị trường</w:t>
+            </w:r>
+          </w:p>
+        </w:tc>
+        <w:tc>
+          <w:tcPr>
+            <w:tcW w:w="672" w:type="pct"/>
+            <w:tcBorders>
+              <w:top w:val="nil"/>
+              <w:left w:val="nil"/>
+              <w:bottom w:val="nil"/>
+              <w:right w:val="nil"/>
+            </w:tcBorders>
+          </w:tcPr>
+          <w:p>
+            <w:pPr>
+              <w:rPr>
+                <w:rFonts w:ascii="Times New Roman" w:hAnsi="Times New Roman" w:cs="Times New Roman"/>
+                <w:sz w:val="24"/>
+                <w:szCs w:val="24"/>
+              </w:rPr>
+            </w:pPr>
+            <w:r>
+              <w:rPr>
+                <w:rFonts w:ascii="Times New Roman" w:hAnsi="Times New Roman" w:cs="Times New Roman"/>
+                <w:sz w:val="24"/>
+                <w:szCs w:val="24"/>
+              </w:rPr>
+              <w:t>string</w:t>
+            </w:r>
+          </w:p>
+        </w:tc>
+      </w:tr>
+      <w:tr>
+        <w:trPr>
+          <w:trHeight w:val="398"/>
+        </w:trPr>
+        <w:tc>
+          <w:tcPr>
+            <w:tcW w:w="1866" w:type="pct"/>
+            <w:tcBorders>
+              <w:top w:val="nil"/>
+              <w:left w:val="nil"/>
+              <w:bottom w:val="nil"/>
+              <w:right w:val="nil"/>
+            </w:tcBorders>
+          </w:tcPr>
+          <w:p>
+            <w:pPr>
+              <w:rPr>
+                <w:rFonts w:ascii="Times New Roman" w:hAnsi="Times New Roman" w:cs="Times New Roman"/>
+                <w:sz w:val="24"/>
+                <w:szCs w:val="24"/>
+              </w:rPr>
+            </w:pPr>
+            <w:r>
+              <w:rPr>
+                <w:rFonts w:ascii="Times New Roman" w:hAnsi="Times New Roman" w:cs="Times New Roman"/>
+                <w:sz w:val="24"/>
+                <w:szCs w:val="24"/>
+              </w:rPr>
+              <w:t>distribution_channel</w:t>
+            </w:r>
+          </w:p>
+        </w:tc>
+        <w:tc>
+          <w:tcPr>
+            <w:tcW w:w="2462" w:type="pct"/>
+            <w:tcBorders>
+              <w:top w:val="nil"/>
+              <w:left w:val="nil"/>
+              <w:bottom w:val="nil"/>
+              <w:right w:val="nil"/>
+            </w:tcBorders>
+          </w:tcPr>
+          <w:p>
+            <w:pPr>
+              <w:rPr>
+                <w:rFonts w:ascii="Times New Roman" w:hAnsi="Times New Roman" w:cs="Times New Roman"/>
+                <w:sz w:val="24"/>
+                <w:szCs w:val="24"/>
+              </w:rPr>
+            </w:pPr>
+            <w:r>
+              <w:rPr>
+                <w:rFonts w:ascii="Times New Roman" w:hAnsi="Times New Roman" w:cs="Times New Roman"/>
+                <w:sz w:val="24"/>
+                <w:szCs w:val="24"/>
+              </w:rPr>
+              <w:t>Kênh phân phối</w:t>
+            </w:r>
+          </w:p>
+        </w:tc>
+        <w:tc>
+          <w:tcPr>
+            <w:tcW w:w="672" w:type="pct"/>
+            <w:tcBorders>
+              <w:top w:val="nil"/>
+              <w:left w:val="nil"/>
+              <w:bottom w:val="nil"/>
+              <w:right w:val="nil"/>
+            </w:tcBorders>
+          </w:tcPr>
+          <w:p>
+            <w:pPr>
+              <w:rPr>
+                <w:rFonts w:ascii="Times New Roman" w:hAnsi="Times New Roman" w:cs="Times New Roman"/>
+                <w:sz w:val="24"/>
+                <w:szCs w:val="24"/>
+              </w:rPr>
+            </w:pPr>
+            <w:r>
+              <w:rPr>
+                <w:rFonts w:ascii="Times New Roman" w:hAnsi="Times New Roman" w:cs="Times New Roman"/>
+                <w:sz w:val="24"/>
+                <w:szCs w:val="24"/>
+              </w:rPr>
+              <w:t>string</w:t>
+            </w:r>
+          </w:p>
+        </w:tc>
+      </w:tr>
+      <w:tr>
+        <w:trPr>
+          <w:trHeight w:val="398"/>
+        </w:trPr>
+        <w:tc>
+          <w:tcPr>
+            <w:tcW w:w="1866" w:type="pct"/>
+            <w:tcBorders>
+              <w:top w:val="nil"/>
+              <w:left w:val="nil"/>
+              <w:bottom w:val="nil"/>
+              <w:right w:val="nil"/>
+            </w:tcBorders>
+          </w:tcPr>
+          <w:p>
+            <w:pPr>
+              <w:rPr>
+                <w:rFonts w:ascii="Times New Roman" w:hAnsi="Times New Roman" w:cs="Times New Roman"/>
+                <w:sz w:val="24"/>
+                <w:szCs w:val="24"/>
+              </w:rPr>
+            </w:pPr>
+            <w:r>
+              <w:rPr>
+                <w:rFonts w:ascii="Times New Roman" w:hAnsi="Times New Roman" w:cs="Times New Roman"/>
+                <w:sz w:val="24"/>
+                <w:szCs w:val="24"/>
+              </w:rPr>
+              <w:t>is_repeated_guest</w:t>
+            </w:r>
+          </w:p>
+        </w:tc>
+        <w:tc>
+          <w:tcPr>
+            <w:tcW w:w="2462" w:type="pct"/>
+            <w:tcBorders>
+              <w:top w:val="nil"/>
+              <w:left w:val="nil"/>
+              <w:bottom w:val="nil"/>
+              <w:right w:val="nil"/>
+            </w:tcBorders>
+          </w:tcPr>
+          <w:p>
+            <w:pPr>
+              <w:rPr>
+                <w:rFonts w:ascii="Times New Roman" w:eastAsia="Times New Roman" w:hAnsi="Times New Roman" w:cs="Times New Roman"/>
+                <w:color w:val="auto"/>
+                <w:sz w:val="24"/>
+                <w:szCs w:val="24"/>
+              </w:rPr>
+            </w:pPr>
+            <w:r>
+              <w:rPr>
+                <w:rFonts w:ascii="Times New Roman" w:hAnsi="Times New Roman" w:cs="Times New Roman"/>
+                <w:sz w:val="24"/>
+                <w:szCs w:val="24"/>
+              </w:rPr>
+              <w:t>Khách có phải khách quen hay không</w:t>
+            </w:r>
+          </w:p>
+        </w:tc>
+        <w:tc>
+          <w:tcPr>
+            <w:tcW w:w="672" w:type="pct"/>
+            <w:tcBorders>
+              <w:top w:val="nil"/>
+              <w:left w:val="nil"/>
+              <w:bottom w:val="nil"/>
+              <w:right w:val="nil"/>
+            </w:tcBorders>
+          </w:tcPr>
+          <w:p>
+            <w:pPr>
+              <w:rPr>
+                <w:rFonts w:ascii="Times New Roman" w:hAnsi="Times New Roman" w:cs="Times New Roman"/>
+                <w:sz w:val="24"/>
+                <w:szCs w:val="24"/>
+              </w:rPr>
+            </w:pPr>
+            <w:r>
+              <w:rPr>
+                <w:rFonts w:ascii="Times New Roman" w:hAnsi="Times New Roman" w:cs="Times New Roman"/>
+                <w:sz w:val="24"/>
+                <w:szCs w:val="24"/>
+              </w:rPr>
+              <w:t>int</w:t>
+            </w:r>
+          </w:p>
+        </w:tc>
+      </w:tr>
+      <w:tr>
+        <w:trPr>
+          <w:trHeight w:val="398"/>
+        </w:trPr>
+        <w:tc>
+          <w:tcPr>
+            <w:tcW w:w="1866" w:type="pct"/>
+            <w:tcBorders>
+              <w:top w:val="nil"/>
+              <w:left w:val="nil"/>
+              <w:bottom w:val="nil"/>
+              <w:right w:val="nil"/>
+            </w:tcBorders>
+          </w:tcPr>
+          <w:p>
+            <w:pPr>
+              <w:rPr>
+                <w:rFonts w:ascii="Times New Roman" w:eastAsia="Times New Roman" w:hAnsi="Times New Roman" w:cs="Times New Roman"/>
+                <w:sz w:val="24"/>
+                <w:szCs w:val="24"/>
+              </w:rPr>
+            </w:pPr>
+            <w:r>
+              <w:rPr>
+                <w:rFonts w:ascii="Times New Roman" w:hAnsi="Times New Roman" w:cs="Times New Roman"/>
+                <w:sz w:val="24"/>
+                <w:szCs w:val="24"/>
+              </w:rPr>
+              <w:t>previous_cancellations</w:t>
+            </w:r>
+          </w:p>
+        </w:tc>
+        <w:tc>
+          <w:tcPr>
+            <w:tcW w:w="2462" w:type="pct"/>
+            <w:tcBorders>
+              <w:top w:val="nil"/>
+              <w:left w:val="nil"/>
+              <w:bottom w:val="nil"/>
+              <w:right w:val="nil"/>
+            </w:tcBorders>
+          </w:tcPr>
+          <w:p>
+            <w:pPr>
+              <w:rPr>
+                <w:rFonts w:ascii="Times New Roman" w:hAnsi="Times New Roman" w:cs="Times New Roman"/>
+                <w:sz w:val="24"/>
+                <w:szCs w:val="24"/>
+              </w:rPr>
+            </w:pPr>
+            <w:r>
+              <w:rPr>
+                <w:rFonts w:ascii="Times New Roman" w:hAnsi="Times New Roman" w:cs="Times New Roman"/>
+                <w:sz w:val="24"/>
+                <w:szCs w:val="24"/>
+              </w:rPr>
+              <w:t>Lịch sử hủy</w:t>
+            </w:r>
+            <w:r>
+              <w:rPr>
+                <w:rFonts w:ascii="Times New Roman" w:hAnsi="Times New Roman" w:cs="Times New Roman"/>
+                <w:sz w:val="24"/>
+                <w:szCs w:val="24"/>
+              </w:rPr>
+              <w:t xml:space="preserve"> trước đó của khách</w:t>
+            </w:r>
+          </w:p>
+        </w:tc>
+        <w:tc>
+          <w:tcPr>
+            <w:tcW w:w="672" w:type="pct"/>
+            <w:tcBorders>
+              <w:top w:val="nil"/>
+              <w:left w:val="nil"/>
+              <w:bottom w:val="nil"/>
+              <w:right w:val="nil"/>
+            </w:tcBorders>
+          </w:tcPr>
+          <w:p>
+            <w:pPr>
+              <w:rPr>
+                <w:rFonts w:ascii="Times New Roman" w:hAnsi="Times New Roman" w:cs="Times New Roman"/>
+                <w:sz w:val="24"/>
+                <w:szCs w:val="24"/>
+              </w:rPr>
+            </w:pPr>
+            <w:r>
+              <w:rPr>
+                <w:rFonts w:ascii="Times New Roman" w:hAnsi="Times New Roman" w:cs="Times New Roman"/>
+                <w:sz w:val="24"/>
+                <w:szCs w:val="24"/>
+              </w:rPr>
+              <w:t>int</w:t>
+            </w:r>
+          </w:p>
+        </w:tc>
+      </w:tr>
+      <w:tr>
+        <w:trPr>
+          <w:trHeight w:val="398"/>
+        </w:trPr>
+        <w:tc>
+          <w:tcPr>
+            <w:tcW w:w="1866" w:type="pct"/>
+            <w:tcBorders>
+              <w:top w:val="nil"/>
+              <w:left w:val="nil"/>
+              <w:bottom w:val="nil"/>
+              <w:right w:val="nil"/>
+            </w:tcBorders>
+          </w:tcPr>
+          <w:p>
+            <w:pPr>
+              <w:rPr>
+                <w:rFonts w:ascii="Times New Roman" w:eastAsia="Times New Roman" w:hAnsi="Times New Roman" w:cs="Times New Roman"/>
+                <w:sz w:val="24"/>
+                <w:szCs w:val="24"/>
+              </w:rPr>
+            </w:pPr>
+            <w:r>
+              <w:rPr>
+                <w:rFonts w:ascii="Times New Roman" w:hAnsi="Times New Roman" w:cs="Times New Roman"/>
+                <w:sz w:val="24"/>
+                <w:szCs w:val="24"/>
+              </w:rPr>
+              <w:t>previous_bookings_not_canceled</w:t>
+            </w:r>
+          </w:p>
+        </w:tc>
+        <w:tc>
+          <w:tcPr>
+            <w:tcW w:w="2462" w:type="pct"/>
+            <w:tcBorders>
+              <w:top w:val="nil"/>
+              <w:left w:val="nil"/>
+              <w:bottom w:val="nil"/>
+              <w:right w:val="nil"/>
+            </w:tcBorders>
+          </w:tcPr>
+          <w:p>
+            <w:pPr>
+              <w:rPr>
+                <w:rFonts w:ascii="Times New Roman" w:hAnsi="Times New Roman" w:cs="Times New Roman"/>
+                <w:sz w:val="24"/>
+                <w:szCs w:val="24"/>
+              </w:rPr>
+            </w:pPr>
+            <w:r>
+              <w:rPr>
+                <w:rFonts w:ascii="Times New Roman" w:hAnsi="Times New Roman" w:cs="Times New Roman"/>
+                <w:sz w:val="24"/>
+                <w:szCs w:val="24"/>
+              </w:rPr>
+              <w:t>Lịch sử hủy trước đó của khách</w:t>
+            </w:r>
+          </w:p>
+        </w:tc>
+        <w:tc>
+          <w:tcPr>
+            <w:tcW w:w="672" w:type="pct"/>
+            <w:tcBorders>
+              <w:top w:val="nil"/>
+              <w:left w:val="nil"/>
+              <w:bottom w:val="nil"/>
+              <w:right w:val="nil"/>
+            </w:tcBorders>
+          </w:tcPr>
+          <w:p>
+            <w:pPr>
+              <w:rPr>
+                <w:rFonts w:ascii="Times New Roman" w:hAnsi="Times New Roman" w:cs="Times New Roman"/>
+                <w:sz w:val="24"/>
+                <w:szCs w:val="24"/>
+              </w:rPr>
+            </w:pPr>
+            <w:r>
+              <w:rPr>
+                <w:rFonts w:ascii="Times New Roman" w:hAnsi="Times New Roman" w:cs="Times New Roman"/>
+                <w:sz w:val="24"/>
+                <w:szCs w:val="24"/>
+              </w:rPr>
+              <w:t>int</w:t>
+            </w:r>
+          </w:p>
+        </w:tc>
+      </w:tr>
+      <w:tr>
+        <w:trPr>
+          <w:trHeight w:val="398"/>
+        </w:trPr>
+        <w:tc>
+          <w:tcPr>
+            <w:tcW w:w="1866" w:type="pct"/>
+            <w:tcBorders>
+              <w:top w:val="nil"/>
+              <w:left w:val="nil"/>
+              <w:bottom w:val="nil"/>
+              <w:right w:val="nil"/>
+            </w:tcBorders>
+          </w:tcPr>
+          <w:p>
+            <w:pPr>
+              <w:rPr>
+                <w:rFonts w:ascii="Times New Roman" w:eastAsia="Times New Roman" w:hAnsi="Times New Roman" w:cs="Times New Roman"/>
+                <w:sz w:val="24"/>
+                <w:szCs w:val="24"/>
+              </w:rPr>
+            </w:pPr>
+            <w:r>
+              <w:rPr>
+                <w:rFonts w:ascii="Times New Roman" w:hAnsi="Times New Roman" w:cs="Times New Roman"/>
+                <w:sz w:val="24"/>
+                <w:szCs w:val="24"/>
+              </w:rPr>
+              <w:t>reserved_room_type</w:t>
+            </w:r>
+          </w:p>
+        </w:tc>
+        <w:tc>
+          <w:tcPr>
+            <w:tcW w:w="2462" w:type="pct"/>
+            <w:tcBorders>
+              <w:top w:val="nil"/>
+              <w:left w:val="nil"/>
+              <w:bottom w:val="nil"/>
+              <w:right w:val="nil"/>
+            </w:tcBorders>
+          </w:tcPr>
+          <w:p>
+            <w:pPr>
+              <w:rPr>
+                <w:rFonts w:ascii="Times New Roman" w:hAnsi="Times New Roman" w:cs="Times New Roman"/>
+                <w:sz w:val="24"/>
+                <w:szCs w:val="24"/>
+              </w:rPr>
+            </w:pPr>
+            <w:r>
+              <w:rPr>
+                <w:rFonts w:ascii="Times New Roman" w:hAnsi="Times New Roman" w:cs="Times New Roman"/>
+                <w:sz w:val="24"/>
+                <w:szCs w:val="24"/>
+              </w:rPr>
+              <w:t>Loại phòng đã đặt</w:t>
+            </w:r>
+          </w:p>
+        </w:tc>
+        <w:tc>
+          <w:tcPr>
+            <w:tcW w:w="672" w:type="pct"/>
+            <w:tcBorders>
+              <w:top w:val="nil"/>
+              <w:left w:val="nil"/>
+              <w:bottom w:val="nil"/>
+              <w:right w:val="nil"/>
+            </w:tcBorders>
+          </w:tcPr>
+          <w:p>
+            <w:pPr>
+              <w:rPr>
+                <w:rFonts w:ascii="Times New Roman" w:hAnsi="Times New Roman" w:cs="Times New Roman"/>
+                <w:sz w:val="24"/>
+                <w:szCs w:val="24"/>
+              </w:rPr>
+            </w:pPr>
+            <w:r>
+              <w:rPr>
+                <w:rFonts w:ascii="Times New Roman" w:hAnsi="Times New Roman" w:cs="Times New Roman"/>
+                <w:sz w:val="24"/>
+                <w:szCs w:val="24"/>
+              </w:rPr>
+              <w:t>string</w:t>
+            </w:r>
+          </w:p>
+        </w:tc>
+      </w:tr>
+      <w:tr>
+        <w:trPr>
+          <w:trHeight w:val="398"/>
+        </w:trPr>
+        <w:tc>
+          <w:tcPr>
+            <w:tcW w:w="1866" w:type="pct"/>
+            <w:tcBorders>
+              <w:top w:val="nil"/>
+              <w:left w:val="nil"/>
+              <w:bottom w:val="nil"/>
+              <w:right w:val="nil"/>
+            </w:tcBorders>
+          </w:tcPr>
+          <w:p>
+            <w:pPr>
+              <w:rPr>
+                <w:rFonts w:ascii="Times New Roman" w:eastAsia="Times New Roman" w:hAnsi="Times New Roman" w:cs="Times New Roman"/>
+                <w:sz w:val="24"/>
+                <w:szCs w:val="24"/>
+              </w:rPr>
+            </w:pPr>
+            <w:r>
+              <w:rPr>
+                <w:rFonts w:ascii="Times New Roman" w:hAnsi="Times New Roman" w:cs="Times New Roman"/>
+                <w:sz w:val="24"/>
+                <w:szCs w:val="24"/>
+              </w:rPr>
+              <w:t>assigned_room_type</w:t>
+            </w:r>
+          </w:p>
+        </w:tc>
+        <w:tc>
+          <w:tcPr>
+            <w:tcW w:w="2462" w:type="pct"/>
+            <w:tcBorders>
+              <w:top w:val="nil"/>
+              <w:left w:val="nil"/>
+              <w:bottom w:val="nil"/>
+              <w:right w:val="nil"/>
+            </w:tcBorders>
+          </w:tcPr>
+          <w:p>
+            <w:pPr>
+              <w:rPr>
+                <w:rFonts w:ascii="Times New Roman" w:hAnsi="Times New Roman" w:cs="Times New Roman"/>
+                <w:sz w:val="24"/>
+                <w:szCs w:val="24"/>
+              </w:rPr>
+            </w:pPr>
+            <w:r>
+              <w:rPr>
+                <w:rFonts w:ascii="Times New Roman" w:hAnsi="Times New Roman" w:cs="Times New Roman"/>
+                <w:sz w:val="24"/>
+                <w:szCs w:val="24"/>
+              </w:rPr>
+              <w:t>Loại phòng được chỉ định</w:t>
+            </w:r>
+          </w:p>
+        </w:tc>
+        <w:tc>
+          <w:tcPr>
+            <w:tcW w:w="672" w:type="pct"/>
+            <w:tcBorders>
+              <w:top w:val="nil"/>
+              <w:left w:val="nil"/>
+              <w:bottom w:val="nil"/>
+              <w:right w:val="nil"/>
+            </w:tcBorders>
+          </w:tcPr>
+          <w:p>
+            <w:pPr>
+              <w:rPr>
+                <w:rFonts w:ascii="Times New Roman" w:hAnsi="Times New Roman" w:cs="Times New Roman"/>
+                <w:sz w:val="24"/>
+                <w:szCs w:val="24"/>
+              </w:rPr>
+            </w:pPr>
+            <w:r>
+              <w:rPr>
+                <w:rFonts w:ascii="Times New Roman" w:hAnsi="Times New Roman" w:cs="Times New Roman"/>
+                <w:sz w:val="24"/>
+                <w:szCs w:val="24"/>
+              </w:rPr>
+              <w:t>string</w:t>
+            </w:r>
+          </w:p>
+        </w:tc>
+      </w:tr>
+      <w:tr>
+        <w:trPr>
+          <w:trHeight w:val="398"/>
+        </w:trPr>
+        <w:tc>
+          <w:tcPr>
+            <w:tcW w:w="1866" w:type="pct"/>
+            <w:tcBorders>
+              <w:top w:val="nil"/>
+              <w:left w:val="nil"/>
+              <w:bottom w:val="nil"/>
+              <w:right w:val="nil"/>
+            </w:tcBorders>
+          </w:tcPr>
+          <w:p>
+            <w:pPr>
+              <w:rPr>
+                <w:rFonts w:ascii="Times New Roman" w:eastAsia="Times New Roman" w:hAnsi="Times New Roman" w:cs="Times New Roman"/>
+                <w:sz w:val="24"/>
+                <w:szCs w:val="24"/>
+              </w:rPr>
+            </w:pPr>
+            <w:r>
+              <w:rPr>
+                <w:rFonts w:ascii="Times New Roman" w:hAnsi="Times New Roman" w:cs="Times New Roman"/>
+                <w:sz w:val="24"/>
+                <w:szCs w:val="24"/>
+              </w:rPr>
+              <w:t>booking_changes</w:t>
+            </w:r>
+          </w:p>
+        </w:tc>
+        <w:tc>
+          <w:tcPr>
+            <w:tcW w:w="2462" w:type="pct"/>
+            <w:tcBorders>
+              <w:top w:val="nil"/>
+              <w:left w:val="nil"/>
+              <w:bottom w:val="nil"/>
+              <w:right w:val="nil"/>
+            </w:tcBorders>
+          </w:tcPr>
+          <w:p>
+            <w:pPr>
+              <w:rPr>
+                <w:rFonts w:ascii="Times New Roman" w:hAnsi="Times New Roman" w:cs="Times New Roman"/>
+                <w:sz w:val="24"/>
+                <w:szCs w:val="24"/>
+              </w:rPr>
+            </w:pPr>
+            <w:r>
+              <w:rPr>
+                <w:rFonts w:ascii="Times New Roman" w:hAnsi="Times New Roman" w:cs="Times New Roman"/>
+                <w:sz w:val="24"/>
+                <w:szCs w:val="24"/>
+              </w:rPr>
+              <w:t>Thay đổi đặt chỗ</w:t>
+            </w:r>
+          </w:p>
+        </w:tc>
+        <w:tc>
+          <w:tcPr>
+            <w:tcW w:w="672" w:type="pct"/>
+            <w:tcBorders>
+              <w:top w:val="nil"/>
+              <w:left w:val="nil"/>
+              <w:bottom w:val="nil"/>
+              <w:right w:val="nil"/>
+            </w:tcBorders>
+          </w:tcPr>
+          <w:p>
+            <w:pPr>
+              <w:rPr>
+                <w:rFonts w:ascii="Times New Roman" w:hAnsi="Times New Roman" w:cs="Times New Roman"/>
+                <w:sz w:val="24"/>
+                <w:szCs w:val="24"/>
+              </w:rPr>
+            </w:pPr>
+            <w:r>
+              <w:rPr>
+                <w:rFonts w:ascii="Times New Roman" w:hAnsi="Times New Roman" w:cs="Times New Roman"/>
+                <w:sz w:val="24"/>
+                <w:szCs w:val="24"/>
+              </w:rPr>
+              <w:t>int</w:t>
+            </w:r>
+          </w:p>
+        </w:tc>
+      </w:tr>
+      <w:tr>
+        <w:trPr>
+          <w:trHeight w:val="398"/>
+        </w:trPr>
+        <w:tc>
+          <w:tcPr>
+            <w:tcW w:w="1866" w:type="pct"/>
+            <w:tcBorders>
+              <w:top w:val="nil"/>
+              <w:left w:val="nil"/>
+              <w:bottom w:val="nil"/>
+              <w:right w:val="nil"/>
+            </w:tcBorders>
+          </w:tcPr>
+          <w:p>
+            <w:pPr>
+              <w:rPr>
+                <w:rFonts w:ascii="Times New Roman" w:hAnsi="Times New Roman" w:cs="Times New Roman"/>
+                <w:sz w:val="24"/>
+                <w:szCs w:val="24"/>
+              </w:rPr>
+            </w:pPr>
+            <w:r>
+              <w:rPr>
+                <w:rFonts w:ascii="Times New Roman" w:hAnsi="Times New Roman" w:cs="Times New Roman"/>
+                <w:sz w:val="24"/>
+                <w:szCs w:val="24"/>
+              </w:rPr>
+              <w:t>deposit_type</w:t>
+            </w:r>
+          </w:p>
+        </w:tc>
+        <w:tc>
+          <w:tcPr>
+            <w:tcW w:w="2462" w:type="pct"/>
+            <w:tcBorders>
+              <w:top w:val="nil"/>
+              <w:left w:val="nil"/>
+              <w:bottom w:val="nil"/>
+              <w:right w:val="nil"/>
+            </w:tcBorders>
+          </w:tcPr>
+          <w:p>
+            <w:pPr>
+              <w:rPr>
+                <w:rFonts w:ascii="Times New Roman" w:hAnsi="Times New Roman" w:cs="Times New Roman"/>
+                <w:sz w:val="24"/>
+                <w:szCs w:val="24"/>
+              </w:rPr>
+            </w:pPr>
+            <w:r>
+              <w:rPr>
+                <w:rFonts w:ascii="Times New Roman" w:hAnsi="Times New Roman" w:cs="Times New Roman"/>
+                <w:sz w:val="24"/>
+                <w:szCs w:val="24"/>
+              </w:rPr>
+              <w:t>Loại đặt cọ</w:t>
+            </w:r>
+            <w:r>
+              <w:rPr>
+                <w:rFonts w:ascii="Times New Roman" w:hAnsi="Times New Roman" w:cs="Times New Roman"/>
+                <w:sz w:val="24"/>
+                <w:szCs w:val="24"/>
+              </w:rPr>
+              <w:t>c</w:t>
+            </w:r>
+          </w:p>
+        </w:tc>
+        <w:tc>
+          <w:tcPr>
+            <w:tcW w:w="672" w:type="pct"/>
+            <w:tcBorders>
+              <w:top w:val="nil"/>
+              <w:left w:val="nil"/>
+              <w:bottom w:val="nil"/>
+              <w:right w:val="nil"/>
+            </w:tcBorders>
+          </w:tcPr>
+          <w:p>
+            <w:pPr>
+              <w:rPr>
+                <w:rFonts w:ascii="Times New Roman" w:hAnsi="Times New Roman" w:cs="Times New Roman"/>
+                <w:sz w:val="24"/>
+                <w:szCs w:val="24"/>
+              </w:rPr>
+            </w:pPr>
+            <w:r>
+              <w:rPr>
+                <w:rFonts w:ascii="Times New Roman" w:hAnsi="Times New Roman" w:cs="Times New Roman"/>
+                <w:sz w:val="24"/>
+                <w:szCs w:val="24"/>
+              </w:rPr>
+              <w:t>string</w:t>
+            </w:r>
+          </w:p>
+        </w:tc>
+      </w:tr>
+      <w:tr>
+        <w:trPr>
+          <w:trHeight w:val="398"/>
+        </w:trPr>
+        <w:tc>
+          <w:tcPr>
+            <w:tcW w:w="1866" w:type="pct"/>
+            <w:tcBorders>
+              <w:top w:val="nil"/>
+              <w:left w:val="nil"/>
+              <w:bottom w:val="nil"/>
+              <w:right w:val="nil"/>
+            </w:tcBorders>
+          </w:tcPr>
+          <w:p>
+            <w:pPr>
+              <w:rPr>
+                <w:rFonts w:ascii="Times New Roman" w:hAnsi="Times New Roman" w:cs="Times New Roman"/>
+                <w:sz w:val="24"/>
+                <w:szCs w:val="24"/>
+              </w:rPr>
+            </w:pPr>
+            <w:r>
+              <w:rPr>
+                <w:rFonts w:ascii="Times New Roman" w:hAnsi="Times New Roman" w:cs="Times New Roman"/>
+                <w:sz w:val="24"/>
+                <w:szCs w:val="24"/>
+              </w:rPr>
+              <w:t>agent</w:t>
+            </w:r>
+          </w:p>
+        </w:tc>
+        <w:tc>
+          <w:tcPr>
+            <w:tcW w:w="2462" w:type="pct"/>
+            <w:tcBorders>
+              <w:top w:val="nil"/>
+              <w:left w:val="nil"/>
+              <w:bottom w:val="nil"/>
+              <w:right w:val="nil"/>
+            </w:tcBorders>
+          </w:tcPr>
+          <w:p>
+            <w:pPr>
+              <w:rPr>
+                <w:rFonts w:ascii="Times New Roman" w:hAnsi="Times New Roman" w:cs="Times New Roman"/>
+                <w:sz w:val="24"/>
+                <w:szCs w:val="24"/>
+              </w:rPr>
+            </w:pPr>
+            <w:r>
+              <w:rPr>
+                <w:rFonts w:ascii="Times New Roman" w:hAnsi="Times New Roman" w:cs="Times New Roman"/>
+                <w:sz w:val="24"/>
+                <w:szCs w:val="24"/>
+              </w:rPr>
+              <w:t>Mã đại lý</w:t>
+            </w:r>
+          </w:p>
+        </w:tc>
+        <w:tc>
+          <w:tcPr>
+            <w:tcW w:w="672" w:type="pct"/>
+            <w:tcBorders>
+              <w:top w:val="nil"/>
+              <w:left w:val="nil"/>
+              <w:bottom w:val="nil"/>
+              <w:right w:val="nil"/>
+            </w:tcBorders>
+          </w:tcPr>
+          <w:p>
+            <w:pPr>
+              <w:rPr>
+                <w:rFonts w:ascii="Times New Roman" w:hAnsi="Times New Roman" w:cs="Times New Roman"/>
+                <w:sz w:val="24"/>
+                <w:szCs w:val="24"/>
+              </w:rPr>
+            </w:pPr>
+            <w:r>
+              <w:rPr>
+                <w:rFonts w:ascii="Times New Roman" w:hAnsi="Times New Roman" w:cs="Times New Roman"/>
+                <w:sz w:val="24"/>
+                <w:szCs w:val="24"/>
+              </w:rPr>
+              <w:t>float</w:t>
+            </w:r>
+          </w:p>
+        </w:tc>
+      </w:tr>
+      <w:tr>
+        <w:trPr>
+          <w:trHeight w:val="398"/>
+        </w:trPr>
+        <w:tc>
+          <w:tcPr>
+            <w:tcW w:w="1866" w:type="pct"/>
+            <w:tcBorders>
+              <w:top w:val="nil"/>
+              <w:left w:val="nil"/>
+              <w:bottom w:val="nil"/>
+              <w:right w:val="nil"/>
+            </w:tcBorders>
+          </w:tcPr>
+          <w:p>
+            <w:pPr>
+              <w:rPr>
+                <w:rFonts w:ascii="Times New Roman" w:hAnsi="Times New Roman" w:cs="Times New Roman"/>
+                <w:sz w:val="24"/>
+                <w:szCs w:val="24"/>
+              </w:rPr>
+            </w:pPr>
+            <w:r>
+              <w:rPr>
+                <w:rFonts w:ascii="Times New Roman" w:hAnsi="Times New Roman" w:cs="Times New Roman"/>
+                <w:sz w:val="24"/>
+                <w:szCs w:val="24"/>
+              </w:rPr>
+              <w:t>company</w:t>
+            </w:r>
+          </w:p>
+        </w:tc>
+        <w:tc>
+          <w:tcPr>
+            <w:tcW w:w="2462" w:type="pct"/>
+            <w:tcBorders>
+              <w:top w:val="nil"/>
+              <w:left w:val="nil"/>
+              <w:bottom w:val="nil"/>
+              <w:right w:val="nil"/>
+            </w:tcBorders>
+          </w:tcPr>
+          <w:p>
+            <w:pPr>
+              <w:rPr>
+                <w:rFonts w:ascii="Times New Roman" w:hAnsi="Times New Roman" w:cs="Times New Roman"/>
+                <w:sz w:val="24"/>
+                <w:szCs w:val="24"/>
+              </w:rPr>
+            </w:pPr>
+            <w:r>
+              <w:rPr>
+                <w:rFonts w:ascii="Times New Roman" w:hAnsi="Times New Roman" w:cs="Times New Roman"/>
+                <w:sz w:val="24"/>
+                <w:szCs w:val="24"/>
+              </w:rPr>
+              <w:t>C</w:t>
+            </w:r>
+            <w:r>
+              <w:rPr>
+                <w:rFonts w:ascii="Times New Roman" w:hAnsi="Times New Roman" w:cs="Times New Roman"/>
+                <w:sz w:val="24"/>
+                <w:szCs w:val="24"/>
+              </w:rPr>
+              <w:t>ông ty trung gian đặt phòng</w:t>
+            </w:r>
+          </w:p>
+        </w:tc>
+        <w:tc>
+          <w:tcPr>
+            <w:tcW w:w="672" w:type="pct"/>
+            <w:tcBorders>
+              <w:top w:val="nil"/>
+              <w:left w:val="nil"/>
+              <w:bottom w:val="nil"/>
+              <w:right w:val="nil"/>
+            </w:tcBorders>
+          </w:tcPr>
+          <w:p>
+            <w:pPr>
+              <w:rPr>
+                <w:rFonts w:ascii="Times New Roman" w:hAnsi="Times New Roman" w:cs="Times New Roman"/>
+                <w:sz w:val="24"/>
+                <w:szCs w:val="24"/>
+              </w:rPr>
+            </w:pPr>
+            <w:r>
+              <w:rPr>
+                <w:rFonts w:ascii="Times New Roman" w:hAnsi="Times New Roman" w:cs="Times New Roman"/>
+                <w:sz w:val="24"/>
+                <w:szCs w:val="24"/>
+              </w:rPr>
+              <w:t>float</w:t>
+            </w:r>
+          </w:p>
+        </w:tc>
+      </w:tr>
+      <w:tr>
+        <w:trPr>
+          <w:trHeight w:val="398"/>
+        </w:trPr>
+        <w:tc>
+          <w:tcPr>
+            <w:tcW w:w="1866" w:type="pct"/>
+            <w:tcBorders>
+              <w:top w:val="nil"/>
+              <w:left w:val="nil"/>
+              <w:bottom w:val="nil"/>
+              <w:right w:val="nil"/>
+            </w:tcBorders>
+          </w:tcPr>
+          <w:p>
+            <w:pPr>
+              <w:rPr>
+                <w:rFonts w:ascii="Times New Roman" w:eastAsia="Times New Roman" w:hAnsi="Times New Roman" w:cs="Times New Roman"/>
+                <w:sz w:val="24"/>
+                <w:szCs w:val="24"/>
+              </w:rPr>
+            </w:pPr>
+            <w:r>
+              <w:rPr>
+                <w:rFonts w:ascii="Times New Roman" w:hAnsi="Times New Roman" w:cs="Times New Roman"/>
+                <w:sz w:val="24"/>
+                <w:szCs w:val="24"/>
+              </w:rPr>
+              <w:t>days_in_waiting_list</w:t>
+            </w:r>
+          </w:p>
+        </w:tc>
+        <w:tc>
+          <w:tcPr>
+            <w:tcW w:w="2462" w:type="pct"/>
+            <w:tcBorders>
+              <w:top w:val="nil"/>
+              <w:left w:val="nil"/>
+              <w:bottom w:val="nil"/>
+              <w:right w:val="nil"/>
+            </w:tcBorders>
+          </w:tcPr>
+          <w:p>
+            <w:pPr>
+              <w:rPr>
+                <w:rFonts w:ascii="Times New Roman" w:hAnsi="Times New Roman" w:cs="Times New Roman"/>
+                <w:sz w:val="24"/>
+                <w:szCs w:val="24"/>
+              </w:rPr>
+            </w:pPr>
+            <w:r>
+              <w:rPr>
+                <w:rFonts w:ascii="Times New Roman" w:hAnsi="Times New Roman" w:cs="Times New Roman"/>
+                <w:sz w:val="24"/>
+                <w:szCs w:val="24"/>
+              </w:rPr>
+              <w:t>Số ngày trong danh sách chờ</w:t>
+            </w:r>
+          </w:p>
+        </w:tc>
+        <w:tc>
+          <w:tcPr>
+            <w:tcW w:w="672" w:type="pct"/>
+            <w:tcBorders>
+              <w:top w:val="nil"/>
+              <w:left w:val="nil"/>
+              <w:bottom w:val="nil"/>
+              <w:right w:val="nil"/>
+            </w:tcBorders>
+          </w:tcPr>
+          <w:p>
+            <w:pPr>
+              <w:rPr>
+                <w:rFonts w:ascii="Times New Roman" w:hAnsi="Times New Roman" w:cs="Times New Roman"/>
+                <w:sz w:val="24"/>
+                <w:szCs w:val="24"/>
+              </w:rPr>
+            </w:pPr>
+            <w:r>
+              <w:rPr>
+                <w:rFonts w:ascii="Times New Roman" w:hAnsi="Times New Roman" w:cs="Times New Roman"/>
+                <w:sz w:val="24"/>
+                <w:szCs w:val="24"/>
+              </w:rPr>
+              <w:t>int</w:t>
+            </w:r>
+          </w:p>
+        </w:tc>
+      </w:tr>
+      <w:tr>
+        <w:trPr>
+          <w:trHeight w:val="398"/>
+        </w:trPr>
+        <w:tc>
+          <w:tcPr>
+            <w:tcW w:w="1866" w:type="pct"/>
+            <w:tcBorders>
+              <w:top w:val="nil"/>
+              <w:left w:val="nil"/>
+              <w:bottom w:val="nil"/>
+              <w:right w:val="nil"/>
+            </w:tcBorders>
+          </w:tcPr>
+          <w:p>
+            <w:pPr>
+              <w:rPr>
+                <w:rFonts w:ascii="Times New Roman" w:hAnsi="Times New Roman" w:cs="Times New Roman"/>
+                <w:sz w:val="24"/>
+                <w:szCs w:val="24"/>
+              </w:rPr>
+            </w:pPr>
+            <w:r>
+              <w:rPr>
+                <w:rFonts w:ascii="Times New Roman" w:hAnsi="Times New Roman" w:cs="Times New Roman"/>
+                <w:sz w:val="24"/>
+                <w:szCs w:val="24"/>
+              </w:rPr>
+              <w:t>customer_type</w:t>
+            </w:r>
+          </w:p>
+        </w:tc>
+        <w:tc>
+          <w:tcPr>
+            <w:tcW w:w="2462" w:type="pct"/>
+            <w:tcBorders>
+              <w:top w:val="nil"/>
+              <w:left w:val="nil"/>
+              <w:bottom w:val="nil"/>
+              <w:right w:val="nil"/>
+            </w:tcBorders>
+          </w:tcPr>
+          <w:p>
+            <w:pPr>
+              <w:rPr>
+                <w:rFonts w:ascii="Times New Roman" w:hAnsi="Times New Roman" w:cs="Times New Roman"/>
+                <w:sz w:val="24"/>
+                <w:szCs w:val="24"/>
+              </w:rPr>
+            </w:pPr>
+            <w:r>
+              <w:rPr>
+                <w:rFonts w:ascii="Times New Roman" w:hAnsi="Times New Roman" w:cs="Times New Roman"/>
+                <w:sz w:val="24"/>
+                <w:szCs w:val="24"/>
+              </w:rPr>
+              <w:t>Loại khách hàng</w:t>
+            </w:r>
+          </w:p>
+        </w:tc>
+        <w:tc>
+          <w:tcPr>
+            <w:tcW w:w="672" w:type="pct"/>
+            <w:tcBorders>
+              <w:top w:val="nil"/>
+              <w:left w:val="nil"/>
+              <w:bottom w:val="nil"/>
+              <w:right w:val="nil"/>
+            </w:tcBorders>
+          </w:tcPr>
+          <w:p>
+            <w:pPr>
+              <w:rPr>
+                <w:rFonts w:ascii="Times New Roman" w:hAnsi="Times New Roman" w:cs="Times New Roman"/>
+                <w:sz w:val="24"/>
+                <w:szCs w:val="24"/>
+              </w:rPr>
+            </w:pPr>
+            <w:r>
+              <w:rPr>
+                <w:rFonts w:ascii="Times New Roman" w:hAnsi="Times New Roman" w:cs="Times New Roman"/>
+                <w:sz w:val="24"/>
+                <w:szCs w:val="24"/>
+              </w:rPr>
+              <w:t>string</w:t>
+            </w:r>
+          </w:p>
+        </w:tc>
+      </w:tr>
+      <w:tr>
+        <w:trPr>
+          <w:trHeight w:val="398"/>
+        </w:trPr>
+        <w:tc>
+          <w:tcPr>
+            <w:tcW w:w="1866" w:type="pct"/>
+            <w:tcBorders>
+              <w:top w:val="nil"/>
+              <w:left w:val="nil"/>
+              <w:bottom w:val="nil"/>
+              <w:right w:val="nil"/>
+            </w:tcBorders>
+          </w:tcPr>
+          <w:p>
+            <w:pPr>
+              <w:rPr>
+                <w:rFonts w:ascii="Times New Roman" w:hAnsi="Times New Roman" w:cs="Times New Roman"/>
+                <w:sz w:val="24"/>
+                <w:szCs w:val="24"/>
+              </w:rPr>
+            </w:pPr>
+            <w:r>
+              <w:rPr>
+                <w:rFonts w:ascii="Times New Roman" w:hAnsi="Times New Roman" w:cs="Times New Roman"/>
+                <w:sz w:val="24"/>
+                <w:szCs w:val="24"/>
+              </w:rPr>
+              <w:t>adr</w:t>
+            </w:r>
+          </w:p>
+        </w:tc>
+        <w:tc>
+          <w:tcPr>
+            <w:tcW w:w="2462" w:type="pct"/>
+            <w:tcBorders>
+              <w:top w:val="nil"/>
+              <w:left w:val="nil"/>
+              <w:bottom w:val="nil"/>
+              <w:right w:val="nil"/>
+            </w:tcBorders>
+          </w:tcPr>
+          <w:p>
+            <w:pPr>
+              <w:rPr>
+                <w:rFonts w:ascii="Times New Roman" w:hAnsi="Times New Roman" w:cs="Times New Roman"/>
+                <w:sz w:val="24"/>
+                <w:szCs w:val="24"/>
+              </w:rPr>
+            </w:pPr>
+            <w:r>
+              <w:rPr>
+                <w:rFonts w:ascii="Times New Roman" w:hAnsi="Times New Roman" w:cs="Times New Roman"/>
+                <w:sz w:val="24"/>
+                <w:szCs w:val="24"/>
+              </w:rPr>
+              <w:t>G</w:t>
+            </w:r>
+            <w:r>
+              <w:rPr>
+                <w:rFonts w:ascii="Times New Roman" w:hAnsi="Times New Roman" w:cs="Times New Roman"/>
+                <w:sz w:val="24"/>
+                <w:szCs w:val="24"/>
+              </w:rPr>
+              <w:t>iá phòng trung bình/đêm</w:t>
+            </w:r>
+          </w:p>
+        </w:tc>
+        <w:tc>
+          <w:tcPr>
+            <w:tcW w:w="672" w:type="pct"/>
+            <w:tcBorders>
+              <w:top w:val="nil"/>
+              <w:left w:val="nil"/>
+              <w:bottom w:val="nil"/>
+              <w:right w:val="nil"/>
+            </w:tcBorders>
+          </w:tcPr>
+          <w:p>
+            <w:pPr>
+              <w:rPr>
+                <w:rFonts w:ascii="Times New Roman" w:hAnsi="Times New Roman" w:cs="Times New Roman"/>
+                <w:sz w:val="24"/>
+                <w:szCs w:val="24"/>
+              </w:rPr>
+            </w:pPr>
+            <w:r>
+              <w:rPr>
+                <w:rFonts w:ascii="Times New Roman" w:hAnsi="Times New Roman" w:cs="Times New Roman"/>
+                <w:sz w:val="24"/>
+                <w:szCs w:val="24"/>
+              </w:rPr>
+              <w:t>float</w:t>
+            </w:r>
+          </w:p>
+        </w:tc>
+      </w:tr>
+      <w:tr>
+        <w:trPr>
+          <w:trHeight w:val="398"/>
+        </w:trPr>
+        <w:tc>
+          <w:tcPr>
+            <w:tcW w:w="1866" w:type="pct"/>
+            <w:tcBorders>
+              <w:top w:val="nil"/>
+              <w:left w:val="nil"/>
+              <w:bottom w:val="nil"/>
+              <w:right w:val="nil"/>
+            </w:tcBorders>
+          </w:tcPr>
+          <w:p>
+            <w:pPr>
+              <w:rPr>
+                <w:rFonts w:ascii="Times New Roman" w:eastAsia="Times New Roman" w:hAnsi="Times New Roman" w:cs="Times New Roman"/>
+                <w:sz w:val="24"/>
+                <w:szCs w:val="24"/>
+              </w:rPr>
+            </w:pPr>
+            <w:r>
+              <w:rPr>
+                <w:rFonts w:ascii="Times New Roman" w:hAnsi="Times New Roman" w:cs="Times New Roman"/>
+                <w:sz w:val="24"/>
+                <w:szCs w:val="24"/>
+              </w:rPr>
+              <w:t>required_car_parking_spaces</w:t>
+            </w:r>
+          </w:p>
+        </w:tc>
+        <w:tc>
+          <w:tcPr>
+            <w:tcW w:w="2462" w:type="pct"/>
+            <w:tcBorders>
+              <w:top w:val="nil"/>
+              <w:left w:val="nil"/>
+              <w:bottom w:val="nil"/>
+              <w:right w:val="nil"/>
+            </w:tcBorders>
+          </w:tcPr>
+          <w:p>
+            <w:pPr>
+              <w:rPr>
+                <w:rFonts w:ascii="Times New Roman" w:hAnsi="Times New Roman" w:cs="Times New Roman"/>
+                <w:sz w:val="24"/>
+                <w:szCs w:val="24"/>
+              </w:rPr>
+            </w:pPr>
+            <w:r>
+              <w:rPr>
+                <w:rFonts w:ascii="Times New Roman" w:hAnsi="Times New Roman" w:cs="Times New Roman"/>
+                <w:sz w:val="24"/>
+                <w:szCs w:val="24"/>
+              </w:rPr>
+              <w:t>Số chỗ đậu xe bắt buộc</w:t>
+            </w:r>
+          </w:p>
+        </w:tc>
+        <w:tc>
+          <w:tcPr>
+            <w:tcW w:w="672" w:type="pct"/>
+            <w:tcBorders>
+              <w:top w:val="nil"/>
+              <w:left w:val="nil"/>
+              <w:bottom w:val="nil"/>
+              <w:right w:val="nil"/>
+            </w:tcBorders>
+          </w:tcPr>
+          <w:p>
+            <w:pPr>
+              <w:rPr>
+                <w:rFonts w:ascii="Times New Roman" w:hAnsi="Times New Roman" w:cs="Times New Roman"/>
+                <w:sz w:val="24"/>
+                <w:szCs w:val="24"/>
+              </w:rPr>
+            </w:pPr>
+            <w:r>
+              <w:rPr>
+                <w:rFonts w:ascii="Times New Roman" w:hAnsi="Times New Roman" w:cs="Times New Roman"/>
+                <w:sz w:val="24"/>
+                <w:szCs w:val="24"/>
+              </w:rPr>
+              <w:t>int</w:t>
+            </w:r>
+          </w:p>
+        </w:tc>
+      </w:tr>
+      <w:tr>
+        <w:trPr>
+          <w:trHeight w:val="398"/>
+        </w:trPr>
+        <w:tc>
+          <w:tcPr>
+            <w:tcW w:w="1866" w:type="pct"/>
+            <w:tcBorders>
+              <w:top w:val="nil"/>
+              <w:left w:val="nil"/>
+              <w:bottom w:val="nil"/>
+              <w:right w:val="nil"/>
+            </w:tcBorders>
+          </w:tcPr>
+          <w:p>
+            <w:pPr>
+              <w:rPr>
+                <w:rFonts w:ascii="Times New Roman" w:eastAsia="Times New Roman" w:hAnsi="Times New Roman" w:cs="Times New Roman"/>
+                <w:sz w:val="24"/>
+                <w:szCs w:val="24"/>
+              </w:rPr>
+            </w:pPr>
+            <w:r>
+              <w:rPr>
+                <w:rFonts w:ascii="Times New Roman" w:hAnsi="Times New Roman" w:cs="Times New Roman"/>
+                <w:sz w:val="24"/>
+                <w:szCs w:val="24"/>
+              </w:rPr>
+              <w:t>total_of_special_requests</w:t>
+            </w:r>
+          </w:p>
+        </w:tc>
+        <w:tc>
+          <w:tcPr>
+            <w:tcW w:w="2462" w:type="pct"/>
+            <w:tcBorders>
+              <w:top w:val="nil"/>
+              <w:left w:val="nil"/>
+              <w:bottom w:val="nil"/>
+              <w:right w:val="nil"/>
+            </w:tcBorders>
+          </w:tcPr>
+          <w:p>
+            <w:pPr>
+              <w:rPr>
+                <w:rFonts w:ascii="Times New Roman" w:hAnsi="Times New Roman" w:cs="Times New Roman"/>
+                <w:sz w:val="24"/>
+                <w:szCs w:val="24"/>
+              </w:rPr>
+            </w:pPr>
+            <w:r>
+              <w:rPr>
+                <w:rFonts w:ascii="Times New Roman" w:hAnsi="Times New Roman" w:cs="Times New Roman"/>
+                <w:sz w:val="24"/>
+                <w:szCs w:val="24"/>
+              </w:rPr>
+              <w:t>Tổng số yêu cầu đặc biệt</w:t>
+            </w:r>
+          </w:p>
+        </w:tc>
+        <w:tc>
+          <w:tcPr>
+            <w:tcW w:w="672" w:type="pct"/>
+            <w:tcBorders>
+              <w:top w:val="nil"/>
+              <w:left w:val="nil"/>
+              <w:bottom w:val="nil"/>
+              <w:right w:val="nil"/>
+            </w:tcBorders>
+          </w:tcPr>
+          <w:p>
+            <w:pPr>
+              <w:rPr>
+                <w:rFonts w:ascii="Times New Roman" w:hAnsi="Times New Roman" w:cs="Times New Roman"/>
+                <w:sz w:val="24"/>
+                <w:szCs w:val="24"/>
+              </w:rPr>
+            </w:pPr>
+            <w:r>
+              <w:rPr>
+                <w:rFonts w:ascii="Times New Roman" w:hAnsi="Times New Roman" w:cs="Times New Roman"/>
+                <w:sz w:val="24"/>
+                <w:szCs w:val="24"/>
+              </w:rPr>
+              <w:t>int</w:t>
+            </w:r>
+          </w:p>
+        </w:tc>
+      </w:tr>
+      <w:tr>
+        <w:trPr>
+          <w:trHeight w:val="398"/>
+        </w:trPr>
+        <w:tc>
+          <w:tcPr>
+            <w:tcW w:w="1866" w:type="pct"/>
+            <w:tcBorders>
+              <w:top w:val="nil"/>
+              <w:left w:val="nil"/>
+              <w:bottom w:val="nil"/>
+              <w:right w:val="nil"/>
+            </w:tcBorders>
+          </w:tcPr>
+          <w:p>
+            <w:pPr>
+              <w:rPr>
+                <w:rFonts w:ascii="Times New Roman" w:hAnsi="Times New Roman" w:cs="Times New Roman"/>
+                <w:sz w:val="24"/>
+                <w:szCs w:val="24"/>
+              </w:rPr>
+            </w:pPr>
+            <w:r>
+              <w:rPr>
+                <w:rFonts w:ascii="Times New Roman" w:hAnsi="Times New Roman" w:cs="Times New Roman"/>
+                <w:sz w:val="24"/>
+                <w:szCs w:val="24"/>
+              </w:rPr>
+              <w:lastRenderedPageBreak/>
+              <w:t>reservation_status</w:t>
+            </w:r>
+          </w:p>
+        </w:tc>
+        <w:tc>
+          <w:tcPr>
+            <w:tcW w:w="2462" w:type="pct"/>
+            <w:tcBorders>
+              <w:top w:val="nil"/>
+              <w:left w:val="nil"/>
+              <w:bottom w:val="nil"/>
+              <w:right w:val="nil"/>
+            </w:tcBorders>
+          </w:tcPr>
+          <w:p>
+            <w:pPr>
+              <w:rPr>
+                <w:rFonts w:ascii="Times New Roman" w:hAnsi="Times New Roman" w:cs="Times New Roman"/>
+                <w:sz w:val="24"/>
+                <w:szCs w:val="24"/>
+              </w:rPr>
+            </w:pPr>
+            <w:r>
+              <w:rPr>
+                <w:rFonts w:ascii="Times New Roman" w:hAnsi="Times New Roman" w:cs="Times New Roman"/>
+                <w:sz w:val="24"/>
+                <w:szCs w:val="24"/>
+              </w:rPr>
+              <w:t>Trạng thái đặt chỗ</w:t>
+            </w:r>
+          </w:p>
+        </w:tc>
+        <w:tc>
+          <w:tcPr>
+            <w:tcW w:w="672" w:type="pct"/>
+            <w:tcBorders>
+              <w:top w:val="nil"/>
+              <w:left w:val="nil"/>
+              <w:bottom w:val="nil"/>
+              <w:right w:val="nil"/>
+            </w:tcBorders>
+          </w:tcPr>
+          <w:p>
+            <w:pPr>
+              <w:rPr>
+                <w:rFonts w:ascii="Times New Roman" w:hAnsi="Times New Roman" w:cs="Times New Roman"/>
+                <w:sz w:val="24"/>
+                <w:szCs w:val="24"/>
+              </w:rPr>
+            </w:pPr>
+            <w:r>
+              <w:rPr>
+                <w:rFonts w:ascii="Times New Roman" w:hAnsi="Times New Roman" w:cs="Times New Roman"/>
+                <w:sz w:val="24"/>
+                <w:szCs w:val="24"/>
+              </w:rPr>
+              <w:t>string</w:t>
+            </w:r>
+          </w:p>
+        </w:tc>
+      </w:tr>
+      <w:tr>
+        <w:trPr>
+          <w:trHeight w:val="398"/>
+        </w:trPr>
+        <w:tc>
+          <w:tcPr>
+            <w:tcW w:w="1866" w:type="pct"/>
+            <w:tcBorders>
+              <w:top w:val="nil"/>
+              <w:left w:val="nil"/>
+              <w:bottom w:val="single" w:sz="8" w:space="0" w:color="000000"/>
+              <w:right w:val="nil"/>
+            </w:tcBorders>
+          </w:tcPr>
+          <w:p>
+            <w:pPr>
+              <w:rPr>
+                <w:rFonts w:ascii="Times New Roman" w:hAnsi="Times New Roman" w:cs="Times New Roman"/>
+                <w:sz w:val="24"/>
+                <w:szCs w:val="24"/>
+              </w:rPr>
+            </w:pPr>
+            <w:r>
+              <w:rPr>
+                <w:rFonts w:ascii="Times New Roman" w:hAnsi="Times New Roman" w:cs="Times New Roman"/>
+                <w:sz w:val="24"/>
+                <w:szCs w:val="24"/>
+              </w:rPr>
+              <w:t>reservation_status_date</w:t>
+            </w:r>
+          </w:p>
+        </w:tc>
+        <w:tc>
+          <w:tcPr>
+            <w:tcW w:w="2462" w:type="pct"/>
+            <w:tcBorders>
+              <w:top w:val="nil"/>
+              <w:left w:val="nil"/>
+              <w:bottom w:val="single" w:sz="8" w:space="0" w:color="000000"/>
+              <w:right w:val="nil"/>
+            </w:tcBorders>
+          </w:tcPr>
+          <w:p>
+            <w:pPr>
+              <w:rPr>
+                <w:rFonts w:ascii="Times New Roman" w:hAnsi="Times New Roman" w:cs="Times New Roman"/>
+                <w:sz w:val="24"/>
+                <w:szCs w:val="24"/>
+              </w:rPr>
+            </w:pPr>
+            <w:r>
+              <w:rPr>
+                <w:rFonts w:ascii="Times New Roman" w:hAnsi="Times New Roman" w:cs="Times New Roman"/>
+                <w:sz w:val="24"/>
+                <w:szCs w:val="24"/>
+              </w:rPr>
+              <w:t>N</w:t>
+            </w:r>
+            <w:r>
+              <w:rPr>
+                <w:rFonts w:ascii="Times New Roman" w:hAnsi="Times New Roman" w:cs="Times New Roman"/>
+                <w:sz w:val="24"/>
+                <w:szCs w:val="24"/>
+              </w:rPr>
+              <w:t>gày cập nhật cuối của đơn</w:t>
+            </w:r>
+          </w:p>
+        </w:tc>
+        <w:tc>
+          <w:tcPr>
+            <w:tcW w:w="672" w:type="pct"/>
+            <w:tcBorders>
+              <w:top w:val="nil"/>
+              <w:left w:val="nil"/>
+              <w:bottom w:val="single" w:sz="8" w:space="0" w:color="000000"/>
+              <w:right w:val="nil"/>
+            </w:tcBorders>
+          </w:tcPr>
+          <w:p>
+            <w:pPr>
+              <w:rPr>
+                <w:rFonts w:ascii="Times New Roman" w:hAnsi="Times New Roman" w:cs="Times New Roman"/>
+                <w:sz w:val="24"/>
+                <w:szCs w:val="24"/>
+              </w:rPr>
+            </w:pPr>
+            <w:r>
+              <w:rPr>
+                <w:rFonts w:ascii="Times New Roman" w:hAnsi="Times New Roman" w:cs="Times New Roman"/>
+                <w:sz w:val="24"/>
+                <w:szCs w:val="24"/>
+              </w:rPr>
+              <w:t>string</w:t>
+            </w:r>
+          </w:p>
+        </w:tc>
+      </w:tr>
+    </w:tbl>
+    <w:p>
+      <w:pPr>
+        <w:spacing w:after="475" w:line="336" w:lineRule="auto"/>
+        <w:ind w:left="628" w:right="1060" w:hanging="5"/>
+        <w:jc w:val="center"/>
+        <w:rPr>
+          <w:rFonts w:ascii="Times New Roman" w:eastAsia="Times New Roman" w:hAnsi="Times New Roman" w:cs="Times New Roman"/>
+          <w:i/>
+          <w:sz w:val="24"/>
+        </w:rPr>
+      </w:pPr>
+      <w:r>
+        <w:rPr>
+          <w:rFonts w:ascii="Times New Roman" w:eastAsia="Times New Roman" w:hAnsi="Times New Roman" w:cs="Times New Roman"/>
+          <w:i/>
+          <w:sz w:val="24"/>
+        </w:rPr>
+        <w:t>Bảng 3.2. Data dictionary rút gọn — các trường quan trọng nhất</w:t>
+      </w:r>
+      <w:r>
+        <w:rPr>
+          <w:rFonts w:ascii="Times New Roman" w:eastAsia="Times New Roman" w:hAnsi="Times New Roman" w:cs="Times New Roman"/>
+          <w:i/>
+          <w:sz w:val="24"/>
+        </w:rPr>
+        <w:t>.</w:t>
+      </w:r>
+    </w:p>
+    <w:p>
+      <w:pPr>
         <w:pStyle w:val="Heading2"/>
         <w:ind w:left="35" w:right="0"/>
       </w:pPr>
-      <w:bookmarkStart w:id="20" w:name="_Toc20844"/>
+      <w:bookmarkStart w:id="19" w:name="_Toc20844"/>
       <w:r>
         <w:t>3.2 Phân tích khám phá (tối thiểu 4 biểu đồ)</w:t>
       </w:r>
+      <w:bookmarkEnd w:id="19"/>
+    </w:p>
+    <w:p>
+      <w:pPr>
+        <w:spacing w:after="260"/>
+        <w:ind w:left="628" w:right="1060" w:hanging="5"/>
+        <w:jc w:val="both"/>
+        <w:rPr>
+          <w:rFonts w:ascii="Times New Roman" w:eastAsia="Times New Roman" w:hAnsi="Times New Roman" w:cs="Times New Roman"/>
+          <w:i/>
+          <w:sz w:val="24"/>
+        </w:rPr>
+      </w:pPr>
+      <w:r>
+        <w:rPr>
+          <w:rFonts w:ascii="Times New Roman" w:eastAsia="Times New Roman" w:hAnsi="Times New Roman" w:cs="Times New Roman"/>
+          <w:i/>
+          <w:sz w:val="24"/>
+        </w:rPr>
+        <w:t>Gợi ý: mỗi biểu đồ phải có CHÚ THÍCH và NHẬN XÉT, không chỉ dán hình.</w:t>
+      </w:r>
+    </w:p>
+    <w:p>
+      <w:pPr>
+        <w:spacing w:after="103" w:line="265" w:lineRule="auto"/>
+        <w:ind w:left="622" w:right="548"/>
+        <w:rPr>
+          <w:rFonts w:ascii="Times New Roman" w:hAnsi="Times New Roman" w:cs="Times New Roman"/>
+          <w:sz w:val="24"/>
+          <w:szCs w:val="24"/>
+        </w:rPr>
+      </w:pPr>
+      <w:r>
+        <w:rPr>
+          <w:rFonts w:ascii="Times New Roman" w:hAnsi="Times New Roman" w:cs="Times New Roman"/>
+          <w:sz w:val="24"/>
+          <w:szCs w:val="24"/>
+        </w:rPr>
+        <w:t>3.2.1 Phân bố biến mục tiêu và mất cân bằng lớp</w:t>
+      </w:r>
+    </w:p>
+    <w:p>
+      <w:pPr>
+        <w:spacing w:after="260"/>
+        <w:ind w:left="628" w:right="1060" w:hanging="5"/>
+        <w:jc w:val="both"/>
+      </w:pPr>
+      <w:r>
+        <w:rPr>
+          <w:noProof/>
+        </w:rPr>
+        <w:drawing>
+          <wp:inline distT="0" distB="0" distL="0" distR="0" wp14:anchorId="7C6C46E3" wp14:editId="4C48A611">
+            <wp:extent cx="5428800" cy="2217600"/>
+            <wp:effectExtent l="0" t="0" r="635" b="0"/>
+            <wp:docPr id="1" name="Picture 1"/>
+            <wp:cNvGraphicFramePr/>
+            <a:graphic xmlns:a="http://schemas.openxmlformats.org/drawingml/2006/main">
+              <a:graphicData uri="http://schemas.openxmlformats.org/drawingml/2006/picture">
+                <pic:pic xmlns:pic="http://schemas.openxmlformats.org/drawingml/2006/picture">
+                  <pic:nvPicPr>
+                    <pic:cNvPr id="1" name="Picture 1"/>
+                    <pic:cNvPicPr/>
+                  </pic:nvPicPr>
+                  <pic:blipFill>
+                    <a:blip r:embed="rId8"/>
+                    <a:srcRect/>
+                    <a:stretch>
+                      <a:fillRect/>
+                    </a:stretch>
+                  </pic:blipFill>
+                  <pic:spPr bwMode="auto">
+                    <a:xfrm>
+                      <a:off x="0" y="0"/>
+                      <a:ext cx="5428800" cy="2217600"/>
+                    </a:xfrm>
+                    <a:prstGeom prst="rect">
+                      <a:avLst/>
+                    </a:prstGeom>
+                  </pic:spPr>
+                </pic:pic>
+              </a:graphicData>
+            </a:graphic>
+          </wp:inline>
+        </w:drawing>
+      </w:r>
+    </w:p>
+    <w:p>
+      <w:pPr>
+        <w:spacing w:after="260"/>
+        <w:ind w:left="628" w:right="1060" w:hanging="5"/>
+        <w:jc w:val="center"/>
+      </w:pPr>
+      <w:r>
+        <w:rPr>
+          <w:rFonts w:ascii="Times New Roman" w:hAnsi="Times New Roman" w:cs="Times New Roman"/>
+          <w:i/>
+          <w:iCs/>
+          <w:sz w:val="24"/>
+          <w:szCs w:val="24"/>
+        </w:rPr>
+        <w:t>Hình 3.1. Phân bố biến mục tiêu is_canceled</w:t>
+      </w:r>
+    </w:p>
+    <w:p>
+      <w:pPr>
+        <w:spacing w:after="103" w:line="265" w:lineRule="auto"/>
+        <w:ind w:left="622" w:right="548"/>
+        <w:rPr>
+          <w:rFonts w:ascii="Times New Roman" w:hAnsi="Times New Roman" w:cs="Times New Roman"/>
+          <w:sz w:val="24"/>
+          <w:szCs w:val="24"/>
+        </w:rPr>
+      </w:pPr>
+      <w:r>
+        <w:rPr>
+          <w:rFonts w:ascii="Times New Roman" w:eastAsia="Times New Roman" w:hAnsi="Times New Roman" w:cs="Times New Roman"/>
+          <w:sz w:val="24"/>
+          <w:szCs w:val="24"/>
+        </w:rPr>
+        <w:t xml:space="preserve">- Hình 3.1 cho ta thấy trong tổng số </w:t>
+      </w:r>
+      <w:r>
+        <w:rPr>
+          <w:rFonts w:ascii="Times New Roman" w:hAnsi="Times New Roman" w:cs="Times New Roman"/>
+          <w:sz w:val="24"/>
+          <w:szCs w:val="24"/>
+        </w:rPr>
+        <w:t xml:space="preserve">119.390 đơn đặt phòng có 75.166 đơn không bị hủy </w:t>
+      </w:r>
+      <w:r>
+        <w:rPr>
+          <w:rFonts w:ascii="Times New Roman" w:hAnsi="Times New Roman" w:cs="Times New Roman"/>
+          <w:sz w:val="24"/>
+          <w:szCs w:val="24"/>
+        </w:rPr>
+        <w:t xml:space="preserve"> </w:t>
+      </w:r>
+      <w:r>
+        <w:rPr>
+          <w:rFonts w:ascii="Times New Roman" w:hAnsi="Times New Roman" w:cs="Times New Roman"/>
+          <w:sz w:val="24"/>
+          <w:szCs w:val="24"/>
+        </w:rPr>
+        <w:t>(62,96%) và 44.224 đơn bị hủy (37,04%).</w:t>
+      </w:r>
+      <w:r>
+        <w:rPr>
+          <w:rFonts w:ascii="Times New Roman" w:hAnsi="Times New Roman" w:cs="Times New Roman"/>
+          <w:sz w:val="24"/>
+          <w:szCs w:val="24"/>
+        </w:rPr>
+        <w:t xml:space="preserve"> Đây là sự mất cân bằng vừa phải</w:t>
+      </w:r>
+      <w:r>
+        <w:rPr>
+          <w:rFonts w:ascii="Times New Roman" w:hAnsi="Times New Roman" w:cs="Times New Roman"/>
+          <w:sz w:val="24"/>
+          <w:szCs w:val="24"/>
+        </w:rPr>
+        <w:t xml:space="preserve"> không quá</w:t>
+      </w:r>
+      <w:r>
+        <w:rPr>
+          <w:rFonts w:ascii="Times New Roman" w:hAnsi="Times New Roman" w:cs="Times New Roman"/>
+          <w:sz w:val="24"/>
+          <w:szCs w:val="24"/>
+        </w:rPr>
+        <w:t xml:space="preserve"> ngiêm trọng nên vẫn có thể huấn luyện mô hình</w:t>
+      </w:r>
+      <w:r>
+        <w:rPr>
+          <w:rFonts w:ascii="Times New Roman" w:hAnsi="Times New Roman" w:cs="Times New Roman"/>
+          <w:sz w:val="24"/>
+          <w:szCs w:val="24"/>
+        </w:rPr>
+        <w:t xml:space="preserve"> nhưng cần</w:t>
+      </w:r>
+      <w:r>
+        <w:rPr>
+          <w:rFonts w:ascii="Times New Roman" w:hAnsi="Times New Roman" w:cs="Times New Roman"/>
+          <w:sz w:val="24"/>
+          <w:szCs w:val="24"/>
+        </w:rPr>
+        <w:t xml:space="preserve"> cân nhắc class_weight khi cần tối ưu Recall/F1 cho lớp thiểu số.</w:t>
+      </w:r>
+      <w:r>
+        <w:rPr>
+          <w:rFonts w:ascii="Times New Roman" w:hAnsi="Times New Roman" w:cs="Times New Roman"/>
+          <w:sz w:val="24"/>
+          <w:szCs w:val="24"/>
+        </w:rPr>
+        <w:t xml:space="preserve"> Lưu ý tỷ lệ </w:t>
+      </w:r>
+      <w:r>
+        <w:rPr>
+          <w:rFonts w:ascii="Times New Roman" w:hAnsi="Times New Roman" w:cs="Times New Roman"/>
+          <w:sz w:val="24"/>
+          <w:szCs w:val="24"/>
+        </w:rPr>
+        <w:t xml:space="preserve">City Hotel cao hơn so với Resort Hotel, </w:t>
+      </w:r>
+      <w:r>
+        <w:rPr>
+          <w:rFonts w:ascii="Times New Roman" w:hAnsi="Times New Roman" w:cs="Times New Roman"/>
+          <w:sz w:val="24"/>
+          <w:szCs w:val="24"/>
+        </w:rPr>
+        <w:t xml:space="preserve">cần </w:t>
+      </w:r>
+      <w:r>
+        <w:rPr>
+          <w:rFonts w:ascii="Times New Roman" w:hAnsi="Times New Roman" w:cs="Times New Roman"/>
+          <w:sz w:val="24"/>
+          <w:szCs w:val="24"/>
+        </w:rPr>
+        <w:t>gợi ý loại khách sạn là một đặc trưng có giá trị phân biệt.</w:t>
+      </w:r>
+      <w:bookmarkStart w:id="20" w:name="_GoBack"/>
       <w:bookmarkEnd w:id="20"/>
     </w:p>
     <w:p>
       <w:pPr>
+        <w:spacing w:after="103" w:line="265" w:lineRule="auto"/>
+        <w:ind w:left="622" w:right="548"/>
+        <w:rPr>
+          <w:rFonts w:ascii="Times New Roman" w:hAnsi="Times New Roman" w:cs="Times New Roman"/>
+          <w:sz w:val="24"/>
+          <w:szCs w:val="24"/>
+        </w:rPr>
+      </w:pPr>
+      <w:r>
+        <w:rPr>
+          <w:rFonts w:ascii="Times New Roman" w:hAnsi="Times New Roman" w:cs="Times New Roman"/>
+          <w:sz w:val="24"/>
+          <w:szCs w:val="24"/>
+        </w:rPr>
+        <w:t>3.2.2 Phân bố đặc trưng số và phát hiện ngoại lai</w:t>
+      </w:r>
+    </w:p>
+    <w:p>
+      <w:pPr>
+        <w:spacing w:after="103" w:line="265" w:lineRule="auto"/>
+        <w:ind w:left="622" w:right="548"/>
+      </w:pPr>
+      <w:r>
+        <w:rPr>
+          <w:noProof/>
+        </w:rPr>
+        <w:lastRenderedPageBreak/>
+        <w:drawing>
+          <wp:inline distT="0" distB="0" distL="0" distR="0" wp14:anchorId="0A604882" wp14:editId="1844A70F">
+            <wp:extent cx="5832000" cy="2217600"/>
+            <wp:effectExtent l="0" t="0" r="0" b="0"/>
+            <wp:docPr id="2" name="Picture 2"/>
+            <wp:cNvGraphicFramePr/>
+            <a:graphic xmlns:a="http://schemas.openxmlformats.org/drawingml/2006/main">
+              <a:graphicData uri="http://schemas.openxmlformats.org/drawingml/2006/picture">
+                <pic:pic xmlns:pic="http://schemas.openxmlformats.org/drawingml/2006/picture">
+                  <pic:nvPicPr>
+                    <pic:cNvPr id="2" name="Picture 2"/>
+                    <pic:cNvPicPr/>
+                  </pic:nvPicPr>
+                  <pic:blipFill>
+                    <a:blip r:embed="rId9"/>
+                    <a:srcRect/>
+                    <a:stretch>
+                      <a:fillRect/>
+                    </a:stretch>
+                  </pic:blipFill>
+                  <pic:spPr bwMode="auto">
+                    <a:xfrm>
+                      <a:off x="0" y="0"/>
+                      <a:ext cx="5832000" cy="2217600"/>
+                    </a:xfrm>
+                    <a:prstGeom prst="rect">
+                      <a:avLst/>
+                    </a:prstGeom>
+                  </pic:spPr>
+                </pic:pic>
+              </a:graphicData>
+            </a:graphic>
+          </wp:inline>
+        </w:drawing>
+      </w:r>
+    </w:p>
+    <w:p>
+      <w:pPr>
         <w:spacing w:after="260"/>
         <w:ind w:left="628" w:right="1060" w:hanging="5"/>
-        <w:jc w:val="both"/>
-      </w:pPr>
-      <w:r>
-        <w:rPr>
-          <w:rFonts w:ascii="Times New Roman" w:eastAsia="Times New Roman" w:hAnsi="Times New Roman" w:cs="Times New Roman"/>
+        <w:jc w:val="center"/>
+      </w:pPr>
+      <w:r>
+        <w:rPr>
+          <w:rFonts w:ascii="Times New Roman" w:hAnsi="Times New Roman" w:cs="Times New Roman"/>
           <w:i/>
-          <w:sz w:val="24"/>
-        </w:rPr>
-        <w:t>Gợi ý: mỗi biểu đồ phải có CHÚ THÍCH và NHẬN XÉT, không chỉ dán hình.</w:t>
+          <w:iCs/>
+          <w:sz w:val="24"/>
+          <w:szCs w:val="24"/>
+        </w:rPr>
+        <w:t>Hình 3.2. Phân bố lead_time</w:t>
       </w:r>
     </w:p>
     <w:p>
@@ -6821,14 +10374,101 @@
           <w:b/>
           <w:sz w:val="24"/>
         </w:rPr>
-        <w:t xml:space="preserve">Hình 3.1. </w:t>
+        <w:t xml:space="preserve">Hình 3.2. </w:t>
       </w:r>
       <w:r>
         <w:rPr>
           <w:rFonts w:ascii="Courier New" w:eastAsia="Courier New" w:hAnsi="Courier New" w:cs="Courier New"/>
           <w:sz w:val="25"/>
         </w:rPr>
-        <w:t>[Phân bố biến mục tiêu — kiểm tra mất cân bằng]</w:t>
+        <w:t>[Phân bố/biểu đồ hộp các đặc trưng số — phát hiện ngoại lai]</w:t>
+      </w:r>
+    </w:p>
+    <w:p>
+      <w:pPr>
+        <w:pStyle w:val="ListParagraph"/>
+        <w:spacing w:after="103" w:line="265" w:lineRule="auto"/>
+        <w:ind w:left="623" w:right="548"/>
+        <w:rPr>
+          <w:rFonts w:ascii="Times New Roman" w:hAnsi="Times New Roman" w:cs="Times New Roman"/>
+          <w:sz w:val="24"/>
+          <w:szCs w:val="24"/>
+        </w:rPr>
+      </w:pPr>
+      <w:r>
+        <w:rPr>
+          <w:rFonts w:ascii="Times New Roman" w:eastAsia="Times New Roman" w:hAnsi="Times New Roman" w:cs="Times New Roman"/>
+          <w:sz w:val="24"/>
+          <w:szCs w:val="24"/>
+        </w:rPr>
+        <w:t>- Hình 3.</w:t>
+      </w:r>
+      <w:r>
+        <w:rPr>
+          <w:rFonts w:ascii="Times New Roman" w:eastAsia="Times New Roman" w:hAnsi="Times New Roman" w:cs="Times New Roman"/>
+          <w:sz w:val="24"/>
+          <w:szCs w:val="24"/>
+        </w:rPr>
+        <w:t>2</w:t>
+      </w:r>
+      <w:r>
+        <w:rPr>
+          <w:rFonts w:ascii="Times New Roman" w:eastAsia="Times New Roman" w:hAnsi="Times New Roman" w:cs="Times New Roman"/>
+          <w:sz w:val="24"/>
+          <w:szCs w:val="24"/>
+        </w:rPr>
+        <w:t xml:space="preserve"> cho ta thấy </w:t>
+      </w:r>
+    </w:p>
+    <w:p>
+      <w:pPr>
+        <w:spacing w:after="103" w:line="265" w:lineRule="auto"/>
+        <w:ind w:left="622" w:right="548"/>
+      </w:pPr>
+    </w:p>
+    <w:p>
+      <w:pPr>
+        <w:spacing w:after="103" w:line="265" w:lineRule="auto"/>
+        <w:ind w:left="622" w:right="548"/>
+      </w:pPr>
+      <w:r>
+        <w:rPr>
+          <w:noProof/>
+        </w:rPr>
+        <w:drawing>
+          <wp:inline distT="0" distB="0" distL="0" distR="0" wp14:anchorId="50306359" wp14:editId="429B3FFC">
+            <wp:extent cx="5209200" cy="4665600"/>
+            <wp:effectExtent l="0" t="0" r="0" b="1905"/>
+            <wp:docPr id="3" name="Picture 3"/>
+            <wp:cNvGraphicFramePr/>
+            <a:graphic xmlns:a="http://schemas.openxmlformats.org/drawingml/2006/main">
+              <a:graphicData uri="http://schemas.openxmlformats.org/drawingml/2006/picture">
+                <pic:pic xmlns:pic="http://schemas.openxmlformats.org/drawingml/2006/picture">
+                  <pic:nvPicPr>
+                    <pic:cNvPr id="3" name="Picture 3"/>
+                    <pic:cNvPicPr/>
+                  </pic:nvPicPr>
+                  <pic:blipFill>
+                    <a:blip r:embed="rId10"/>
+                    <a:srcRect/>
+                    <a:stretch>
+                      <a:fillRect/>
+                    </a:stretch>
+                  </pic:blipFill>
+                  <pic:spPr bwMode="auto">
+                    <a:xfrm>
+                      <a:off x="0" y="0"/>
+                      <a:ext cx="5209200" cy="4665600"/>
+                    </a:xfrm>
+                    <a:prstGeom prst="rect">
+                      <a:avLst/>
+                    </a:prstGeom>
+                  </pic:spPr>
+                </pic:pic>
+              </a:graphicData>
+            </a:graphic>
+          </wp:inline>
+        </w:drawing>
       </w:r>
     </w:p>
     <w:p>
@@ -6846,39 +10486,60 @@
           <w:b/>
           <w:sz w:val="24"/>
         </w:rPr>
-        <w:t xml:space="preserve">Hình 3.2. </w:t>
+        <w:lastRenderedPageBreak/>
+        <w:t xml:space="preserve">Hình 3.3. </w:t>
       </w:r>
       <w:r>
         <w:rPr>
           <w:rFonts w:ascii="Courier New" w:eastAsia="Courier New" w:hAnsi="Courier New" w:cs="Courier New"/>
           <w:sz w:val="25"/>
         </w:rPr>
-        <w:t>[Phân bố/biểu đồ hộp các đặc trưng số — phát hiện ngoại lai]</w:t>
+        <w:t>[Ma trận tương quan (heatmap)]</w:t>
       </w:r>
     </w:p>
     <w:p>
       <w:pPr>
-        <w:numPr>
-          <w:ilvl w:val="0"/>
-          <w:numId w:val="4"/>
-        </w:numPr>
         <w:spacing w:after="103" w:line="265" w:lineRule="auto"/>
-        <w:ind w:left="622" w:right="548" w:hanging="203"/>
-      </w:pPr>
-      <w:r>
-        <w:rPr>
-          <w:rFonts w:ascii="Times New Roman" w:eastAsia="Times New Roman" w:hAnsi="Times New Roman" w:cs="Times New Roman"/>
-          <w:b/>
-          <w:sz w:val="24"/>
-        </w:rPr>
-        <w:t xml:space="preserve">Hình 3.3. </w:t>
-      </w:r>
-      <w:r>
-        <w:rPr>
-          <w:rFonts w:ascii="Courier New" w:eastAsia="Courier New" w:hAnsi="Courier New" w:cs="Courier New"/>
-          <w:sz w:val="25"/>
-        </w:rPr>
-        <w:t>[Ma trận tương quan (heatmap)]</w:t>
+        <w:ind w:left="622" w:right="548"/>
+      </w:pPr>
+      <w:r>
+        <w:rPr>
+          <w:noProof/>
+        </w:rPr>
+        <w:drawing>
+          <wp:inline distT="0" distB="0" distL="0" distR="0" wp14:anchorId="274A3459" wp14:editId="552D3466">
+            <wp:extent cx="5922000" cy="2221200"/>
+            <wp:effectExtent l="0" t="0" r="3175" b="8255"/>
+            <wp:docPr id="4" name="Picture 4"/>
+            <wp:cNvGraphicFramePr/>
+            <a:graphic xmlns:a="http://schemas.openxmlformats.org/drawingml/2006/main">
+              <a:graphicData uri="http://schemas.openxmlformats.org/drawingml/2006/picture">
+                <pic:pic xmlns:pic="http://schemas.openxmlformats.org/drawingml/2006/picture">
+                  <pic:nvPicPr>
+                    <pic:cNvPr id="4" name="Picture 4"/>
+                    <pic:cNvPicPr/>
+                  </pic:nvPicPr>
+                  <pic:blipFill>
+                    <a:blip r:embed="rId11"/>
+                    <a:srcRect/>
+                    <a:stretch>
+                      <a:fillRect/>
+                    </a:stretch>
+                  </pic:blipFill>
+                  <pic:spPr bwMode="auto">
+                    <a:xfrm>
+                      <a:off x="0" y="0"/>
+                      <a:ext cx="5922000" cy="2221200"/>
+                    </a:xfrm>
+                    <a:prstGeom prst="rect">
+                      <a:avLst/>
+                    </a:prstGeom>
+                  </pic:spPr>
+                </pic:pic>
+              </a:graphicData>
+            </a:graphic>
+          </wp:inline>
+        </w:drawing>
       </w:r>
     </w:p>
     <w:p>
@@ -6939,7 +10600,6 @@
       </w:pPr>
       <w:bookmarkStart w:id="22" w:name="_Toc20846"/>
       <w:r>
-        <w:lastRenderedPageBreak/>
         <w:t>Chương 4 — Tiền xử lý và Feature Engineering</w:t>
       </w:r>
       <w:bookmarkEnd w:id="22"/>
@@ -7044,6 +10704,7 @@
       </w:pPr>
       <w:bookmarkStart w:id="26" w:name="_Toc20850"/>
       <w:r>
+        <w:lastRenderedPageBreak/>
         <w:t>4.4 Tạo và chọn đặc trưng</w:t>
       </w:r>
       <w:bookmarkEnd w:id="26"/>
@@ -7311,7 +10972,6 @@
       </w:pPr>
       <w:bookmarkStart w:id="29" w:name="_Toc20853"/>
       <w:r>
-        <w:lastRenderedPageBreak/>
         <w:t>5.1 Chiến lược chia dữ liệu</w:t>
       </w:r>
       <w:bookmarkEnd w:id="29"/>
@@ -7623,6 +11283,7 @@
       </w:pPr>
       <w:bookmarkStart w:id="32" w:name="_Toc20856"/>
       <w:r>
+        <w:lastRenderedPageBreak/>
         <w:t>5.4 Theo dõi thí nghiệm</w:t>
       </w:r>
       <w:bookmarkEnd w:id="32"/>
@@ -7888,7 +11549,6 @@
       </w:pPr>
       <w:bookmarkStart w:id="34" w:name="_Toc20858"/>
       <w:r>
-        <w:lastRenderedPageBreak/>
         <w:t>6.1 Kết quả tổng hợp (bảng so sánh đa chỉ số)</w:t>
       </w:r>
       <w:bookmarkEnd w:id="34"/>
@@ -8436,6 +12096,7 @@
       </w:pPr>
       <w:bookmarkStart w:id="36" w:name="_Toc20860"/>
       <w:r>
+        <w:lastRenderedPageBreak/>
         <w:t>6.3 Phân tích lỗi</w:t>
       </w:r>
       <w:bookmarkEnd w:id="36"/>
@@ -8541,7 +12202,6 @@
       </w:pPr>
       <w:bookmarkStart w:id="40" w:name="_Toc20864"/>
       <w:r>
-        <w:lastRenderedPageBreak/>
         <w:t>7.1 Đóng gói mô hình</w:t>
       </w:r>
       <w:bookmarkEnd w:id="40"/>
@@ -9114,6 +12774,7 @@
           <w:rFonts w:ascii="Times New Roman" w:eastAsia="Times New Roman" w:hAnsi="Times New Roman" w:cs="Times New Roman"/>
           <w:sz w:val="24"/>
         </w:rPr>
+        <w:lastRenderedPageBreak/>
         <w:t>suất</w:t>
       </w:r>
     </w:p>
@@ -9972,7 +13633,6 @@
                 <w:rFonts w:ascii="Times New Roman" w:eastAsia="Times New Roman" w:hAnsi="Times New Roman" w:cs="Times New Roman"/>
                 <w:sz w:val="24"/>
               </w:rPr>
-              <w:lastRenderedPageBreak/>
               <w:t>4</w:t>
             </w:r>
           </w:p>
@@ -10307,6 +13967,7 @@
       </w:pPr>
       <w:bookmarkStart w:id="46" w:name="_Toc20870"/>
       <w:r>
+        <w:lastRenderedPageBreak/>
         <w:t>7.7 Đóng gói Docker</w:t>
       </w:r>
       <w:bookmarkEnd w:id="46"/>
@@ -10413,7 +14074,6 @@
       </w:pPr>
       <w:bookmarkStart w:id="50" w:name="_Toc20874"/>
       <w:r>
-        <w:lastRenderedPageBreak/>
         <w:t>8.2 Hạn chế</w:t>
       </w:r>
       <w:bookmarkEnd w:id="50"/>
@@ -10553,7 +14213,7 @@
         </w:rPr>
         <w:t xml:space="preserve">, "Hotel Booking Demand," Kaggle. [Online]. Available: </w:t>
       </w:r>
-      <w:hyperlink r:id="rId7" w:history="1">
+      <w:hyperlink r:id="rId12" w:history="1">
         <w:r>
           <w:rPr>
             <w:rStyle w:val="Hyperlink"/>
@@ -10643,6 +14303,7 @@
           <w:rFonts w:ascii="Courier New" w:eastAsia="Courier New" w:hAnsi="Courier New" w:cs="Courier New"/>
           <w:sz w:val="25"/>
         </w:rPr>
+        <w:lastRenderedPageBreak/>
         <w:t>[Các tài liệu/khoá học tham khảo: AIMA, CS188, tài liệu thư viện XGBoost/LightGBM…]</w:t>
       </w:r>
     </w:p>
@@ -10786,7 +14447,6 @@
       </w:pPr>
       <w:bookmarkStart w:id="56" w:name="_Toc20880"/>
       <w:r>
-        <w:lastRenderedPageBreak/>
         <w:t>Phụ lục C — Data dictionary</w:t>
       </w:r>
       <w:bookmarkEnd w:id="56"/>
@@ -11970,9 +15630,9 @@
       </w:r>
     </w:p>
     <w:sectPr>
-      <w:footerReference w:type="even" r:id="rId8"/>
-      <w:footerReference w:type="default" r:id="rId9"/>
-      <w:footerReference w:type="first" r:id="rId10"/>
+      <w:footerReference w:type="even" r:id="rId13"/>
+      <w:footerReference w:type="default" r:id="rId14"/>
+      <w:footerReference w:type="first" r:id="rId15"/>
       <w:pgSz w:w="12240" w:h="15840"/>
       <w:pgMar w:top="1367" w:right="662" w:bottom="1365" w:left="1321" w:header="720" w:footer="711" w:gutter="0"/>
       <w:cols w:space="720"/>
@@ -14043,6 +17703,7 @@
   <w:style w:type="paragraph" w:default="1" w:styleId="Normal">
     <w:name w:val="Normal"/>
     <w:qFormat/>
+    <w:rsid w:val="00873D9F"/>
     <w:rPr>
       <w:rFonts w:ascii="Calibri" w:eastAsia="Calibri" w:hAnsi="Calibri" w:cs="Calibri"/>
       <w:color w:val="000000"/>
@@ -14225,6 +17886,17 @@
       <w:color w:val="605E5C"/>
       <w:shd w:val="clear" w:color="auto" w:fill="E1DFDD"/>
     </w:rPr>
+  </w:style>
+  <w:style w:type="paragraph" w:styleId="ListParagraph">
+    <w:name w:val="List Paragraph"/>
+    <w:basedOn w:val="Normal"/>
+    <w:uiPriority w:val="34"/>
+    <w:qFormat/>
+    <w:rsid w:val="008C24B6"/>
+    <w:pPr>
+      <w:ind w:left="720"/>
+      <w:contextualSpacing/>
+    </w:pPr>
   </w:style>
 </w:styles>
 </file>
@@ -14522,4 +18194,16 @@
     </a:ext>
   </a:extLst>
 </a:theme>
+</file>
+
+<file path=customXml/item1.xml><?xml version="1.0" encoding="utf-8"?>
+<b:Sources xmlns:b="http://schemas.openxmlformats.org/officeDocument/2006/bibliography" xmlns="http://schemas.openxmlformats.org/officeDocument/2006/bibliography" SelectedStyle="\APASixthEditionOfficeOnline.xsl" StyleName="APA" Version="6"/>
+</file>
+
+<file path=customXml/itemProps1.xml><?xml version="1.0" encoding="utf-8"?>
+<ds:datastoreItem xmlns:ds="http://schemas.openxmlformats.org/officeDocument/2006/customXml" ds:itemID="{B2A232B6-386C-470B-9EBD-0FD9BB0194E1}">
+  <ds:schemaRefs>
+    <ds:schemaRef ds:uri="http://schemas.openxmlformats.org/officeDocument/2006/bibliography"/>
+  </ds:schemaRefs>
+</ds:datastoreItem>
 </file>
</xml_diff>

<commit_message>
Update report chapters 5 and 6
</commit_message>
<xml_diff>
--- a/BaoCao/BaoCao.docx
+++ b/BaoCao/BaoCao.docx
@@ -2955,7 +2955,7 @@
               </wp:inline>
             </w:drawing>
           </mc:Choice>
-          <mc:Fallback xmlns:w16du="http://schemas.microsoft.com/office/word/2023/wordml/word16du" xmlns:w16sdtfl="http://schemas.microsoft.com/office/word/2024/wordml/sdtformatlock" xmlns:a="http://schemas.openxmlformats.org/drawingml/2006/main">
+          <mc:Fallback xmlns:a="http://schemas.openxmlformats.org/drawingml/2006/main" xmlns:w16sdtfl="http://schemas.microsoft.com/office/word/2024/wordml/sdtformatlock" xmlns:w16du="http://schemas.microsoft.com/office/word/2023/wordml/word16du">
             <w:pict>
               <v:group id="Group 11669" style="width:475.938pt;height:0.9564pt;mso-position-horizontal-relative:char;mso-position-vertical-relative:line" coordsize="60444,121">
                 <v:shape id="Shape 394" style="position:absolute;width:60444;height:0;left:0;top:0;" coordsize="6044413,0" path="m0,0l6044413,0">
@@ -3729,7 +3729,7 @@
               </wp:inline>
             </w:drawing>
           </mc:Choice>
-          <mc:Fallback xmlns:w16du="http://schemas.microsoft.com/office/word/2023/wordml/word16du" xmlns:w16sdtfl="http://schemas.microsoft.com/office/word/2024/wordml/sdtformatlock" xmlns:a="http://schemas.openxmlformats.org/drawingml/2006/main">
+          <mc:Fallback xmlns:a="http://schemas.openxmlformats.org/drawingml/2006/main" xmlns:w16sdtfl="http://schemas.microsoft.com/office/word/2024/wordml/sdtformatlock" xmlns:w16du="http://schemas.microsoft.com/office/word/2023/wordml/word16du">
             <w:pict>
               <v:group id="Group 11671" style="width:475.938pt;height:0.9564pt;mso-position-horizontal-relative:char;mso-position-vertical-relative:line" coordsize="60444,121">
                 <v:shape id="Shape 411" style="position:absolute;width:60444;height:0;left:0;top:0;" coordsize="6044413,0" path="m0,0l6044413,0">
@@ -14459,11 +14459,48 @@
     </w:p>
     <w:p>
       <w:pPr>
+        <w:pStyle w:val="Heading1"/>
+        <w:rPr>
+          <w:b w:val="0"/>
+          <w:iCs/>
+          <w:sz w:val="24"/>
+          <w:szCs w:val="24"/>
+        </w:rPr>
+      </w:pPr>
+      <w:r>
+        <w:rPr>
+          <w:iCs/>
+          <w:sz w:val="24"/>
+          <w:szCs w:val="24"/>
+        </w:rPr>
+        <w:t>Chương 5 — Mô hình và Huấn luyện</w:t>
+      </w:r>
+    </w:p>
+    <w:p>
+      <w:pPr>
+        <w:pStyle w:val="Heading2"/>
+        <w:rPr>
+          <w:b w:val="0"/>
+          <w:iCs/>
+          <w:sz w:val="24"/>
+          <w:szCs w:val="24"/>
+        </w:rPr>
+      </w:pPr>
+      <w:r>
+        <w:rPr>
+          <w:iCs/>
+          <w:sz w:val="24"/>
+          <w:szCs w:val="24"/>
+        </w:rPr>
+        <w:t>5.1 Chiến lược chia dữ liệu</w:t>
+      </w:r>
+    </w:p>
+    <w:p>
+      <w:pPr>
         <w:spacing w:after="554" w:line="336" w:lineRule="auto"/>
         <w:ind w:right="1060"/>
         <w:rPr>
           <w:rFonts w:ascii="Times New Roman" w:hAnsi="Times New Roman" w:cs="Times New Roman"/>
-          <w:b/>
           <w:iCs/>
           <w:sz w:val="24"/>
           <w:szCs w:val="24"/>
@@ -14472,12 +14509,11 @@
       <w:r>
         <w:rPr>
           <w:rFonts w:ascii="Times New Roman" w:hAnsi="Times New Roman" w:cs="Times New Roman"/>
-          <w:b/>
           <w:iCs/>
           <w:sz w:val="24"/>
           <w:szCs w:val="24"/>
         </w:rPr>
-        <w:t>Chương 5 — Mô hình và Huấn luyện</w:t>
+        <w:t>Sau khi loại bỏ biến mục tiêu is_canceled và ba thuộc tính có nguy cơ gây rò rỉ dữ liệu gồm reservation_status, reservation_status_date và assigned_room_type, dữ liệu được chia thành tập huấn luyện và tập kiểm tra bằng hàm train_test_split. Tham số test_size=0.20 tương ứng 80% dữ liệu dùng để huấn luyện và 20% dùng để đánh giá độc lập.</w:t>
       </w:r>
     </w:p>
     <w:p>
@@ -14486,7 +14522,6 @@
         <w:ind w:right="1060"/>
         <w:rPr>
           <w:rFonts w:ascii="Times New Roman" w:hAnsi="Times New Roman" w:cs="Times New Roman"/>
-          <w:b/>
           <w:iCs/>
           <w:sz w:val="24"/>
           <w:szCs w:val="24"/>
@@ -14495,12 +14530,11 @@
       <w:r>
         <w:rPr>
           <w:rFonts w:ascii="Times New Roman" w:hAnsi="Times New Roman" w:cs="Times New Roman"/>
-          <w:b/>
           <w:iCs/>
           <w:sz w:val="24"/>
           <w:szCs w:val="24"/>
         </w:rPr>
-        <w:t>5.1 Chiến lược chia dữ liệu</w:t>
+        <w:t>Tham số stratify=y được sử dụng để duy trì tỷ lệ hai lớp hủy và không hủy gần như đồng nhất giữa tập Train và Test. Đây là lựa chọn phù hợp vì dữ liệu có mức mất cân bằng vừa phải, với khoảng 37,04% đơn bị hủy và 62,96% đơn không bị hủy.</w:t>
       </w:r>
     </w:p>
     <w:p>
@@ -14521,7 +14555,7 @@
           <w:sz w:val="24"/>
           <w:szCs w:val="24"/>
         </w:rPr>
-        <w:t>Sau khi loại bỏ biến mục tiêu is_canceled và ba thuộc tính có nguy cơ gây rò rỉ dữ liệu gồm reservation_status, reservation_status_date và assigned_room_type, dữ liệu được chia thành tập huấn luyện và tập kiểm tra bằng hàm train_test_split. Tham số test_size=0.20 tương ứng 80% dữ liệu dùng để huấn luyện và 20% dùng để đánh giá độc lập.</w:t>
+        <w:t>Tham số random_state=42 được cố định trong bước chia dữ liệu, lấy mẫu tính Mutual Information và khởi tạo các mô hình. Việc cố định hạt giống ngẫu nhiên giúp thí nghiệm có khả năng tái lập khi chạy lại trên cùng dữ liệu và môi trường thư viện.</w:t>
       </w:r>
     </w:p>
     <w:p>
@@ -14542,7 +14576,27 @@
           <w:sz w:val="24"/>
           <w:szCs w:val="24"/>
         </w:rPr>
-        <w:t>Tham số stratify=y được sử dụng để duy trì tỷ lệ hai lớp hủy và không hủy gần như đồng nhất giữa tập Train và Test. Đây là lựa chọn phù hợp vì dữ liệu có mức mất cân bằng vừa phải, với khoảng 37,04% đơn bị hủy và 62,96% đơn không bị hủy.</w:t>
+        <w:t>Bộ tiền xử lý chỉ được fit trên X_train. Các đặc trưng số được điền khuyết bằng trung vị và chuẩn hóa bằng StandardScaler; các đặc trưng phân loại được điền giá trị Unknown và mã hóa bằng OneHotEncoder với handle_unknown="ignore". Sau đó, bộ biến đổi đã học từ tập Train được dùng để transform X_test, qua đó hạn chế rò rỉ dữ liệu.</w:t>
+      </w:r>
+    </w:p>
+    <w:p>
+      <w:pPr>
+        <w:pStyle w:val="Heading2"/>
+        <w:rPr>
+          <w:b w:val="0"/>
+          <w:iCs/>
+          <w:sz w:val="24"/>
+          <w:szCs w:val="24"/>
+        </w:rPr>
+      </w:pPr>
+      <w:r>
+        <w:rPr>
+          <w:iCs/>
+          <w:sz w:val="24"/>
+          <w:szCs w:val="24"/>
+        </w:rPr>
+        <w:lastRenderedPageBreak/>
+        <w:t>5.2 Các mô hình so sánh</w:t>
       </w:r>
     </w:p>
     <w:p>
@@ -14563,7 +14617,7 @@
           <w:sz w:val="24"/>
           <w:szCs w:val="24"/>
         </w:rPr>
-        <w:t>Tham số random_state=42 được cố định trong bước chia dữ liệu, lấy mẫu tính Mutual Information và khởi tạo các mô hình. Việc cố định hạt giống ngẫu nhiên giúp thí nghiệm có khả năng tái lập khi chạy lại trên cùng dữ liệu và môi trường thư viện.</w:t>
+        <w:t>Nhóm huấn luyện ba mô hình đại diện cho ba hướng tiếp cận khác nhau trên cùng dữ liệu đã tiền xử lý. Mỗi mô hình đều sử dụng cùng X_train_processed để huấn luyện và cùng X_test_processed để đánh giá, bảo đảm tính công bằng khi so sánh.</w:t>
       </w:r>
     </w:p>
     <w:p>
@@ -14584,7 +14638,7 @@
           <w:sz w:val="24"/>
           <w:szCs w:val="24"/>
         </w:rPr>
-        <w:t>Bộ tiền xử lý chỉ được fit trên X_train. Các đặc trưng số được điền khuyết bằng trung vị và chuẩn hóa bằng StandardScaler; các đặc trưng phân loại được điền giá trị Unknown và mã hóa bằng OneHotEncoder với handle_unknown="ignore". Sau đó, bộ biến đổi đã học từ tập Train được dùng để transform X_test, qua đó hạn chế rò rỉ dữ liệu.</w:t>
+        <w:t>Logistic Regression được chọn làm mô hình baseline tuyến tính. Mô hình sử dụng max_iter=1000 để tăng khả năng hội tụ, class_weight="balanced" để tự động điều chỉnh trọng số theo tần suất lớp và random_state=42 để bảo đảm khả năng tái lập.</w:t>
       </w:r>
     </w:p>
     <w:p>
@@ -14593,7 +14647,6 @@
         <w:ind w:right="1060"/>
         <w:rPr>
           <w:rFonts w:ascii="Times New Roman" w:hAnsi="Times New Roman" w:cs="Times New Roman"/>
-          <w:b/>
           <w:iCs/>
           <w:sz w:val="24"/>
           <w:szCs w:val="24"/>
@@ -14602,13 +14655,11 @@
       <w:r>
         <w:rPr>
           <w:rFonts w:ascii="Times New Roman" w:hAnsi="Times New Roman" w:cs="Times New Roman"/>
-          <w:b/>
           <w:iCs/>
           <w:sz w:val="24"/>
           <w:szCs w:val="24"/>
         </w:rPr>
-        <w:lastRenderedPageBreak/>
-        <w:t>5.2 Các mô hình so sánh</w:t>
+        <w:t>Random Forest là mô hình ensemble theo cơ chế bagging. Trong code, mô hình gồm 100 cây quyết định (n_estimators=100), giới hạn độ sâu mỗi cây ở mức 10 (max_depth=10), sử dụng class_weight="balanced", random_state=42 và n_jobs=-1 để tận dụng toàn bộ lõi CPU khi huấn luyện.</w:t>
       </w:r>
     </w:p>
     <w:p>
@@ -14629,15 +14680,14 @@
           <w:sz w:val="24"/>
           <w:szCs w:val="24"/>
         </w:rPr>
-        <w:t>Nhóm huấn luyện ba mô hình đại diện cho ba hướng tiếp cận khác nhau trên cùng dữ liệu đã tiền xử lý. Mỗi mô hình đều sử dụng cùng X_train_processed để huấn luyện và cùng X_test_processed để đánh giá, bảo đảm tính công bằng khi so sánh.</w:t>
-      </w:r>
-    </w:p>
-    <w:p>
-      <w:pPr>
-        <w:spacing w:after="554" w:line="336" w:lineRule="auto"/>
-        <w:ind w:right="1060"/>
-        <w:rPr>
-          <w:rFonts w:ascii="Times New Roman" w:hAnsi="Times New Roman" w:cs="Times New Roman"/>
+        <w:t>Gradient Boosting được xây dựng bằng GradientBoostingClassifier với random_state=42; các siêu tham số còn lại giữ theo mặc định của scikit-learn. Mô hình tạo tuần tự các cây yếu, trong đó mỗi cây mới tập trung sửa các sai số còn lại của tập hợp cây trước đó.</w:t>
+      </w:r>
+    </w:p>
+    <w:p>
+      <w:pPr>
+        <w:pStyle w:val="Heading2"/>
+        <w:rPr>
+          <w:b w:val="0"/>
           <w:iCs/>
           <w:sz w:val="24"/>
           <w:szCs w:val="24"/>
@@ -14645,72 +14695,6 @@
       </w:pPr>
       <w:r>
         <w:rPr>
-          <w:rFonts w:ascii="Times New Roman" w:hAnsi="Times New Roman" w:cs="Times New Roman"/>
-          <w:iCs/>
-          <w:sz w:val="24"/>
-          <w:szCs w:val="24"/>
-        </w:rPr>
-        <w:t>Logistic Regression được chọn làm mô hình baseline tuyến tính. Mô hình sử dụng max_iter=1000 để tăng khả năng hội tụ, class_weight="balanced" để tự động điều chỉnh trọng số theo tần suất lớp và random_state=42 để bảo đảm khả năng tái lập.</w:t>
-      </w:r>
-    </w:p>
-    <w:p>
-      <w:pPr>
-        <w:spacing w:after="554" w:line="336" w:lineRule="auto"/>
-        <w:ind w:right="1060"/>
-        <w:rPr>
-          <w:rFonts w:ascii="Times New Roman" w:hAnsi="Times New Roman" w:cs="Times New Roman"/>
-          <w:iCs/>
-          <w:sz w:val="24"/>
-          <w:szCs w:val="24"/>
-        </w:rPr>
-      </w:pPr>
-      <w:r>
-        <w:rPr>
-          <w:rFonts w:ascii="Times New Roman" w:hAnsi="Times New Roman" w:cs="Times New Roman"/>
-          <w:iCs/>
-          <w:sz w:val="24"/>
-          <w:szCs w:val="24"/>
-        </w:rPr>
-        <w:t>Random Forest là mô hình ensemble theo cơ chế bagging. Trong code, mô hình gồm 100 cây quyết định (n_estimators=100), giới hạn độ sâu mỗi cây ở mức 10 (max_depth=10), sử dụng class_weight="balanced", random_state=42 và n_jobs=-1 để tận dụng toàn bộ lõi CPU khi huấn luyện.</w:t>
-      </w:r>
-    </w:p>
-    <w:p>
-      <w:pPr>
-        <w:spacing w:after="554" w:line="336" w:lineRule="auto"/>
-        <w:ind w:right="1060"/>
-        <w:rPr>
-          <w:rFonts w:ascii="Times New Roman" w:hAnsi="Times New Roman" w:cs="Times New Roman"/>
-          <w:iCs/>
-          <w:sz w:val="24"/>
-          <w:szCs w:val="24"/>
-        </w:rPr>
-      </w:pPr>
-      <w:r>
-        <w:rPr>
-          <w:rFonts w:ascii="Times New Roman" w:hAnsi="Times New Roman" w:cs="Times New Roman"/>
-          <w:iCs/>
-          <w:sz w:val="24"/>
-          <w:szCs w:val="24"/>
-        </w:rPr>
-        <w:t>Gradient Boosting được xây dựng bằng GradientBoostingClassifier với random_state=42; các siêu tham số còn lại giữ theo mặc định của scikit-learn. Mô hình tạo tuần tự các cây yếu, trong đó mỗi cây mới tập trung sửa các sai số còn lại của tập hợp cây trước đó.</w:t>
-      </w:r>
-    </w:p>
-    <w:p>
-      <w:pPr>
-        <w:spacing w:after="554" w:line="336" w:lineRule="auto"/>
-        <w:ind w:right="1060"/>
-        <w:rPr>
-          <w:rFonts w:ascii="Times New Roman" w:hAnsi="Times New Roman" w:cs="Times New Roman"/>
-          <w:b/>
-          <w:iCs/>
-          <w:sz w:val="24"/>
-          <w:szCs w:val="24"/>
-        </w:rPr>
-      </w:pPr>
-      <w:r>
-        <w:rPr>
-          <w:rFonts w:ascii="Times New Roman" w:hAnsi="Times New Roman" w:cs="Times New Roman"/>
-          <w:b/>
           <w:iCs/>
           <w:sz w:val="24"/>
           <w:szCs w:val="24"/>
@@ -14789,7 +14773,6 @@
               <w:rPr>
                 <w:b/>
               </w:rPr>
-              <w:lastRenderedPageBreak/>
               <w:t>Mô hình</w:t>
             </w:r>
           </w:p>
@@ -14921,6 +14904,7 @@
           </w:tcPr>
           <w:p>
             <w:r>
+              <w:lastRenderedPageBreak/>
               <w:t>Random Forest</w:t>
             </w:r>
           </w:p>
@@ -15015,11 +14999,9 @@
     </w:p>
     <w:p>
       <w:pPr>
-        <w:spacing w:after="554" w:line="336" w:lineRule="auto"/>
-        <w:ind w:right="1060"/>
-        <w:rPr>
-          <w:rFonts w:ascii="Times New Roman" w:hAnsi="Times New Roman" w:cs="Times New Roman"/>
-          <w:b/>
+        <w:pStyle w:val="Heading2"/>
+        <w:rPr>
+          <w:b w:val="0"/>
           <w:iCs/>
           <w:sz w:val="24"/>
           <w:szCs w:val="24"/>
@@ -15027,8 +15009,6 @@
       </w:pPr>
       <w:r>
         <w:rPr>
-          <w:rFonts w:ascii="Times New Roman" w:hAnsi="Times New Roman" w:cs="Times New Roman"/>
-          <w:b/>
           <w:iCs/>
           <w:sz w:val="24"/>
           <w:szCs w:val="24"/>
@@ -15133,11 +15113,48 @@
     </w:p>
     <w:p>
       <w:pPr>
+        <w:pStyle w:val="Heading1"/>
+        <w:rPr>
+          <w:b w:val="0"/>
+          <w:iCs/>
+          <w:sz w:val="24"/>
+          <w:szCs w:val="24"/>
+        </w:rPr>
+      </w:pPr>
+      <w:r>
+        <w:rPr>
+          <w:iCs/>
+          <w:sz w:val="24"/>
+          <w:szCs w:val="24"/>
+        </w:rPr>
+        <w:t>Chương 6 — Đánh giá và Phân tích</w:t>
+      </w:r>
+    </w:p>
+    <w:p>
+      <w:pPr>
+        <w:pStyle w:val="Heading2"/>
+        <w:rPr>
+          <w:b w:val="0"/>
+          <w:iCs/>
+          <w:sz w:val="24"/>
+          <w:szCs w:val="24"/>
+        </w:rPr>
+      </w:pPr>
+      <w:r>
+        <w:rPr>
+          <w:iCs/>
+          <w:sz w:val="24"/>
+          <w:szCs w:val="24"/>
+        </w:rPr>
+        <w:t>6.1 Kết quả tổng hợp</w:t>
+      </w:r>
+    </w:p>
+    <w:p>
+      <w:pPr>
         <w:spacing w:after="554" w:line="336" w:lineRule="auto"/>
         <w:ind w:right="1060"/>
         <w:rPr>
           <w:rFonts w:ascii="Times New Roman" w:hAnsi="Times New Roman" w:cs="Times New Roman"/>
-          <w:b/>
           <w:iCs/>
           <w:sz w:val="24"/>
           <w:szCs w:val="24"/>
@@ -15146,12 +15163,31 @@
       <w:r>
         <w:rPr>
           <w:rFonts w:ascii="Times New Roman" w:hAnsi="Times New Roman" w:cs="Times New Roman"/>
-          <w:b/>
           <w:iCs/>
           <w:sz w:val="24"/>
           <w:szCs w:val="24"/>
         </w:rPr>
-        <w:t>Chương 6 — Đánh giá và Phân tích</w:t>
+        <w:t>Ba mô hình được đánh giá trên tập Test bằng năm chỉ số: Accuracy, Precision, Recall, F1-score và ROC-AUC. Hàm evaluate_</w:t>
+      </w:r>
+      <w:proofErr w:type="gramStart"/>
+      <w:r>
+        <w:rPr>
+          <w:rFonts w:ascii="Times New Roman" w:hAnsi="Times New Roman" w:cs="Times New Roman"/>
+          <w:iCs/>
+          <w:sz w:val="24"/>
+          <w:szCs w:val="24"/>
+        </w:rPr>
+        <w:t>model(</w:t>
+      </w:r>
+      <w:proofErr w:type="gramEnd"/>
+      <w:r>
+        <w:rPr>
+          <w:rFonts w:ascii="Times New Roman" w:hAnsi="Times New Roman" w:cs="Times New Roman"/>
+          <w:iCs/>
+          <w:sz w:val="24"/>
+          <w:szCs w:val="24"/>
+        </w:rPr>
+        <w:t>) tạo nhãn dự đoán bằng predict(), xác suất lớp hủy bằng predict_proba()[:, 1], in classification_report và trả về toàn bộ chỉ số. F1-score được chọn làm tiêu chí chính để xác định mô hình tốt nhất.</w:t>
       </w:r>
     </w:p>
     <w:p>
@@ -15160,7 +15196,6 @@
         <w:ind w:right="1060"/>
         <w:rPr>
           <w:rFonts w:ascii="Times New Roman" w:hAnsi="Times New Roman" w:cs="Times New Roman"/>
-          <w:b/>
           <w:iCs/>
           <w:sz w:val="24"/>
           <w:szCs w:val="24"/>
@@ -15169,74 +15204,11 @@
       <w:r>
         <w:rPr>
           <w:rFonts w:ascii="Times New Roman" w:hAnsi="Times New Roman" w:cs="Times New Roman"/>
-          <w:b/>
           <w:iCs/>
           <w:sz w:val="24"/>
           <w:szCs w:val="24"/>
         </w:rPr>
         <w:lastRenderedPageBreak/>
-        <w:t>6.1 Kết quả tổng hợp</w:t>
-      </w:r>
-    </w:p>
-    <w:p>
-      <w:pPr>
-        <w:spacing w:after="554" w:line="336" w:lineRule="auto"/>
-        <w:ind w:right="1060"/>
-        <w:rPr>
-          <w:rFonts w:ascii="Times New Roman" w:hAnsi="Times New Roman" w:cs="Times New Roman"/>
-          <w:iCs/>
-          <w:sz w:val="24"/>
-          <w:szCs w:val="24"/>
-        </w:rPr>
-      </w:pPr>
-      <w:r>
-        <w:rPr>
-          <w:rFonts w:ascii="Times New Roman" w:hAnsi="Times New Roman" w:cs="Times New Roman"/>
-          <w:iCs/>
-          <w:sz w:val="24"/>
-          <w:szCs w:val="24"/>
-        </w:rPr>
-        <w:t>Ba mô hình được đánh giá trên tập Test bằng năm chỉ số: Accuracy, Precision, Recall, F1-score và ROC-AUC. Hàm evaluate_</w:t>
-      </w:r>
-      <w:proofErr w:type="gramStart"/>
-      <w:r>
-        <w:rPr>
-          <w:rFonts w:ascii="Times New Roman" w:hAnsi="Times New Roman" w:cs="Times New Roman"/>
-          <w:iCs/>
-          <w:sz w:val="24"/>
-          <w:szCs w:val="24"/>
-        </w:rPr>
-        <w:t>model(</w:t>
-      </w:r>
-      <w:proofErr w:type="gramEnd"/>
-      <w:r>
-        <w:rPr>
-          <w:rFonts w:ascii="Times New Roman" w:hAnsi="Times New Roman" w:cs="Times New Roman"/>
-          <w:iCs/>
-          <w:sz w:val="24"/>
-          <w:szCs w:val="24"/>
-        </w:rPr>
-        <w:t>) tạo nhãn dự đoán bằng predict(), xác suất lớp hủy bằng predict_proba()[:, 1], in classification_report và trả về toàn bộ chỉ số. F1-score được chọn làm tiêu chí chính để xác định mô hình tốt nhất.</w:t>
-      </w:r>
-    </w:p>
-    <w:p>
-      <w:pPr>
-        <w:spacing w:after="554" w:line="336" w:lineRule="auto"/>
-        <w:ind w:right="1060"/>
-        <w:rPr>
-          <w:rFonts w:ascii="Times New Roman" w:hAnsi="Times New Roman" w:cs="Times New Roman"/>
-          <w:iCs/>
-          <w:sz w:val="24"/>
-          <w:szCs w:val="24"/>
-        </w:rPr>
-      </w:pPr>
-      <w:r>
-        <w:rPr>
-          <w:rFonts w:ascii="Times New Roman" w:hAnsi="Times New Roman" w:cs="Times New Roman"/>
-          <w:iCs/>
-          <w:sz w:val="24"/>
-          <w:szCs w:val="24"/>
-        </w:rPr>
         <w:t>Kết quả cho thấy Random Forest đạt F1-score cao nhất; Gradient Boosting đạt Accuracy và ROC-AUC cao nhất; Logistic Regression đạt Recall cao nhất nhưng Precision thấp hơn. Bảng kết quả được lưu thành Table_5_1_Model_Result.csv và bản đã làm tròn, sắp xếp theo F1-score được lưu thành Table_5_2_Model_Comparison.csv.</w:t>
       </w:r>
     </w:p>
@@ -15656,11 +15628,29 @@
     </w:p>
     <w:p>
       <w:pPr>
+        <w:pStyle w:val="Heading2"/>
+        <w:rPr>
+          <w:b w:val="0"/>
+          <w:iCs/>
+          <w:sz w:val="24"/>
+          <w:szCs w:val="24"/>
+        </w:rPr>
+      </w:pPr>
+      <w:r>
+        <w:rPr>
+          <w:iCs/>
+          <w:sz w:val="24"/>
+          <w:szCs w:val="24"/>
+        </w:rPr>
+        <w:t>6.2 Ma trận nhầm lẫn và đường ROC</w:t>
+      </w:r>
+    </w:p>
+    <w:p>
+      <w:pPr>
         <w:spacing w:after="554" w:line="336" w:lineRule="auto"/>
         <w:ind w:right="1060"/>
         <w:rPr>
           <w:rFonts w:ascii="Times New Roman" w:hAnsi="Times New Roman" w:cs="Times New Roman"/>
-          <w:b/>
           <w:iCs/>
           <w:sz w:val="24"/>
           <w:szCs w:val="24"/>
@@ -15669,12 +15659,11 @@
       <w:r>
         <w:rPr>
           <w:rFonts w:ascii="Times New Roman" w:hAnsi="Times New Roman" w:cs="Times New Roman"/>
-          <w:b/>
           <w:iCs/>
           <w:sz w:val="24"/>
           <w:szCs w:val="24"/>
         </w:rPr>
-        <w:t>6.2 Ma trận nhầm lẫn và đường ROC</w:t>
+        <w:t>Sau khi chọn Random Forest, chương trình tạo ma trận nhầm lẫn bằng ConfusionMatrixDisplay.from_predictions và lưu thành Figure_6_1_ConfusionMatrix.png. Tập Test có 23.878 mẫu; nhãn 1 biểu diễn đơn bị hủy và nhãn 0 biểu diễn đơn không bị hủy.</w:t>
       </w:r>
     </w:p>
     <w:p>
@@ -15692,32 +15681,11 @@
         <w:rPr>
           <w:rFonts w:ascii="Times New Roman" w:hAnsi="Times New Roman" w:cs="Times New Roman"/>
           <w:iCs/>
+          <w:noProof/>
           <w:sz w:val="24"/>
           <w:szCs w:val="24"/>
         </w:rPr>
         <w:lastRenderedPageBreak/>
-        <w:t>Sau khi chọn Random Forest, chương trình tạo ma trận nhầm lẫn bằng ConfusionMatrixDisplay.from_predictions và lưu thành Figure_6_1_ConfusionMatrix.png. Tập Test có 23.878 mẫu; nhãn 1 biểu diễn đơn bị hủy và nhãn 0 biểu diễn đơn không bị hủy.</w:t>
-      </w:r>
-    </w:p>
-    <w:p>
-      <w:pPr>
-        <w:spacing w:after="554" w:line="336" w:lineRule="auto"/>
-        <w:ind w:right="1060"/>
-        <w:rPr>
-          <w:rFonts w:ascii="Times New Roman" w:hAnsi="Times New Roman" w:cs="Times New Roman"/>
-          <w:iCs/>
-          <w:sz w:val="24"/>
-          <w:szCs w:val="24"/>
-        </w:rPr>
-      </w:pPr>
-      <w:r>
-        <w:rPr>
-          <w:rFonts w:ascii="Times New Roman" w:hAnsi="Times New Roman" w:cs="Times New Roman"/>
-          <w:iCs/>
-          <w:noProof/>
-          <w:sz w:val="24"/>
-          <w:szCs w:val="24"/>
-        </w:rPr>
         <w:drawing>
           <wp:inline distT="0" distB="0" distL="0" distR="0" wp14:anchorId="1FB6EB3C" wp14:editId="476B1E0F">
             <wp:extent cx="4476750" cy="4038600"/>
@@ -15869,17 +15837,7 @@
           <w:sz w:val="24"/>
           <w:szCs w:val="24"/>
         </w:rPr>
-        <w:t xml:space="preserve">13.688+1.345), xấp xỉ 8,95%. False Negative chiếm khoảng </w:t>
-      </w:r>
-      <w:r>
-        <w:rPr>
-          <w:rFonts w:ascii="Times New Roman" w:hAnsi="Times New Roman" w:cs="Times New Roman"/>
-          <w:iCs/>
-          <w:sz w:val="24"/>
-          <w:szCs w:val="24"/>
-        </w:rPr>
-        <w:lastRenderedPageBreak/>
-        <w:t>9,57% tập Test và tương ứng bỏ sót khoảng 25,85% số đơn thực tế bị hủy. Do chi phí bỏ sót đơn hủy có thể cao, việc điều chỉnh ngưỡng dự đoán để tăng Recall là một hướng cần khảo sát.</w:t>
+        <w:t>13.688+1.345), xấp xỉ 8,95%. False Negative chiếm khoảng 9,57% tập Test và tương ứng bỏ sót khoảng 25,85% số đơn thực tế bị hủy. Do chi phí bỏ sót đơn hủy có thể cao, việc điều chỉnh ngưỡng dự đoán để tăng Recall là một hướng cần khảo sát.</w:t>
       </w:r>
     </w:p>
     <w:p>
@@ -15901,6 +15859,7 @@
           <w:sz w:val="24"/>
           <w:szCs w:val="24"/>
         </w:rPr>
+        <w:lastRenderedPageBreak/>
         <w:drawing>
           <wp:inline distT="0" distB="0" distL="0" distR="0" wp14:anchorId="736D074E" wp14:editId="38BE1DB8">
             <wp:extent cx="5943600" cy="4457700"/>
@@ -15996,11 +15955,29 @@
     </w:p>
     <w:p>
       <w:pPr>
+        <w:pStyle w:val="Heading2"/>
+        <w:rPr>
+          <w:b w:val="0"/>
+          <w:iCs/>
+          <w:sz w:val="24"/>
+          <w:szCs w:val="24"/>
+        </w:rPr>
+      </w:pPr>
+      <w:r>
+        <w:rPr>
+          <w:iCs/>
+          <w:sz w:val="24"/>
+          <w:szCs w:val="24"/>
+        </w:rPr>
+        <w:t>6.3 Phân tích lỗi</w:t>
+      </w:r>
+    </w:p>
+    <w:p>
+      <w:pPr>
         <w:spacing w:after="554" w:line="336" w:lineRule="auto"/>
         <w:ind w:right="1060"/>
         <w:rPr>
           <w:rFonts w:ascii="Times New Roman" w:hAnsi="Times New Roman" w:cs="Times New Roman"/>
-          <w:b/>
           <w:iCs/>
           <w:sz w:val="24"/>
           <w:szCs w:val="24"/>
@@ -16009,12 +15986,11 @@
       <w:r>
         <w:rPr>
           <w:rFonts w:ascii="Times New Roman" w:hAnsi="Times New Roman" w:cs="Times New Roman"/>
-          <w:b/>
           <w:iCs/>
           <w:sz w:val="24"/>
           <w:szCs w:val="24"/>
         </w:rPr>
-        <w:t>6.3 Phân tích lỗi</w:t>
+        <w:t>Chương trình tạo Prediction_Error.csv gồm ba cột Actual, Prediction và Correct. Với Random Forest, tổng số dự đoán sai là 3.631 mẫu, tương ứng tổng số False Positive và False Negative trong ma trận nhầm lẫn. File hiện chỉ lưu nhãn thực tế, nhãn dự đoán và trạng thái đúng/sai.</w:t>
       </w:r>
     </w:p>
     <w:p>
@@ -16031,33 +16007,12 @@
       <w:r>
         <w:rPr>
           <w:rFonts w:ascii="Times New Roman" w:hAnsi="Times New Roman" w:cs="Times New Roman"/>
-          <w:iCs/>
-          <w:sz w:val="24"/>
-          <w:szCs w:val="24"/>
-        </w:rPr>
-        <w:lastRenderedPageBreak/>
-        <w:t>Chương trình tạo Prediction_Error.csv gồm ba cột Actual, Prediction và Correct. Với Random Forest, tổng số dự đoán sai là 3.631 mẫu, tương ứng tổng số False Positive và False Negative trong ma trận nhầm lẫn. File hiện chỉ lưu nhãn thực tế, nhãn dự đoán và trạng thái đúng/sai.</w:t>
-      </w:r>
-    </w:p>
-    <w:p>
-      <w:pPr>
-        <w:spacing w:after="554" w:line="336" w:lineRule="auto"/>
-        <w:ind w:right="1060"/>
-        <w:rPr>
-          <w:rFonts w:ascii="Times New Roman" w:hAnsi="Times New Roman" w:cs="Times New Roman"/>
-          <w:iCs/>
-          <w:sz w:val="24"/>
-          <w:szCs w:val="24"/>
-        </w:rPr>
-      </w:pPr>
-      <w:r>
-        <w:rPr>
-          <w:rFonts w:ascii="Times New Roman" w:hAnsi="Times New Roman" w:cs="Times New Roman"/>
           <w:i/>
           <w:iCs/>
           <w:sz w:val="24"/>
           <w:szCs w:val="24"/>
         </w:rPr>
+        <w:lastRenderedPageBreak/>
         <w:t>Bảng 6.2. Tổng hợp hai loại lỗi của mô hình Random Forest</w:t>
       </w:r>
     </w:p>
@@ -16579,11 +16534,29 @@
     </w:p>
     <w:p>
       <w:pPr>
+        <w:pStyle w:val="Heading2"/>
+        <w:rPr>
+          <w:b w:val="0"/>
+          <w:iCs/>
+          <w:sz w:val="24"/>
+          <w:szCs w:val="24"/>
+        </w:rPr>
+      </w:pPr>
+      <w:r>
+        <w:rPr>
+          <w:iCs/>
+          <w:sz w:val="24"/>
+          <w:szCs w:val="24"/>
+        </w:rPr>
+        <w:t>6.4 Giải thích mô hình</w:t>
+      </w:r>
+    </w:p>
+    <w:p>
+      <w:pPr>
         <w:spacing w:after="554" w:line="336" w:lineRule="auto"/>
         <w:ind w:right="1060"/>
         <w:rPr>
           <w:rFonts w:ascii="Times New Roman" w:hAnsi="Times New Roman" w:cs="Times New Roman"/>
-          <w:b/>
           <w:iCs/>
           <w:sz w:val="24"/>
           <w:szCs w:val="24"/>
@@ -16592,13 +16565,31 @@
       <w:r>
         <w:rPr>
           <w:rFonts w:ascii="Times New Roman" w:hAnsi="Times New Roman" w:cs="Times New Roman"/>
-          <w:b/>
           <w:iCs/>
           <w:sz w:val="24"/>
           <w:szCs w:val="24"/>
         </w:rPr>
-        <w:lastRenderedPageBreak/>
-        <w:t>6.4 Giải thích mô hình</w:t>
+        <w:t>Vì Random Forest có thuộc tính feature_importances_, chương trình trích xuất tên đặc trưng sau tiền xử lý bằng preprocessor.get_feature_names_</w:t>
+      </w:r>
+      <w:proofErr w:type="gramStart"/>
+      <w:r>
+        <w:rPr>
+          <w:rFonts w:ascii="Times New Roman" w:hAnsi="Times New Roman" w:cs="Times New Roman"/>
+          <w:iCs/>
+          <w:sz w:val="24"/>
+          <w:szCs w:val="24"/>
+        </w:rPr>
+        <w:t>out(</w:t>
+      </w:r>
+      <w:proofErr w:type="gramEnd"/>
+      <w:r>
+        <w:rPr>
+          <w:rFonts w:ascii="Times New Roman" w:hAnsi="Times New Roman" w:cs="Times New Roman"/>
+          <w:iCs/>
+          <w:sz w:val="24"/>
+          <w:szCs w:val="24"/>
+        </w:rPr>
+        <w:t>), loại bỏ tiền tố numeric__ và categorical__, sau đó sắp xếp độ quan trọng giảm dần và trực quan hóa 10 đặc trưng đứng đầu.</w:t>
       </w:r>
     </w:p>
     <w:p>
@@ -16616,51 +16607,11 @@
         <w:rPr>
           <w:rFonts w:ascii="Times New Roman" w:hAnsi="Times New Roman" w:cs="Times New Roman"/>
           <w:iCs/>
-          <w:sz w:val="24"/>
-          <w:szCs w:val="24"/>
-        </w:rPr>
-        <w:t>Vì Random Forest có thuộc tính feature_importances_, chương trình trích xuất tên đặc trưng sau tiền xử lý bằng preprocessor.get_feature_names_</w:t>
-      </w:r>
-      <w:proofErr w:type="gramStart"/>
-      <w:r>
-        <w:rPr>
-          <w:rFonts w:ascii="Times New Roman" w:hAnsi="Times New Roman" w:cs="Times New Roman"/>
-          <w:iCs/>
-          <w:sz w:val="24"/>
-          <w:szCs w:val="24"/>
-        </w:rPr>
-        <w:t>out(</w:t>
-      </w:r>
-      <w:proofErr w:type="gramEnd"/>
-      <w:r>
-        <w:rPr>
-          <w:rFonts w:ascii="Times New Roman" w:hAnsi="Times New Roman" w:cs="Times New Roman"/>
-          <w:iCs/>
-          <w:sz w:val="24"/>
-          <w:szCs w:val="24"/>
-        </w:rPr>
-        <w:t>), loại bỏ tiền tố numeric__ và categorical__, sau đó sắp xếp độ quan trọng giảm dần và trực quan hóa 10 đặc trưng đứng đầu.</w:t>
-      </w:r>
-    </w:p>
-    <w:p>
-      <w:pPr>
-        <w:spacing w:after="554" w:line="336" w:lineRule="auto"/>
-        <w:ind w:right="1060"/>
-        <w:rPr>
-          <w:rFonts w:ascii="Times New Roman" w:hAnsi="Times New Roman" w:cs="Times New Roman"/>
-          <w:iCs/>
-          <w:sz w:val="24"/>
-          <w:szCs w:val="24"/>
-        </w:rPr>
-      </w:pPr>
-      <w:r>
-        <w:rPr>
-          <w:rFonts w:ascii="Times New Roman" w:hAnsi="Times New Roman" w:cs="Times New Roman"/>
-          <w:iCs/>
           <w:noProof/>
           <w:sz w:val="24"/>
           <w:szCs w:val="24"/>
         </w:rPr>
+        <w:lastRenderedPageBreak/>
         <w:drawing>
           <wp:inline distT="0" distB="0" distL="0" distR="0" wp14:anchorId="7086E259" wp14:editId="01A66D9E">
             <wp:extent cx="5943600" cy="3562350"/>
@@ -16792,17 +16743,26 @@
           <w:sz w:val="24"/>
           <w:szCs w:val="24"/>
         </w:rPr>
-        <w:t xml:space="preserve">Độ quan trọng trong Random Forest phản ánh mức giảm độ hỗn tạp do mỗi đặc trưng tạo ra trong toàn bộ rừng cây; chỉ số này không chứng minh quan hệ nhân quả. Các biến có nhiều </w:t>
-      </w:r>
-      <w:r>
-        <w:rPr>
-          <w:rFonts w:ascii="Times New Roman" w:hAnsi="Times New Roman" w:cs="Times New Roman"/>
+        <w:t>Độ quan trọng trong Random Forest phản ánh mức giảm độ hỗn tạp do mỗi đặc trưng tạo ra trong toàn bộ rừng cây; chỉ số này không chứng minh quan hệ nhân quả. Các biến có nhiều điểm chia hoặc nhiều mức mã hóa có thể được ưu tiên, vì vậy kết quả nên được kiểm chứng thêm bằng Permutation Importance hoặc SHAP.</w:t>
+      </w:r>
+    </w:p>
+    <w:p>
+      <w:pPr>
+        <w:pStyle w:val="Heading2"/>
+        <w:rPr>
+          <w:b w:val="0"/>
           <w:iCs/>
           <w:sz w:val="24"/>
           <w:szCs w:val="24"/>
         </w:rPr>
-        <w:lastRenderedPageBreak/>
-        <w:t>điểm chia hoặc nhiều mức mã hóa có thể được ưu tiên, vì vậy kết quả nên được kiểm chứng thêm bằng Permutation Importance hoặc SHAP.</w:t>
+      </w:pPr>
+      <w:r>
+        <w:rPr>
+          <w:iCs/>
+          <w:sz w:val="24"/>
+          <w:szCs w:val="24"/>
+        </w:rPr>
+        <w:t>6.5 Thảo luận</w:t>
       </w:r>
     </w:p>
     <w:p>
@@ -16811,7 +16771,6 @@
         <w:ind w:right="1060"/>
         <w:rPr>
           <w:rFonts w:ascii="Times New Roman" w:hAnsi="Times New Roman" w:cs="Times New Roman"/>
-          <w:b/>
           <w:iCs/>
           <w:sz w:val="24"/>
           <w:szCs w:val="24"/>
@@ -16820,33 +16779,21 @@
       <w:r>
         <w:rPr>
           <w:rFonts w:ascii="Times New Roman" w:hAnsi="Times New Roman" w:cs="Times New Roman"/>
-          <w:b/>
           <w:iCs/>
           <w:sz w:val="24"/>
           <w:szCs w:val="24"/>
         </w:rPr>
-        <w:t>6.5 Thảo luận</w:t>
-      </w:r>
-    </w:p>
-    <w:p>
-      <w:pPr>
-        <w:spacing w:after="554" w:line="336" w:lineRule="auto"/>
-        <w:ind w:right="1060"/>
+        <w:t xml:space="preserve">Random Forest đạt sự cân bằng tốt nhất giữa Precision và Recall tại ngưỡng mặc định nên được chọn làm mô hình cuối cùng theo logic của code. Logistic Regression phát hiện được </w:t>
+      </w:r>
+      <w:r>
         <w:rPr>
           <w:rFonts w:ascii="Times New Roman" w:hAnsi="Times New Roman" w:cs="Times New Roman"/>
           <w:iCs/>
           <w:sz w:val="24"/>
           <w:szCs w:val="24"/>
         </w:rPr>
-      </w:pPr>
-      <w:r>
-        <w:rPr>
-          <w:rFonts w:ascii="Times New Roman" w:hAnsi="Times New Roman" w:cs="Times New Roman"/>
-          <w:iCs/>
-          <w:sz w:val="24"/>
-          <w:szCs w:val="24"/>
-        </w:rPr>
-        <w:t>Random Forest đạt sự cân bằng tốt nhất giữa Precision và Recall tại ngưỡng mặc định nên được chọn làm mô hình cuối cùng theo logic của code. Logistic Regression phát hiện được nhiều đơn hủy hơn nhưng tạo nhiều cảnh báo sai hơn; Gradient Boosting phân biệt hai lớp tốt nhất theo ROC-AUC nhưng F1-score thấp hơn Random Forest.</w:t>
+        <w:lastRenderedPageBreak/>
+        <w:t>nhiều đơn hủy hơn nhưng tạo nhiều cảnh báo sai hơn; Gradient Boosting phân biệt hai lớp tốt nhất theo ROC-AUC nhưng F1-score thấp hơn Random Forest.</w:t>
       </w:r>
     </w:p>
     <w:p>
@@ -16949,7 +16896,6 @@
       </w:pPr>
       <w:bookmarkStart w:id="28" w:name="_Toc20864"/>
       <w:r>
-        <w:lastRenderedPageBreak/>
         <w:t>7.1 Đóng gói mô hình</w:t>
       </w:r>
       <w:bookmarkEnd w:id="28"/>
@@ -17085,6 +17031,7 @@
           <w:rFonts w:ascii="Courier New" w:eastAsia="Courier New" w:hAnsi="Courier New" w:cs="Courier New"/>
           <w:sz w:val="25"/>
         </w:rPr>
+        <w:lastRenderedPageBreak/>
         <w:t>├─→[Modelartifact</w:t>
       </w:r>
       <w:proofErr w:type="gramStart"/>
@@ -17226,7 +17173,7 @@
               </wp:inline>
             </w:drawing>
           </mc:Choice>
-          <mc:Fallback xmlns:w16du="http://schemas.microsoft.com/office/word/2023/wordml/word16du" xmlns:w16sdtfl="http://schemas.microsoft.com/office/word/2024/wordml/sdtformatlock" xmlns:a="http://schemas.openxmlformats.org/drawingml/2006/main">
+          <mc:Fallback xmlns:a="http://schemas.openxmlformats.org/drawingml/2006/main" xmlns:w16sdtfl="http://schemas.microsoft.com/office/word/2024/wordml/sdtformatlock" xmlns:w16du="http://schemas.microsoft.com/office/word/2023/wordml/word16du">
             <w:pict>
               <v:group id="Group 15904" style="width:475.93pt;height:0.9564pt;mso-position-horizontal-relative:char;mso-position-vertical-relative:line" coordsize="60443,121">
                 <v:shape id="Shape 1002" style="position:absolute;width:60443;height:0;left:0;top:0;" coordsize="6044311,0" path="m0,0l6044311,0">
@@ -17395,7 +17342,7 @@
                     </wp:inline>
                   </w:drawing>
                 </mc:Choice>
-                <mc:Fallback xmlns:w16du="http://schemas.microsoft.com/office/word/2023/wordml/word16du" xmlns:w16sdtfl="http://schemas.microsoft.com/office/word/2024/wordml/sdtformatlock" xmlns:a="http://schemas.openxmlformats.org/drawingml/2006/main">
+                <mc:Fallback xmlns:a="http://schemas.openxmlformats.org/drawingml/2006/main" xmlns:w16sdtfl="http://schemas.microsoft.com/office/word/2024/wordml/sdtformatlock" xmlns:w16du="http://schemas.microsoft.com/office/word/2023/wordml/word16du">
                   <w:pict>
                     <v:group id="Group 16977" style="width:475.93pt;height:0.5978pt;mso-position-horizontal-relative:char;mso-position-vertical-relative:line" coordsize="60443,75">
                       <v:shape id="Shape 1008" style="position:absolute;width:60443;height:0;left:0;top:0;" coordsize="6044311,0" path="m0,0l6044311,0">
@@ -18480,7 +18427,6 @@
                 <w:rFonts w:ascii="Times New Roman" w:eastAsia="Times New Roman" w:hAnsi="Times New Roman" w:cs="Times New Roman"/>
                 <w:sz w:val="24"/>
               </w:rPr>
-              <w:lastRenderedPageBreak/>
               <w:t>4</w:t>
             </w:r>
           </w:p>
@@ -18777,6 +18723,7 @@
           <w:rFonts w:ascii="Times New Roman" w:eastAsia="Times New Roman" w:hAnsi="Times New Roman" w:cs="Times New Roman"/>
           <w:sz w:val="24"/>
         </w:rPr>
+        <w:lastRenderedPageBreak/>
         <w:t>[ ]</w:t>
       </w:r>
       <w:proofErr w:type="gramEnd"/>
@@ -18970,7 +18917,6 @@
       </w:pPr>
       <w:bookmarkStart w:id="38" w:name="_Toc20874"/>
       <w:r>
-        <w:lastRenderedPageBreak/>
         <w:t>8.2 Hạn chế</w:t>
       </w:r>
       <w:bookmarkEnd w:id="38"/>
@@ -19035,6 +18981,7 @@
       </w:pPr>
       <w:bookmarkStart w:id="40" w:name="_Toc20876"/>
       <w:r>
+        <w:lastRenderedPageBreak/>
         <w:t>Tài liệu tham khảo</w:t>
       </w:r>
       <w:bookmarkEnd w:id="40"/>
@@ -19361,7 +19308,6 @@
       </w:pPr>
       <w:bookmarkStart w:id="44" w:name="_Toc20880"/>
       <w:r>
-        <w:lastRenderedPageBreak/>
         <w:t>Phụ lục C — Data dictionary</w:t>
       </w:r>
       <w:bookmarkEnd w:id="44"/>
@@ -20108,7 +20054,7 @@
               </wp:anchor>
             </w:drawing>
           </mc:Choice>
-          <mc:Fallback xmlns:w16du="http://schemas.microsoft.com/office/word/2023/wordml/word16du" xmlns:w16sdtfl="http://schemas.microsoft.com/office/word/2024/wordml/sdtformatlock" xmlns:a="http://schemas.openxmlformats.org/drawingml/2006/main">
+          <mc:Fallback xmlns:a="http://schemas.openxmlformats.org/drawingml/2006/main" xmlns:w16sdtfl="http://schemas.microsoft.com/office/word/2024/wordml/sdtformatlock" xmlns:w16du="http://schemas.microsoft.com/office/word/2023/wordml/word16du">
             <w:pict>
               <v:group id="Group 16504" style="width:475.938pt;height:0.5978pt;position:absolute;mso-position-horizontal-relative:text;mso-position-horizontal:absolute;margin-left:1.99596pt;mso-position-vertical-relative:text;margin-top:58.0551pt;" coordsize="60444,75">
                 <v:shape id="Shape 1223" style="position:absolute;width:60444;height:0;left:0;top:0;" coordsize="6044413,0" path="m0,0l6044413,0">
@@ -20206,7 +20152,7 @@
               </wp:inline>
             </w:drawing>
           </mc:Choice>
-          <mc:Fallback xmlns:w16du="http://schemas.microsoft.com/office/word/2023/wordml/word16du" xmlns:w16sdtfl="http://schemas.microsoft.com/office/word/2024/wordml/sdtformatlock" xmlns:a="http://schemas.openxmlformats.org/drawingml/2006/main">
+          <mc:Fallback xmlns:a="http://schemas.openxmlformats.org/drawingml/2006/main" xmlns:w16sdtfl="http://schemas.microsoft.com/office/word/2024/wordml/sdtformatlock" xmlns:w16du="http://schemas.microsoft.com/office/word/2023/wordml/word16du">
             <w:pict>
               <v:group id="Group 16502" style="width:475.938pt;height:0.9564pt;mso-position-horizontal-relative:char;mso-position-vertical-relative:line" coordsize="60444,121">
                 <v:shape id="Shape 1219" style="position:absolute;width:60444;height:0;left:0;top:0;" coordsize="6044413,0" path="m0,0l6044413,0">
@@ -26215,6 +26161,7 @@
   <w:style w:type="character" w:default="1" w:styleId="DefaultParagraphFont">
     <w:name w:val="Default Paragraph Font"/>
     <w:uiPriority w:val="1"/>
+    <w:semiHidden/>
     <w:unhideWhenUsed/>
   </w:style>
   <w:style w:type="table" w:default="1" w:styleId="TableNormal">

</xml_diff>